<commit_message>
- now using stairways dummy coding - new model M_5 with reduced conditional terms - many improvements in the Discussion
</commit_message>
<xml_diff>
--- a/YET_CEHR.docx
+++ b/YET_CEHR.docx
@@ -352,7 +352,7 @@
         <w:pStyle w:val="BodyText"/>
       </w:pPr>
       <w:r>
-        <w:t xml:space="preserve">This raises the reciprocity conundrum: how could the white sclera produce immediate reproductive benefits? One possibility is that the white sclera encountered a rudimentary precursor of the EDD. As</w:t>
+        <w:t xml:space="preserve">It is highly unlikely that such a specialized receiver architecture evolved without there being a sender. In contrast to the sender, it is also unlikely that it evolved as a one-point mutation. A possibility is that the white sclera encountered a rudimentary precursor of the EDD. As</w:t>
       </w:r>
       <w:r>
         <w:t xml:space="preserve"> </w:t>
@@ -372,19 +372,21 @@
       <w:r>
         <w:t xml:space="preserve">“many signals have evolved from what once were cues.”</w:t>
       </w:r>
-      <w:r>
-        <w:t xml:space="preserve"> </w:t>
-      </w:r>
-      <w:r>
-        <w:t xml:space="preserve">Alternatively, early humans may have been able to learn to read glance directions, with the white sclera providing a signal clear enough to facilitate this learning process.</w:t>
-      </w:r>
     </w:p>
     <w:p>
       <w:pPr>
         <w:pStyle w:val="BodyText"/>
       </w:pPr>
       <w:r>
-        <w:t xml:space="preserve">For the white sclera to become a cue, it had to had possessed visual properties that made it salient for potential receivers. Indeed, the high contrast between the white sclera and the dark pupil creates a visually striking pattern that seems to draw</w:t>
+        <w:t xml:space="preserve">For the white sclera to become a cue, it had to had possessed visual properties that made it salient for receivers that already existed, which converges with the idea that scleral pigmentation evolved as a camouflage.</w:t>
+      </w:r>
+    </w:p>
+    <w:p>
+      <w:pPr>
+        <w:pStyle w:val="BodyText"/>
+      </w:pPr>
+      <w:r>
+        <w:t xml:space="preserve">Indeed, the high contrast between the white sclera and the dark pupil creates a visually striking pattern that seems to draw</w:t>
       </w:r>
       <w:r>
         <w:t xml:space="preserve"> </w:t>
@@ -445,7 +447,7 @@
         <w:pStyle w:val="BodyText"/>
       </w:pPr>
       <w:r>
-        <w:t xml:space="preserve">However, measuring computational simplicity on biological observations bares the risk of circular reasoning, because ease of processing could be the a consequence of natural selection.</w:t>
+        <w:t xml:space="preserve">However, measuring computational simplicity on biological observations bares the risk of circular reasoning, because ease of processing is a consequence of natural selection.</w:t>
       </w:r>
       <w:r>
         <w:t xml:space="preserve"> </w:t>
@@ -471,13 +473,13 @@
       </w:r>
     </w:p>
     <w:bookmarkEnd w:id="22"/>
-    <w:bookmarkStart w:id="23" w:name="bio-plausible-eye-tracking"/>
+    <w:bookmarkStart w:id="23" w:name="minimum-complexity-eye-tracking"/>
     <w:p>
       <w:pPr>
         <w:pStyle w:val="Heading3"/>
       </w:pPr>
       <w:r>
-        <w:t xml:space="preserve">Bio-plausible eye tracking</w:t>
+        <w:t xml:space="preserve">Minimum-Complexity Eye Tracking</w:t>
       </w:r>
     </w:p>
     <w:p>
@@ -523,35 +525,32 @@
         <w:t xml:space="preserve">Krafka et al. (2016)</w:t>
       </w:r>
       <w:r>
-        <w:t xml:space="preserve">).</w:t>
-      </w:r>
-    </w:p>
-    <w:p>
-      <w:pPr>
-        <w:pStyle w:val="BodyText"/>
-      </w:pPr>
-      <w:r>
-        <w:t xml:space="preserve">Video-oculographic devices are the only bio-plausible option, because only they work with visible light. Yet, the typically involved algorithms are computationally complex and demanding, such as filtering, edge detection or neural networks.</w:t>
-      </w:r>
-      <w:r>
-        <w:t xml:space="preserve"> </w:t>
-      </w:r>
-      <w:r>
-        <w:t xml:space="preserve">It is known that humans can still read glance directions in highly degraded images (</w:t>
-      </w:r>
-      <w:r>
-        <w:t xml:space="preserve">Yorzinski et al. (2021)</w:t>
-      </w:r>
-      <w:r>
-        <w:t xml:space="preserve">), which suggests that a very low resolution is required, which in turn reduces computational demands.</w:t>
-      </w:r>
-    </w:p>
-    <w:p>
-      <w:pPr>
-        <w:pStyle w:val="BodyText"/>
-      </w:pPr>
-      <w:r>
-        <w:t xml:space="preserve">We introduce the</w:t>
+        <w:t xml:space="preserve">), which often resemble biological visual processing (</w:t>
+      </w:r>
+      <w:r>
+        <w:t xml:space="preserve">(</w:t>
+      </w:r>
+      <w:r>
+        <w:rPr>
+          <w:b/>
+          <w:bCs/>
+        </w:rPr>
+        <w:t xml:space="preserve">Kumar2017?</w:t>
+      </w:r>
+      <w:r>
+        <w:t xml:space="preserve">)</w:t>
+      </w:r>
+      <w:r>
+        <w:t xml:space="preserve"> </w:t>
+      </w:r>
+      <w:r>
+        <w:t xml:space="preserve">CHECK).</w:t>
+      </w:r>
+      <w:r>
+        <w:t xml:space="preserve"> </w:t>
+      </w:r>
+      <w:r>
+        <w:t xml:space="preserve">Video-oculographic devices are the only</w:t>
       </w:r>
       <w:r>
         <w:t xml:space="preserve"> </w:t>
@@ -561,13 +560,43 @@
           <w:i/>
           <w:iCs/>
         </w:rPr>
-        <w:t xml:space="preserve">QuadBright</w:t>
-      </w:r>
-      <w:r>
-        <w:t xml:space="preserve"> </w:t>
-      </w:r>
-      <w:r>
-        <w:t xml:space="preserve">method to eye tracking, which employs the simple fact that the moving pupil produces a change in</w:t>
+        <w:t xml:space="preserve">biologically plausible</w:t>
+      </w:r>
+      <w:r>
+        <w:t xml:space="preserve"> </w:t>
+      </w:r>
+      <w:r>
+        <w:t xml:space="preserve">option, because only they work with visible light. Yet, the involved algorithms are computationally complex and demanding, such as filtering, edge detection or neural networks.</w:t>
+      </w:r>
+    </w:p>
+    <w:p>
+      <w:pPr>
+        <w:pStyle w:val="BodyText"/>
+      </w:pPr>
+      <w:r>
+        <w:t xml:space="preserve">As we have established above, the receiver likely is computationally simple, but it must also be robust to resolution and noise constraints, as it is known that humans can still read glance directions in highly degraded images (</w:t>
+      </w:r>
+      <w:r>
+        <w:t xml:space="preserve">Yorzinski et al. (2021)</w:t>
+      </w:r>
+      <w:r>
+        <w:t xml:space="preserve">).</w:t>
+      </w:r>
+    </w:p>
+    <w:p>
+      <w:pPr>
+        <w:pStyle w:val="BodyText"/>
+      </w:pPr>
+      <w:r>
+        <w:t xml:space="preserve">The visual cortex can approximately be modeled as a deep neural network and one strategy to a minimum complexity is to find the smallest network that still performs well. In this study we employed the opposite strategy, starting from the most simple device imagineable.</w:t>
+      </w:r>
+    </w:p>
+    <w:p>
+      <w:pPr>
+        <w:pStyle w:val="BodyText"/>
+      </w:pPr>
+      <w:r>
+        <w:t xml:space="preserve">We introduce the</w:t>
       </w:r>
       <w:r>
         <w:t xml:space="preserve"> </w:t>
@@ -577,10 +606,26 @@
           <w:i/>
           <w:iCs/>
         </w:rPr>
+        <w:t xml:space="preserve">QuadBright</w:t>
+      </w:r>
+      <w:r>
+        <w:t xml:space="preserve"> </w:t>
+      </w:r>
+      <w:r>
+        <w:t xml:space="preserve">method to eye tracking, which employs the simple fact that the moving pupil produces a change in</w:t>
+      </w:r>
+      <w:r>
+        <w:t xml:space="preserve"> </w:t>
+      </w:r>
+      <w:r>
+        <w:rPr>
+          <w:i/>
+          <w:iCs/>
+        </w:rPr>
         <w:t xml:space="preserve">horizontal and vertical brightness distribution</w:t>
       </w:r>
       <w:r>
-        <w:t xml:space="preserve">. The most simple approach to capture vertical and horizontal is to split the image horizontally and vertically in four quadrants (NE, SE, SW and NW, see Fig X) and taking the average brightness (Br). This effectively produces a 2x2 pixel grayscale image. The four quadrants are used as input for a multiple linear regression model, which predicts the horizontal and vertical position of the eye ball. The following equation shows the model for the horizontal eye position, the vertical position is analog.</w:t>
+        <w:t xml:space="preserve">. We chose the most parsimonous way of capturing horizontal and vertical brightness distribution, by splitting the eye image into four quadrants and taking the average brightness in each quadrant, which effectively is an extreme down-sampling to a 2x2 pixel grayscale image. The four brightness values are then used as input to the linear regression model with quadrants NE, SE, SW and NW as predictors for horizontal positions (vertical positions analog):</w:t>
       </w:r>
     </w:p>
     <w:p>
@@ -831,7 +876,7 @@
     </w:p>
     <w:bookmarkEnd w:id="23"/>
     <w:bookmarkEnd w:id="24"/>
-    <w:bookmarkStart w:id="89" w:name="X22205b61d1e77e2fd0cafc196602fb9f87730eb"/>
+    <w:bookmarkStart w:id="55" w:name="X22205b61d1e77e2fd0cafc196602fb9f87730eb"/>
     <w:p>
       <w:pPr>
         <w:pStyle w:val="Heading1"/>
@@ -857,13 +902,13 @@
         <w:t xml:space="preserve">Methods</w:t>
       </w:r>
     </w:p>
-    <w:bookmarkStart w:id="34" w:name="yet-zero-prototype"/>
+    <w:bookmarkStart w:id="34" w:name="yet-zero-implementation"/>
     <w:p>
       <w:pPr>
         <w:pStyle w:val="Heading3"/>
       </w:pPr>
       <w:r>
-        <w:t xml:space="preserve">YET Zero prototype</w:t>
+        <w:t xml:space="preserve">YET Zero implementation</w:t>
       </w:r>
     </w:p>
     <w:p>
@@ -908,7 +953,7 @@
         <w:t xml:space="preserve">(Pedregosa et al., 2011)</w:t>
       </w:r>
       <w:r>
-        <w:t xml:space="preserve">. As usual in eye tracking, a calibration phase trains the model on Quadbright data obtained on (nine) initial calibration points. To account for small deviations between trials, single-point quick calibrations are performed to realign the parameters</w:t>
+        <w:t xml:space="preserve">. A calibration phase trains the model with data obtained on nine initial calibration points. To account for small shifts between trials, single-point quick calibrations are performed to realign the parameters</w:t>
       </w:r>
       <w:r>
         <w:t xml:space="preserve"> </w:t>
@@ -977,7 +1022,7 @@
         <w:pStyle w:val="BodyText"/>
       </w:pPr>
       <w:r>
-        <w:t xml:space="preserve">In first tests this system seemed worked well, but it was susceptible to changes in computer screen brightness introduced by the presented stimuli. While the best solution is to use a frontal brightness sensor and extend the model accordingly, as a quick fix the quick calibration was augmented with a highly degraded preview of the next stimulus, just enough to keep the brightness level stable.</w:t>
+        <w:t xml:space="preserve">The first iteration of the system was very susceptible to changes in computer screen brightness introduced by the presented stimuli. While the best solution is to use a frontal brightness sensor and extend the model accordingly, as a quick fix the quick calibration was augmented with a highly degraded preview of the next stimulus, just enough to keep the brightness level stable between calibration and trials.</w:t>
       </w:r>
     </w:p>
     <w:bookmarkStart w:id="33" w:name="fig-yet-zero"/>
@@ -1063,7 +1108,7 @@
                     <w:jc w:val="left"/>
                   </w:pPr>
                   <w:pPr>
-                    <w:jc w:val="start"/>
+                    <w:jc w:val="left"/>
                     <w:spacing w:before="200"/>
                     <w:pStyle w:val="ImageCaption"/>
                   </w:pPr>
@@ -1169,7 +1214,7 @@
         <w:pStyle w:val="FirstParagraph"/>
       </w:pPr>
       <w:r>
-        <w:t xml:space="preserve">The experiment was carried out with the YET Zero prototype. A headmount was constructed from a headphone and a kitchen paper roll was used as a chin rest. Participants were seated in 45cm viewing distance using a 16:9 screen with a 41cm diagonal. The experiment consisted of 24 trials per condition. The target moved in a random pattern between 24 positions on the screen. The participants were asked to follow the target with their eyes and press a button. The QuadBright algorithm tracked their eye movements and the accuracy of the algorithm was measured by calculating the angular error of estimated eye positions from the true target position.</w:t>
+        <w:t xml:space="preserve">The experiment was carried out with the YET Zero system A headmount was constructed from a headphone and a kitchen paper roll was used as a chin rest. Participants were seated in 45cm viewing distance using a 16:9 screen with a 41cm diagonal. The experiment consisted of 24 trials per condition. The target moved in a random pattern between 24 positions on the screen. The participants were asked to follow the target with their eyes and press a button. The QuadBright algorithm tracked their eye movements and the accuracy of the algorithm was measured by calculating the angular error of estimated eye positions from the true target position.</w:t>
       </w:r>
     </w:p>
     <w:p>
@@ -1228,13 +1273,13 @@
         <w:t xml:space="preserve"> </w:t>
       </w:r>
       <w:r>
-        <w:t xml:space="preserve">From the original experiment only the conditions with a white calibration background was used, resulting in 464499 observations from 24 participants. In order to make this more amenable, the data was reduced by first removing the first and last 500ms and subsequently averaging over four consecutive frames, resulting in 82445 observations.</w:t>
-      </w:r>
-      <w:r>
-        <w:t xml:space="preserve"> </w:t>
-      </w:r>
-      <w:r>
-        <w:t xml:space="preserve">A multilevel generalized linear model with a log-normal error distribution and log -ink was then used to analyze the data. The dependent variable was the angular error in degrees. Target x- and y-positions were used as predictors in a second degree polynomial term to account for increasing errors towards the extremes. The model was fitted using the</w:t>
+        <w:t xml:space="preserve">From the original experiment only the conditions with a white calibration background was used, resulting in 464499 observations from 24 participants. In order to remove movement artifacts the first and last 500ms where removed and to make the data set more amenable the average over four consecutive frames was taken, resulting in 82445 observations.</w:t>
+      </w:r>
+      <w:r>
+        <w:t xml:space="preserve"> </w:t>
+      </w:r>
+      <w:r>
+        <w:t xml:space="preserve">A multilevel generalized linear model with a log-normal error distribution and log-link was then used to analyze the data. The dependent variable was the angular error in degrees. Target x- and y-positions were used as predictors in a second degree polynomial term to account for increasing errors towards the extremes. The model was fitted using the</w:t>
       </w:r>
       <w:r>
         <w:t xml:space="preserve"> </w:t>
@@ -1275,7 +1320,7 @@
     </w:p>
     <w:bookmarkEnd w:id="37"/>
     <w:bookmarkEnd w:id="38"/>
-    <w:bookmarkStart w:id="54" w:name="results"/>
+    <w:bookmarkStart w:id="53" w:name="results"/>
     <w:p>
       <w:pPr>
         <w:pStyle w:val="Heading2"/>
@@ -1380,7 +1425,7 @@
               <w:jc w:val="center"/>
             </w:pPr>
             <w:pPr>
-              <w:jc w:val="start"/>
+              <w:jc w:val="left"/>
               <w:spacing w:before="200"/>
               <w:pStyle w:val="ImageCaption"/>
             </w:pPr>
@@ -1411,7 +1456,7 @@
               <w:jc w:val="center"/>
             </w:pPr>
             <w:pPr>
-              <w:jc w:val="start"/>
+              <w:jc w:val="left"/>
               <w:spacing w:before="200"/>
               <w:pStyle w:val="ImageCaption"/>
             </w:pPr>
@@ -1867,7 +1912,7 @@
                     <w:jc w:val="left"/>
                   </w:pPr>
                   <w:pPr>
-                    <w:jc w:val="start"/>
+                    <w:jc w:val="left"/>
                     <w:spacing w:before="200"/>
                     <w:pStyle w:val="ImageCaption"/>
                   </w:pPr>
@@ -1952,7 +1997,7 @@
                     <w:jc w:val="left"/>
                   </w:pPr>
                   <w:pPr>
-                    <w:jc w:val="start"/>
+                    <w:jc w:val="left"/>
                     <w:spacing w:before="200"/>
                     <w:pStyle w:val="ImageCaption"/>
                   </w:pPr>
@@ -2000,10 +2045,11 @@
         <w:t xml:space="preserve">shows the fitted degree errors per participant. While the curvature is rather similar, there appears to be individual differences in the overall level. In the vast majority of of participants, the error is below 5 degree for most of the range.</w:t>
       </w:r>
     </w:p>
-    <w:bookmarkStart w:id="53" w:name="conclusion"/>
-    <w:p>
-      <w:pPr>
-        <w:pStyle w:val="Heading3"/>
+    <w:bookmarkEnd w:id="53"/>
+    <w:bookmarkStart w:id="54" w:name="conclusion"/>
+    <w:p>
+      <w:pPr>
+        <w:pStyle w:val="Heading2"/>
       </w:pPr>
       <w:r>
         <w:t xml:space="preserve">Conclusion</w:t>
@@ -2014,7 +2060,7 @@
         <w:pStyle w:val="FirstParagraph"/>
       </w:pPr>
       <w:r>
-        <w:t xml:space="preserve">In conclusion, eye tracking using the Quadbright algorithm typically produces accuracy in the range of 2-5 degree error. This is a magnitude above what is achieved by commercial eye tracking devices using corneal reflections (e.g.</w:t>
+        <w:t xml:space="preserve">Eye tracking using the Quadbright algorithm typically produces accuracy in the range of 2-5 degree error. This is a magnitude above what is achieved by commercial eye tracking devices using corneal reflections (e.g.</w:t>
       </w:r>
       <w:r>
         <w:t xml:space="preserve"> </w:t>
@@ -2053,26 +2099,43 @@
         <w:t xml:space="preserve">. Altogether, the Quadbright device qualifies as a candidate model for human eye direction reading.</w:t>
       </w:r>
     </w:p>
-    <w:bookmarkEnd w:id="53"/>
     <w:bookmarkEnd w:id="54"/>
-    <w:bookmarkStart w:id="83" w:name="X739e7a8d01a3a8db6358f3cf49c7af788e1739a"/>
+    <w:bookmarkEnd w:id="55"/>
+    <w:bookmarkStart w:id="89" w:name="X739e7a8d01a3a8db6358f3cf49c7af788e1739a"/>
+    <w:p>
+      <w:pPr>
+        <w:pStyle w:val="Heading1"/>
+      </w:pPr>
+      <w:r>
+        <w:t xml:space="preserve">Study 2: Human glance perception with QuadBright information</w:t>
+      </w:r>
+    </w:p>
+    <w:p>
+      <w:pPr>
+        <w:pStyle w:val="FirstParagraph"/>
+      </w:pPr>
+      <w:r>
+        <w:t xml:space="preserve">The second study aimed at the possibility that human direction reading uses a device, operating similöar to Quadbright. As we have argued in [XREF], two possibilities exist: One receiver exists that existed before the white sclera and has possibly gradually evolved since then. Or a primitive receiver created the initial fitness advantage, on which the evolution of a second, more specialized receiver thrived.</w:t>
+      </w:r>
+    </w:p>
+    <w:p>
+      <w:pPr>
+        <w:pStyle w:val="BodyText"/>
+      </w:pPr>
+      <w:r>
+        <w:t xml:space="preserve">A gaze reading experiment was constructed, where accuracy was measured with eye regions reduced to four brightness levels against a control condition. To approximate the depth of processing in both conditions, exposure times were varied from 70 milliseconds to one second. If humans can read glance directions equally well in both conditions, we can assume that there is only one receiver mechanism, which uses only brightness differences. If participants perform worse in the QuadBright condition, this would suggest that two different mechanisms exist, one using low-level brightness cues, and another more specialized mechanism using high-level features. A problematic outcome of the experiment would be if participants cannot read the Quadbright condition at all. In this case, we have no possibility to decide whether a progenitor receiver exists, or whether this just uses a mechanism yet unknown.</w:t>
+      </w:r>
+    </w:p>
+    <w:bookmarkStart w:id="88" w:name="methods-1"/>
     <w:p>
       <w:pPr>
         <w:pStyle w:val="Heading2"/>
       </w:pPr>
       <w:r>
-        <w:t xml:space="preserve">Study 2: Human glance perception with QuadBright information</w:t>
-      </w:r>
-    </w:p>
-    <w:p>
-      <w:pPr>
-        <w:pStyle w:val="FirstParagraph"/>
-      </w:pPr>
-      <w:r>
-        <w:t xml:space="preserve">The second study aimed at the possibility that human direction reading uses a Quadbright device. A gaze reading experiment was constructed, where accuracy was measured with eye regions reduced to four brightness levels against a control condition. To approximate the depth of processing in both conditions, exposure times were varied from 70 milliseconds to one second.</w:t>
-      </w:r>
-    </w:p>
-    <w:bookmarkStart w:id="64" w:name="experimental-design-1"/>
+        <w:t xml:space="preserve">Methods</w:t>
+      </w:r>
+    </w:p>
+    <w:bookmarkStart w:id="65" w:name="experimental-design-1"/>
     <w:p>
       <w:pPr>
         <w:pStyle w:val="Heading3"/>
@@ -2121,7 +2184,7 @@
         <w:t xml:space="preserve">. Exposure times varied in five steps (70, 140, 400, 600 and 1000 milliseconds).</w:t>
       </w:r>
     </w:p>
-    <w:bookmarkStart w:id="63" w:name="fig-qb-stimuli"/>
+    <w:bookmarkStart w:id="64" w:name="fig-qb-stimuli"/>
     <w:tbl>
       <w:tblPr>
         <w:tblStyle w:val="Table"/>
@@ -2148,7 +2211,7 @@
             <w:tr>
               <w:tc>
                 <w:tcPr/>
-                <w:bookmarkStart w:id="58" w:name="fig-qb-control"/>
+                <w:bookmarkStart w:id="59" w:name="fig-qb-control"/>
                 <w:p>
                   <w:pPr>
                     <w:pStyle w:val="Compact"/>
@@ -2160,18 +2223,18 @@
                       <wp:inline>
                         <wp:extent cx="2971800" cy="2820458"/>
                         <wp:effectExtent b="0" l="0" r="0" t="0"/>
-                        <wp:docPr descr="" title="" id="56" name="Picture"/>
+                        <wp:docPr descr="" title="" id="57" name="Picture"/>
                         <a:graphic>
                           <a:graphicData uri="http://schemas.openxmlformats.org/drawingml/2006/picture">
                             <pic:pic>
                               <pic:nvPicPr>
-                                <pic:cNvPr descr="Illustrations/Exp_Control.png" id="57" name="Picture"/>
+                                <pic:cNvPr descr="Illustrations/Exp_Control.png" id="58" name="Picture"/>
                                 <pic:cNvPicPr>
                                   <a:picLocks noChangeArrowheads="1" noChangeAspect="1"/>
                                 </pic:cNvPicPr>
                               </pic:nvPicPr>
                               <pic:blipFill>
-                                <a:blip r:embed="rId55"/>
+                                <a:blip r:embed="rId56"/>
                                 <a:stretch>
                                   <a:fillRect/>
                                 </a:stretch>
@@ -2204,7 +2267,7 @@
                     <w:jc w:val="left"/>
                   </w:pPr>
                   <w:pPr>
-                    <w:jc w:val="start"/>
+                    <w:jc w:val="left"/>
                     <w:spacing w:before="200"/>
                     <w:pStyle w:val="ImageCaption"/>
                   </w:pPr>
@@ -2212,7 +2275,7 @@
                     <w:t xml:space="preserve">(a) Control condition</w:t>
                   </w:r>
                 </w:p>
-                <w:bookmarkEnd w:id="58"/>
+                <w:bookmarkEnd w:id="59"/>
               </w:tc>
             </w:tr>
           </w:tbl>
@@ -2234,24 +2297,24 @@
       <w:r>
         <w:t xml:space="preserve"> </w:t>
       </w:r>
-      <w:bookmarkStart w:id="62" w:name="fig-qb-experimental"/>
+      <w:bookmarkStart w:id="63" w:name="fig-qb-experimental"/>
       <w:r>
         <w:drawing>
           <wp:inline>
             <wp:extent cx="2971800" cy="2859920"/>
             <wp:effectExtent b="0" l="0" r="0" t="0"/>
-            <wp:docPr descr="Quadbright condition" title="" id="60" name="Picture"/>
+            <wp:docPr descr="Quadbright condition" title="" id="61" name="Picture"/>
             <a:graphic>
               <a:graphicData uri="http://schemas.openxmlformats.org/drawingml/2006/picture">
                 <pic:pic>
                   <pic:nvPicPr>
-                    <pic:cNvPr descr="Illustrations/Exp_QB.png" id="61" name="Picture"/>
+                    <pic:cNvPr descr="Illustrations/Exp_QB.png" id="62" name="Picture"/>
                     <pic:cNvPicPr>
                       <a:picLocks noChangeArrowheads="1" noChangeAspect="1"/>
                     </pic:cNvPicPr>
                   </pic:nvPicPr>
                   <pic:blipFill>
-                    <a:blip r:embed="rId59"/>
+                    <a:blip r:embed="rId60"/>
                     <a:stretch>
                       <a:fillRect/>
                     </a:stretch>
@@ -2277,7 +2340,7 @@
           </wp:inline>
         </w:drawing>
       </w:r>
-      <w:bookmarkEnd w:id="62"/>
+      <w:bookmarkEnd w:id="63"/>
       <w:r>
         <w:t xml:space="preserve"> </w:t>
       </w:r>
@@ -2291,9 +2354,9 @@
         <w:t xml:space="preserve">(Hölter &amp; Schmettow, 2025, with permission)</w:t>
       </w:r>
     </w:p>
-    <w:bookmarkEnd w:id="63"/>
     <w:bookmarkEnd w:id="64"/>
-    <w:bookmarkStart w:id="65" w:name="sample-1"/>
+    <w:bookmarkEnd w:id="65"/>
+    <w:bookmarkStart w:id="66" w:name="sample-1"/>
     <w:p>
       <w:pPr>
         <w:pStyle w:val="Heading3"/>
@@ -2310,8 +2373,8 @@
         <w:t xml:space="preserve">A sample of 43 participants was collected via convenience sampling with 20 female, 23 male, 18 to 70 years with an average age of 34.2 years). The study was approved by the Humannities &amp; Social Sciences ethics committee of the University of Twente under the number 250623. All participants provided informed consent prior to participation.</w:t>
       </w:r>
     </w:p>
-    <w:bookmarkEnd w:id="65"/>
-    <w:bookmarkStart w:id="66" w:name="data-analysis-1"/>
+    <w:bookmarkEnd w:id="66"/>
+    <w:bookmarkStart w:id="67" w:name="data-analysis-1"/>
     <w:p>
       <w:pPr>
         <w:pStyle w:val="Heading3"/>
@@ -2325,7 +2388,15 @@
         <w:pStyle w:val="FirstParagraph"/>
       </w:pPr>
       <w:r>
-        <w:t xml:space="preserve">The outcome variable is the deviations between true and reported hour positions, resulting in a discrete outcome. A two-factorial linear term with conditional effects for exposure time and QuadBright degradation was used for population-level (fixed effects), as well as on Stimulus and Participant level (random effects). To account for over-dispersion, a negative-binomial outcome distribution with logarithm link function was tried first, but the extremely large reciprocal dispersion parameter suggested that the data is not over-dispersed and the final model was therefore fitted using the Poisson family. All computations were carried out using the Brms package</w:t>
+        <w:t xml:space="preserve">The outcome variable is the deviations between true and reported hour positions, resulting in a discrete outcome. A two-factorial predictor term with conditional effects for exposure time and condition (Control, Quadbright) was used on population-level (fixed effects), as well as on Stimulus and Participant level (random effects). Stairways coding was used on factor Exposure, resulting in coefficients that describe the difference to the previous level.</w:t>
+      </w:r>
+    </w:p>
+    <w:p>
+      <w:pPr>
+        <w:pStyle w:val="BodyText"/>
+      </w:pPr>
+      <w:r>
+        <w:t xml:space="preserve">To account for over-dispersion, a negative-binomial outcome distribution with logarithm link function was tried first, but the extremely large reciprocal dispersion parameter suggested that the data is not over-dispersed and the Poisson family was used. Model selection using Loo information criteria was used to explore alternative models. All computations were carried out using the Brms package</w:t>
       </w:r>
       <w:r>
         <w:t xml:space="preserve"> </w:t>
@@ -2349,8 +2420,8 @@
         <w:t xml:space="preserve">.</w:t>
       </w:r>
     </w:p>
-    <w:bookmarkEnd w:id="66"/>
-    <w:bookmarkStart w:id="82" w:name="results-1"/>
+    <w:bookmarkEnd w:id="67"/>
+    <w:bookmarkStart w:id="87" w:name="results-1"/>
     <w:p>
       <w:pPr>
         <w:pStyle w:val="Heading3"/>
@@ -2359,648 +2430,6 @@
         <w:t xml:space="preserve">Results</w:t>
       </w:r>
     </w:p>
-    <w:tbl>
-      <w:tblPr>
-        <w:tblStyle w:val="Table"/>
-        <w:tblW w:type="pct" w:w="5000"/>
-        <w:tblLayout w:type="fixed"/>
-        <w:tblLook w:firstRow="0" w:lastRow="0" w:firstColumn="0" w:lastColumn="0" w:noHBand="0" w:noVBand="0" w:val="0000"/>
-      </w:tblPr>
-      <w:tblGrid>
-        <w:gridCol w:w="7920"/>
-      </w:tblGrid>
-      <w:tr>
-        <w:tc>
-          <w:tcPr/>
-          <w:bookmarkStart w:id="67" w:name="tbl-fixef-M4"/>
-          <w:p>
-            <w:pPr>
-              <w:jc w:val="center"/>
-            </w:pPr>
-            <w:pPr>
-              <w:jc w:val="start"/>
-              <w:spacing w:before="200"/>
-              <w:pStyle w:val="ImageCaption"/>
-            </w:pPr>
-            <w:r>
-              <w:t xml:space="preserve">Table 2</w:t>
-            </w:r>
-          </w:p>
-          <w:tbl>
-            <w:tblPr>
-              <w:tblStyle w:val="Table"/>
-              <w:tblW w:type="auto" w:w="0"/>
-              <w:tblLook w:firstRow="1" w:lastRow="0" w:firstColumn="0" w:lastColumn="0" w:noHBand="0" w:noVBand="0" w:val="0020"/>
-            </w:tblPr>
-            <w:tblGrid>
-              <w:gridCol w:w="1980"/>
-              <w:gridCol w:w="1980"/>
-              <w:gridCol w:w="1980"/>
-              <w:gridCol w:w="1980"/>
-            </w:tblGrid>
-            <w:tr>
-              <w:trPr>
-                <w:tblHeader w:val="on"/>
-              </w:trPr>
-              <w:tc>
-                <w:tcPr/>
-                <w:p>
-                  <w:pPr>
-                    <w:pStyle w:val="Compact"/>
-                    <w:jc w:val="left"/>
-                    <w:jc w:val="center"/>
-                  </w:pPr>
-                  <w:r>
-                    <w:t xml:space="preserve">Population-level effect</w:t>
-                  </w:r>
-                </w:p>
-              </w:tc>
-              <w:tc>
-                <w:tcPr/>
-                <w:p>
-                  <w:pPr>
-                    <w:pStyle w:val="Compact"/>
-                    <w:jc w:val="left"/>
-                    <w:jc w:val="center"/>
-                  </w:pPr>
-                  <w:r>
-                    <w:t xml:space="preserve">center</w:t>
-                  </w:r>
-                </w:p>
-              </w:tc>
-              <w:tc>
-                <w:tcPr/>
-                <w:p>
-                  <w:pPr>
-                    <w:pStyle w:val="Compact"/>
-                    <w:jc w:val="left"/>
-                    <w:jc w:val="center"/>
-                  </w:pPr>
-                  <w:r>
-                    <w:t xml:space="preserve">2.5% CrI</w:t>
-                  </w:r>
-                </w:p>
-              </w:tc>
-              <w:tc>
-                <w:tcPr/>
-                <w:p>
-                  <w:pPr>
-                    <w:pStyle w:val="Compact"/>
-                    <w:jc w:val="left"/>
-                    <w:jc w:val="center"/>
-                  </w:pPr>
-                  <w:r>
-                    <w:t xml:space="preserve">97.5% CrI</w:t>
-                  </w:r>
-                </w:p>
-              </w:tc>
-            </w:tr>
-            <w:tr>
-              <w:tc>
-                <w:tcPr/>
-                <w:p>
-                  <w:pPr>
-                    <w:pStyle w:val="Compact"/>
-                    <w:jc w:val="left"/>
-                    <w:jc w:val="center"/>
-                  </w:pPr>
-                  <w:r>
-                    <w:t xml:space="preserve">Intercept</w:t>
-                  </w:r>
-                </w:p>
-              </w:tc>
-              <w:tc>
-                <w:tcPr/>
-                <w:p>
-                  <w:pPr>
-                    <w:pStyle w:val="Compact"/>
-                    <w:jc w:val="left"/>
-                    <w:jc w:val="center"/>
-                  </w:pPr>
-                  <w:r>
-                    <w:t xml:space="preserve">15.8°</w:t>
-                  </w:r>
-                </w:p>
-              </w:tc>
-              <w:tc>
-                <w:tcPr/>
-                <w:p>
-                  <w:pPr>
-                    <w:pStyle w:val="Compact"/>
-                    <w:jc w:val="left"/>
-                    <w:jc w:val="center"/>
-                  </w:pPr>
-                  <w:r>
-                    <w:t xml:space="preserve">11.9°</w:t>
-                  </w:r>
-                </w:p>
-              </w:tc>
-              <w:tc>
-                <w:tcPr/>
-                <w:p>
-                  <w:pPr>
-                    <w:pStyle w:val="Compact"/>
-                    <w:jc w:val="left"/>
-                    <w:jc w:val="center"/>
-                  </w:pPr>
-                  <w:r>
-                    <w:t xml:space="preserve">20.9°</w:t>
-                  </w:r>
-                </w:p>
-              </w:tc>
-            </w:tr>
-            <w:tr>
-              <w:tc>
-                <w:tcPr/>
-                <w:p>
-                  <w:pPr>
-                    <w:pStyle w:val="Compact"/>
-                    <w:jc w:val="left"/>
-                    <w:jc w:val="center"/>
-                  </w:pPr>
-                  <w:r>
-                    <w:t xml:space="preserve">Quadbright</w:t>
-                  </w:r>
-                </w:p>
-              </w:tc>
-              <w:tc>
-                <w:tcPr/>
-                <w:p>
-                  <w:pPr>
-                    <w:pStyle w:val="Compact"/>
-                    <w:jc w:val="left"/>
-                    <w:jc w:val="center"/>
-                  </w:pPr>
-                  <w:r>
-                    <w:t xml:space="preserve">222%</w:t>
-                  </w:r>
-                </w:p>
-              </w:tc>
-              <w:tc>
-                <w:tcPr/>
-                <w:p>
-                  <w:pPr>
-                    <w:pStyle w:val="Compact"/>
-                    <w:jc w:val="left"/>
-                    <w:jc w:val="center"/>
-                  </w:pPr>
-                  <w:r>
-                    <w:t xml:space="preserve">170.7%</w:t>
-                  </w:r>
-                </w:p>
-              </w:tc>
-              <w:tc>
-                <w:tcPr/>
-                <w:p>
-                  <w:pPr>
-                    <w:pStyle w:val="Compact"/>
-                    <w:jc w:val="left"/>
-                    <w:jc w:val="center"/>
-                  </w:pPr>
-                  <w:r>
-                    <w:t xml:space="preserve">288.7%</w:t>
-                  </w:r>
-                </w:p>
-              </w:tc>
-            </w:tr>
-            <w:tr>
-              <w:tc>
-                <w:tcPr/>
-                <w:p>
-                  <w:pPr>
-                    <w:pStyle w:val="Compact"/>
-                    <w:jc w:val="left"/>
-                    <w:jc w:val="center"/>
-                  </w:pPr>
-                  <w:r>
-                    <w:t xml:space="preserve">140</w:t>
-                  </w:r>
-                </w:p>
-              </w:tc>
-              <w:tc>
-                <w:tcPr/>
-                <w:p>
-                  <w:pPr>
-                    <w:pStyle w:val="Compact"/>
-                    <w:jc w:val="left"/>
-                    <w:jc w:val="center"/>
-                  </w:pPr>
-                  <w:r>
-                    <w:t xml:space="preserve">99.7%</w:t>
-                  </w:r>
-                </w:p>
-              </w:tc>
-              <w:tc>
-                <w:tcPr/>
-                <w:p>
-                  <w:pPr>
-                    <w:pStyle w:val="Compact"/>
-                    <w:jc w:val="left"/>
-                    <w:jc w:val="center"/>
-                  </w:pPr>
-                  <w:r>
-                    <w:t xml:space="preserve">89.4%</w:t>
-                  </w:r>
-                </w:p>
-              </w:tc>
-              <w:tc>
-                <w:tcPr/>
-                <w:p>
-                  <w:pPr>
-                    <w:pStyle w:val="Compact"/>
-                    <w:jc w:val="left"/>
-                    <w:jc w:val="center"/>
-                  </w:pPr>
-                  <w:r>
-                    <w:t xml:space="preserve">111.5%</w:t>
-                  </w:r>
-                </w:p>
-              </w:tc>
-            </w:tr>
-            <w:tr>
-              <w:tc>
-                <w:tcPr/>
-                <w:p>
-                  <w:pPr>
-                    <w:pStyle w:val="Compact"/>
-                    <w:jc w:val="left"/>
-                    <w:jc w:val="center"/>
-                  </w:pPr>
-                  <w:r>
-                    <w:t xml:space="preserve">400</w:t>
-                  </w:r>
-                </w:p>
-              </w:tc>
-              <w:tc>
-                <w:tcPr/>
-                <w:p>
-                  <w:pPr>
-                    <w:pStyle w:val="Compact"/>
-                    <w:jc w:val="left"/>
-                    <w:jc w:val="center"/>
-                  </w:pPr>
-                  <w:r>
-                    <w:t xml:space="preserve">90.6%</w:t>
-                  </w:r>
-                </w:p>
-              </w:tc>
-              <w:tc>
-                <w:tcPr/>
-                <w:p>
-                  <w:pPr>
-                    <w:pStyle w:val="Compact"/>
-                    <w:jc w:val="left"/>
-                    <w:jc w:val="center"/>
-                  </w:pPr>
-                  <w:r>
-                    <w:t xml:space="preserve">81.6%</w:t>
-                  </w:r>
-                </w:p>
-              </w:tc>
-              <w:tc>
-                <w:tcPr/>
-                <w:p>
-                  <w:pPr>
-                    <w:pStyle w:val="Compact"/>
-                    <w:jc w:val="left"/>
-                    <w:jc w:val="center"/>
-                  </w:pPr>
-                  <w:r>
-                    <w:t xml:space="preserve">100.5%</w:t>
-                  </w:r>
-                </w:p>
-              </w:tc>
-            </w:tr>
-            <w:tr>
-              <w:tc>
-                <w:tcPr/>
-                <w:p>
-                  <w:pPr>
-                    <w:pStyle w:val="Compact"/>
-                    <w:jc w:val="left"/>
-                    <w:jc w:val="center"/>
-                  </w:pPr>
-                  <w:r>
-                    <w:t xml:space="preserve">600</w:t>
-                  </w:r>
-                </w:p>
-              </w:tc>
-              <w:tc>
-                <w:tcPr/>
-                <w:p>
-                  <w:pPr>
-                    <w:pStyle w:val="Compact"/>
-                    <w:jc w:val="left"/>
-                    <w:jc w:val="center"/>
-                  </w:pPr>
-                  <w:r>
-                    <w:t xml:space="preserve">89.8%</w:t>
-                  </w:r>
-                </w:p>
-              </w:tc>
-              <w:tc>
-                <w:tcPr/>
-                <w:p>
-                  <w:pPr>
-                    <w:pStyle w:val="Compact"/>
-                    <w:jc w:val="left"/>
-                    <w:jc w:val="center"/>
-                  </w:pPr>
-                  <w:r>
-                    <w:t xml:space="preserve">80.3%</w:t>
-                  </w:r>
-                </w:p>
-              </w:tc>
-              <w:tc>
-                <w:tcPr/>
-                <w:p>
-                  <w:pPr>
-                    <w:pStyle w:val="Compact"/>
-                    <w:jc w:val="left"/>
-                    <w:jc w:val="center"/>
-                  </w:pPr>
-                  <w:r>
-                    <w:t xml:space="preserve">100.1%</w:t>
-                  </w:r>
-                </w:p>
-              </w:tc>
-            </w:tr>
-            <w:tr>
-              <w:tc>
-                <w:tcPr/>
-                <w:p>
-                  <w:pPr>
-                    <w:pStyle w:val="Compact"/>
-                    <w:jc w:val="left"/>
-                    <w:jc w:val="center"/>
-                  </w:pPr>
-                  <w:r>
-                    <w:t xml:space="preserve">1000</w:t>
-                  </w:r>
-                </w:p>
-              </w:tc>
-              <w:tc>
-                <w:tcPr/>
-                <w:p>
-                  <w:pPr>
-                    <w:pStyle w:val="Compact"/>
-                    <w:jc w:val="left"/>
-                    <w:jc w:val="center"/>
-                  </w:pPr>
-                  <w:r>
-                    <w:t xml:space="preserve">81.9%</w:t>
-                  </w:r>
-                </w:p>
-              </w:tc>
-              <w:tc>
-                <w:tcPr/>
-                <w:p>
-                  <w:pPr>
-                    <w:pStyle w:val="Compact"/>
-                    <w:jc w:val="left"/>
-                    <w:jc w:val="center"/>
-                  </w:pPr>
-                  <w:r>
-                    <w:t xml:space="preserve">69.9%</w:t>
-                  </w:r>
-                </w:p>
-              </w:tc>
-              <w:tc>
-                <w:tcPr/>
-                <w:p>
-                  <w:pPr>
-                    <w:pStyle w:val="Compact"/>
-                    <w:jc w:val="left"/>
-                    <w:jc w:val="center"/>
-                  </w:pPr>
-                  <w:r>
-                    <w:t xml:space="preserve">93.3%</w:t>
-                  </w:r>
-                </w:p>
-              </w:tc>
-            </w:tr>
-            <w:tr>
-              <w:tc>
-                <w:tcPr/>
-                <w:p>
-                  <w:pPr>
-                    <w:pStyle w:val="Compact"/>
-                    <w:jc w:val="left"/>
-                    <w:jc w:val="center"/>
-                  </w:pPr>
-                  <w:r>
-                    <w:t xml:space="preserve">Quadbright:140</w:t>
-                  </w:r>
-                </w:p>
-              </w:tc>
-              <w:tc>
-                <w:tcPr/>
-                <w:p>
-                  <w:pPr>
-                    <w:pStyle w:val="Compact"/>
-                    <w:jc w:val="left"/>
-                    <w:jc w:val="center"/>
-                  </w:pPr>
-                  <w:r>
-                    <w:t xml:space="preserve">75.3%</w:t>
-                  </w:r>
-                </w:p>
-              </w:tc>
-              <w:tc>
-                <w:tcPr/>
-                <w:p>
-                  <w:pPr>
-                    <w:pStyle w:val="Compact"/>
-                    <w:jc w:val="left"/>
-                    <w:jc w:val="center"/>
-                  </w:pPr>
-                  <w:r>
-                    <w:t xml:space="preserve">65.6%</w:t>
-                  </w:r>
-                </w:p>
-              </w:tc>
-              <w:tc>
-                <w:tcPr/>
-                <w:p>
-                  <w:pPr>
-                    <w:pStyle w:val="Compact"/>
-                    <w:jc w:val="left"/>
-                    <w:jc w:val="center"/>
-                  </w:pPr>
-                  <w:r>
-                    <w:t xml:space="preserve">86.2%</w:t>
-                  </w:r>
-                </w:p>
-              </w:tc>
-            </w:tr>
-            <w:tr>
-              <w:tc>
-                <w:tcPr/>
-                <w:p>
-                  <w:pPr>
-                    <w:pStyle w:val="Compact"/>
-                    <w:jc w:val="left"/>
-                    <w:jc w:val="center"/>
-                  </w:pPr>
-                  <w:r>
-                    <w:t xml:space="preserve">Quadbright:400</w:t>
-                  </w:r>
-                </w:p>
-              </w:tc>
-              <w:tc>
-                <w:tcPr/>
-                <w:p>
-                  <w:pPr>
-                    <w:pStyle w:val="Compact"/>
-                    <w:jc w:val="left"/>
-                    <w:jc w:val="center"/>
-                  </w:pPr>
-                  <w:r>
-                    <w:t xml:space="preserve">75.7%</w:t>
-                  </w:r>
-                </w:p>
-              </w:tc>
-              <w:tc>
-                <w:tcPr/>
-                <w:p>
-                  <w:pPr>
-                    <w:pStyle w:val="Compact"/>
-                    <w:jc w:val="left"/>
-                    <w:jc w:val="center"/>
-                  </w:pPr>
-                  <w:r>
-                    <w:t xml:space="preserve">65.7%</w:t>
-                  </w:r>
-                </w:p>
-              </w:tc>
-              <w:tc>
-                <w:tcPr/>
-                <w:p>
-                  <w:pPr>
-                    <w:pStyle w:val="Compact"/>
-                    <w:jc w:val="left"/>
-                    <w:jc w:val="center"/>
-                  </w:pPr>
-                  <w:r>
-                    <w:t xml:space="preserve">87.2%</w:t>
-                  </w:r>
-                </w:p>
-              </w:tc>
-            </w:tr>
-            <w:tr>
-              <w:tc>
-                <w:tcPr/>
-                <w:p>
-                  <w:pPr>
-                    <w:pStyle w:val="Compact"/>
-                    <w:jc w:val="left"/>
-                    <w:jc w:val="center"/>
-                  </w:pPr>
-                  <w:r>
-                    <w:t xml:space="preserve">Quadbright:600</w:t>
-                  </w:r>
-                </w:p>
-              </w:tc>
-              <w:tc>
-                <w:tcPr/>
-                <w:p>
-                  <w:pPr>
-                    <w:pStyle w:val="Compact"/>
-                    <w:jc w:val="left"/>
-                    <w:jc w:val="center"/>
-                  </w:pPr>
-                  <w:r>
-                    <w:t xml:space="preserve">78.4%</w:t>
-                  </w:r>
-                </w:p>
-              </w:tc>
-              <w:tc>
-                <w:tcPr/>
-                <w:p>
-                  <w:pPr>
-                    <w:pStyle w:val="Compact"/>
-                    <w:jc w:val="left"/>
-                    <w:jc w:val="center"/>
-                  </w:pPr>
-                  <w:r>
-                    <w:t xml:space="preserve">67.3%</w:t>
-                  </w:r>
-                </w:p>
-              </w:tc>
-              <w:tc>
-                <w:tcPr/>
-                <w:p>
-                  <w:pPr>
-                    <w:pStyle w:val="Compact"/>
-                    <w:jc w:val="left"/>
-                    <w:jc w:val="center"/>
-                  </w:pPr>
-                  <w:r>
-                    <w:t xml:space="preserve">91.4%</w:t>
-                  </w:r>
-                </w:p>
-              </w:tc>
-            </w:tr>
-            <w:tr>
-              <w:tc>
-                <w:tcPr/>
-                <w:p>
-                  <w:pPr>
-                    <w:pStyle w:val="Compact"/>
-                    <w:jc w:val="left"/>
-                    <w:jc w:val="center"/>
-                  </w:pPr>
-                  <w:r>
-                    <w:t xml:space="preserve">Quadbright:1000</w:t>
-                  </w:r>
-                </w:p>
-              </w:tc>
-              <w:tc>
-                <w:tcPr/>
-                <w:p>
-                  <w:pPr>
-                    <w:pStyle w:val="Compact"/>
-                    <w:jc w:val="left"/>
-                    <w:jc w:val="center"/>
-                  </w:pPr>
-                  <w:r>
-                    <w:t xml:space="preserve">78.6%</w:t>
-                  </w:r>
-                </w:p>
-              </w:tc>
-              <w:tc>
-                <w:tcPr/>
-                <w:p>
-                  <w:pPr>
-                    <w:pStyle w:val="Compact"/>
-                    <w:jc w:val="left"/>
-                    <w:jc w:val="center"/>
-                  </w:pPr>
-                  <w:r>
-                    <w:t xml:space="preserve">67.6%</w:t>
-                  </w:r>
-                </w:p>
-              </w:tc>
-              <w:tc>
-                <w:tcPr/>
-                <w:p>
-                  <w:pPr>
-                    <w:pStyle w:val="Compact"/>
-                    <w:jc w:val="left"/>
-                    <w:jc w:val="center"/>
-                  </w:pPr>
-                  <w:r>
-                    <w:t xml:space="preserve">93.1%</w:t>
-                  </w:r>
-                </w:p>
-              </w:tc>
-            </w:tr>
-          </w:tbl>
-          <w:bookmarkEnd w:id="67"/>
-          <w:p/>
-        </w:tc>
-      </w:tr>
-    </w:tbl>
     <w:tbl>
       <w:tblPr>
         <w:tblStyle w:val="Table"/>
@@ -3068,87 +2497,18 @@
               <w:jc w:val="center"/>
             </w:pPr>
             <w:pPr>
-              <w:jc w:val="start"/>
+              <w:jc w:val="left"/>
               <w:spacing w:before="200"/>
               <w:pStyle w:val="ImageCaption"/>
             </w:pPr>
             <w:r>
-              <w:t xml:space="preserve">Figure 5: Estimated degree error by condition and exposure time with 95% credibility intervals.</w:t>
+              <w:t xml:space="preserve">Figure 5: Estimated degree error by condition and exposure time with group-level 95% credibility intervals.</w:t>
             </w:r>
           </w:p>
           <w:bookmarkEnd w:id="71"/>
         </w:tc>
       </w:tr>
     </w:tbl>
-    <w:p>
-      <w:pPr>
-        <w:pStyle w:val="BodyText"/>
-      </w:pPr>
-      <w:r>
-        <w:t xml:space="preserve">In</w:t>
-      </w:r>
-      <w:r>
-        <w:t xml:space="preserve"> </w:t>
-      </w:r>
-      <w:hyperlink w:anchor="tbl-fixef-M4">
-        <w:r>
-          <w:rPr>
-            <w:rStyle w:val="Hyperlink"/>
-          </w:rPr>
-          <w:t xml:space="preserve">Table 2</w:t>
-        </w:r>
-      </w:hyperlink>
-      <w:r>
-        <w:t xml:space="preserve"> </w:t>
-      </w:r>
-      <w:r>
-        <w:t xml:space="preserve">the Intercept is the average error in the baseline condition (Control, 70 milliseconds), which is around 16° with moderate certainty. In the control condition, error rates remain stable (99.7%) with 140 ms exposure, but with 400ms and 600ms the error rate drops to around 90% and finally to 81.9%.</w:t>
-      </w:r>
-    </w:p>
-    <w:p>
-      <w:pPr>
-        <w:pStyle w:val="BodyText"/>
-      </w:pPr>
-      <w:r>
-        <w:t xml:space="preserve">In the Quadbright condition with 70 ms exposure, the error is around twice as high compared to the control condition, although with considerable uncertainty. Initially, the expected degree error is around 35°. Different to the control condition, error rates take the first drop at 140ms to around 75%. From that point on, the error rates drop similarly to the control condition (</w:t>
-      </w:r>
-      <w:hyperlink w:anchor="fig-fixef-M4">
-        <w:r>
-          <w:rPr>
-            <w:rStyle w:val="Hyperlink"/>
-          </w:rPr>
-          <w:t xml:space="preserve">Figure 5</w:t>
-        </w:r>
-      </w:hyperlink>
-      <w:r>
-        <w:t xml:space="preserve">).</w:t>
-      </w:r>
-    </w:p>
-    <w:p>
-      <w:pPr>
-        <w:pStyle w:val="BodyText"/>
-      </w:pPr>
-      <w:r>
-        <w:t xml:space="preserve">If human eye direction reading is similar to a Quadbright device, we expect that it is a universal trait in the population. Figure</w:t>
-      </w:r>
-      <w:r>
-        <w:t xml:space="preserve"> </w:t>
-      </w:r>
-      <w:hyperlink w:anchor="fig-participant-trajectories">
-        <w:r>
-          <w:rPr>
-            <w:rStyle w:val="Hyperlink"/>
-          </w:rPr>
-          <w:t xml:space="preserve">Figure 6</w:t>
-        </w:r>
-      </w:hyperlink>
-      <w:r>
-        <w:t xml:space="preserve"> </w:t>
-      </w:r>
-      <w:r>
-        <w:t xml:space="preserve">shows the participant-level performance trajectories. Initially, all of them showed lower performance in the Quadbright condition. The second dominant effect that can be observed is an enormous variance in the Quadbright conditions. Initially, the sample appears to fall into two clusters, one in the region below 40 degree errors, and a few participants dramatically failing with Quadbright signals. Starting with 140ms, a third group appears with almost stable performance around 10 degree.</w:t>
-      </w:r>
-    </w:p>
     <w:tbl>
       <w:tblPr>
         <w:tblStyle w:val="Table"/>
@@ -3162,30 +2522,772 @@
       <w:tr>
         <w:tc>
           <w:tcPr/>
-          <w:bookmarkStart w:id="76" w:name="fig-participant-trajectories"/>
+          <w:bookmarkStart w:id="75" w:name="fig-grpef-M4"/>
           <w:p>
             <w:pPr>
               <w:pStyle w:val="Compact"/>
               <w:jc w:val="center"/>
             </w:pPr>
-            <w:bookmarkStart w:id="75" w:name="fig-participant-trajectories"/>
             <w:r>
               <w:drawing>
                 <wp:inline>
-                  <wp:extent cx="5334000" cy="4000500"/>
+                  <wp:extent cx="4620126" cy="3696101"/>
                   <wp:effectExtent b="0" l="0" r="0" t="0"/>
                   <wp:docPr descr="" title="" id="73" name="Picture"/>
                   <a:graphic>
                     <a:graphicData uri="http://schemas.openxmlformats.org/drawingml/2006/picture">
                       <pic:pic>
                         <pic:nvPicPr>
-                          <pic:cNvPr descr="YET_CEHR_files/figure-docx/fig-participant-trajectories-1.png" id="74" name="Picture"/>
+                          <pic:cNvPr descr="YET_CEHR_files/figure-docx/fig-grpef-M4-1.png" id="74" name="Picture"/>
                           <pic:cNvPicPr>
                             <a:picLocks noChangeArrowheads="1" noChangeAspect="1"/>
                           </pic:cNvPicPr>
                         </pic:nvPicPr>
                         <pic:blipFill>
                           <a:blip r:embed="rId72"/>
+                          <a:stretch>
+                            <a:fillRect/>
+                          </a:stretch>
+                        </pic:blipFill>
+                        <pic:spPr bwMode="auto">
+                          <a:xfrm>
+                            <a:off x="0" y="0"/>
+                            <a:ext cx="4620126" cy="3696101"/>
+                          </a:xfrm>
+                          <a:prstGeom prst="rect">
+                            <a:avLst/>
+                          </a:prstGeom>
+                          <a:noFill/>
+                          <a:ln w="9525">
+                            <a:noFill/>
+                            <a:headEnd/>
+                            <a:tailEnd/>
+                          </a:ln>
+                        </pic:spPr>
+                      </pic:pic>
+                    </a:graphicData>
+                  </a:graphic>
+                </wp:inline>
+              </w:drawing>
+            </w:r>
+          </w:p>
+          <w:p>
+            <w:pPr>
+              <w:jc w:val="center"/>
+            </w:pPr>
+            <w:pPr>
+              <w:jc w:val="left"/>
+              <w:spacing w:before="200"/>
+              <w:pStyle w:val="ImageCaption"/>
+            </w:pPr>
+            <w:r>
+              <w:t xml:space="preserve">Figure 6: Variance component analysis on the full conditional model.</w:t>
+            </w:r>
+          </w:p>
+          <w:bookmarkEnd w:id="75"/>
+        </w:tc>
+      </w:tr>
+    </w:tbl>
+    <w:p>
+      <w:pPr>
+        <w:pStyle w:val="BodyText"/>
+      </w:pPr>
+      <w:r>
+        <w:t xml:space="preserve">Starting point of the evaluation is a full conditional model, allowing all levels to align freely.</w:t>
+      </w:r>
+      <w:r>
+        <w:t xml:space="preserve"> </w:t>
+      </w:r>
+      <w:hyperlink w:anchor="fig-fixef-M4">
+        <w:r>
+          <w:rPr>
+            <w:rStyle w:val="Hyperlink"/>
+          </w:rPr>
+          <w:t xml:space="preserve">Figure 5</w:t>
+        </w:r>
+      </w:hyperlink>
+      <w:r>
+        <w:t xml:space="preserve"> </w:t>
+      </w:r>
+      <w:r>
+        <w:t xml:space="preserve">shows a clear separation between conditions, with consistently better performance in Control. However, starting at 400ms the two conditions seem to run in parallel. A variance component analysis revealed that these levels also explain most of the inter-individual variance.</w:t>
+      </w:r>
+    </w:p>
+    <w:p>
+      <w:pPr>
+        <w:pStyle w:val="BodyText"/>
+      </w:pPr>
+      <w:r>
+        <w:t xml:space="preserve">Participant-level variance component analysis shows that variation is strongest in the default condition (70ms, control) and the respective conditional effect, but also the conditional effect at 140ms. All other components are negligible. In consequence, a reduced model with conditional effects only for 70ms and 140ms exposure was fitted. Subsequently, LOO IC formally confirmed that the reduced model has superior predictive value (</w:t>
+      </w:r>
+      <m:oMath>
+        <m:r>
+          <m:t>31985</m:t>
+        </m:r>
+        <m:r>
+          <m:rPr>
+            <m:sty m:val="p"/>
+          </m:rPr>
+          <m:t>&lt;</m:t>
+        </m:r>
+        <m:r>
+          <m:t>32316</m:t>
+        </m:r>
+      </m:oMath>
+      <w:r>
+        <w:t xml:space="preserve">).</w:t>
+      </w:r>
+    </w:p>
+    <w:tbl>
+      <w:tblPr>
+        <w:tblStyle w:val="Table"/>
+        <w:tblW w:type="pct" w:w="5000"/>
+        <w:tblLayout w:type="fixed"/>
+        <w:tblLook w:firstRow="0" w:lastRow="0" w:firstColumn="0" w:lastColumn="0" w:noHBand="0" w:noVBand="0" w:val="0000"/>
+      </w:tblPr>
+      <w:tblGrid>
+        <w:gridCol w:w="7920"/>
+      </w:tblGrid>
+      <w:tr>
+        <w:tc>
+          <w:tcPr/>
+          <w:bookmarkStart w:id="76" w:name="tbl-fixef-M5"/>
+          <w:p>
+            <w:pPr>
+              <w:jc w:val="center"/>
+            </w:pPr>
+            <w:pPr>
+              <w:jc w:val="left"/>
+              <w:spacing w:before="200"/>
+              <w:pStyle w:val="ImageCaption"/>
+            </w:pPr>
+            <w:r>
+              <w:t xml:space="preserve">Table 2</w:t>
+            </w:r>
+          </w:p>
+          <w:tbl>
+            <w:tblPr>
+              <w:tblStyle w:val="Table"/>
+              <w:tblW w:type="auto" w:w="0"/>
+              <w:tblLook w:firstRow="1" w:lastRow="0" w:firstColumn="0" w:lastColumn="0" w:noHBand="0" w:noVBand="0" w:val="0020"/>
+            </w:tblPr>
+            <w:tblGrid>
+              <w:gridCol w:w="1980"/>
+              <w:gridCol w:w="1980"/>
+              <w:gridCol w:w="1980"/>
+              <w:gridCol w:w="1980"/>
+            </w:tblGrid>
+            <w:tr>
+              <w:trPr>
+                <w:tblHeader w:val="on"/>
+              </w:trPr>
+              <w:tc>
+                <w:tcPr/>
+                <w:p>
+                  <w:pPr>
+                    <w:pStyle w:val="Compact"/>
+                    <w:jc w:val="left"/>
+                    <w:jc w:val="center"/>
+                  </w:pPr>
+                  <w:r>
+                    <w:t xml:space="preserve">Population-level effect</w:t>
+                  </w:r>
+                </w:p>
+              </w:tc>
+              <w:tc>
+                <w:tcPr/>
+                <w:p>
+                  <w:pPr>
+                    <w:pStyle w:val="Compact"/>
+                    <w:jc w:val="left"/>
+                    <w:jc w:val="center"/>
+                  </w:pPr>
+                  <w:r>
+                    <w:t xml:space="preserve">center</w:t>
+                  </w:r>
+                </w:p>
+              </w:tc>
+              <w:tc>
+                <w:tcPr/>
+                <w:p>
+                  <w:pPr>
+                    <w:pStyle w:val="Compact"/>
+                    <w:jc w:val="left"/>
+                    <w:jc w:val="center"/>
+                  </w:pPr>
+                  <w:r>
+                    <w:t xml:space="preserve">2.5% CrI</w:t>
+                  </w:r>
+                </w:p>
+              </w:tc>
+              <w:tc>
+                <w:tcPr/>
+                <w:p>
+                  <w:pPr>
+                    <w:pStyle w:val="Compact"/>
+                    <w:jc w:val="left"/>
+                    <w:jc w:val="center"/>
+                  </w:pPr>
+                  <w:r>
+                    <w:t xml:space="preserve">97.5% CrI</w:t>
+                  </w:r>
+                </w:p>
+              </w:tc>
+            </w:tr>
+            <w:tr>
+              <w:tc>
+                <w:tcPr/>
+                <w:p>
+                  <w:pPr>
+                    <w:pStyle w:val="Compact"/>
+                    <w:jc w:val="left"/>
+                    <w:jc w:val="center"/>
+                  </w:pPr>
+                  <w:r>
+                    <w:t xml:space="preserve">Control_70</w:t>
+                  </w:r>
+                </w:p>
+              </w:tc>
+              <w:tc>
+                <w:tcPr/>
+                <w:p>
+                  <w:pPr>
+                    <w:pStyle w:val="Compact"/>
+                    <w:jc w:val="left"/>
+                    <w:jc w:val="center"/>
+                  </w:pPr>
+                  <w:r>
+                    <w:t xml:space="preserve">16.9%</w:t>
+                  </w:r>
+                </w:p>
+              </w:tc>
+              <w:tc>
+                <w:tcPr/>
+                <w:p>
+                  <w:pPr>
+                    <w:pStyle w:val="Compact"/>
+                    <w:jc w:val="left"/>
+                    <w:jc w:val="center"/>
+                  </w:pPr>
+                  <w:r>
+                    <w:t xml:space="preserve">13.9%</w:t>
+                  </w:r>
+                </w:p>
+              </w:tc>
+              <w:tc>
+                <w:tcPr/>
+                <w:p>
+                  <w:pPr>
+                    <w:pStyle w:val="Compact"/>
+                    <w:jc w:val="left"/>
+                    <w:jc w:val="center"/>
+                  </w:pPr>
+                  <w:r>
+                    <w:t xml:space="preserve">20.4%</w:t>
+                  </w:r>
+                </w:p>
+              </w:tc>
+            </w:tr>
+            <w:tr>
+              <w:tc>
+                <w:tcPr/>
+                <w:p>
+                  <w:pPr>
+                    <w:pStyle w:val="Compact"/>
+                    <w:jc w:val="left"/>
+                    <w:jc w:val="center"/>
+                  </w:pPr>
+                  <w:r>
+                    <w:t xml:space="preserve">qbr_70</w:t>
+                  </w:r>
+                </w:p>
+              </w:tc>
+              <w:tc>
+                <w:tcPr/>
+                <w:p>
+                  <w:pPr>
+                    <w:pStyle w:val="Compact"/>
+                    <w:jc w:val="left"/>
+                    <w:jc w:val="center"/>
+                  </w:pPr>
+                  <w:r>
+                    <w:t xml:space="preserve">204.5%</w:t>
+                  </w:r>
+                </w:p>
+              </w:tc>
+              <w:tc>
+                <w:tcPr/>
+                <w:p>
+                  <w:pPr>
+                    <w:pStyle w:val="Compact"/>
+                    <w:jc w:val="left"/>
+                    <w:jc w:val="center"/>
+                  </w:pPr>
+                  <w:r>
+                    <w:t xml:space="preserve">178.3%</w:t>
+                  </w:r>
+                </w:p>
+              </w:tc>
+              <w:tc>
+                <w:tcPr/>
+                <w:p>
+                  <w:pPr>
+                    <w:pStyle w:val="Compact"/>
+                    <w:jc w:val="left"/>
+                    <w:jc w:val="center"/>
+                  </w:pPr>
+                  <w:r>
+                    <w:t xml:space="preserve">234.1%</w:t>
+                  </w:r>
+                </w:p>
+              </w:tc>
+            </w:tr>
+            <w:tr>
+              <w:tc>
+                <w:tcPr/>
+                <w:p>
+                  <w:pPr>
+                    <w:pStyle w:val="Compact"/>
+                    <w:jc w:val="left"/>
+                    <w:jc w:val="center"/>
+                  </w:pPr>
+                  <w:r>
+                    <w:t xml:space="preserve">exp_140</w:t>
+                  </w:r>
+                </w:p>
+              </w:tc>
+              <w:tc>
+                <w:tcPr/>
+                <w:p>
+                  <w:pPr>
+                    <w:pStyle w:val="Compact"/>
+                    <w:jc w:val="left"/>
+                    <w:jc w:val="center"/>
+                  </w:pPr>
+                  <w:r>
+                    <w:t xml:space="preserve">90.3%</w:t>
+                  </w:r>
+                </w:p>
+              </w:tc>
+              <w:tc>
+                <w:tcPr/>
+                <w:p>
+                  <w:pPr>
+                    <w:pStyle w:val="Compact"/>
+                    <w:jc w:val="left"/>
+                    <w:jc w:val="center"/>
+                  </w:pPr>
+                  <w:r>
+                    <w:t xml:space="preserve">71.1%</w:t>
+                  </w:r>
+                </w:p>
+              </w:tc>
+              <w:tc>
+                <w:tcPr/>
+                <w:p>
+                  <w:pPr>
+                    <w:pStyle w:val="Compact"/>
+                    <w:jc w:val="left"/>
+                    <w:jc w:val="center"/>
+                  </w:pPr>
+                  <w:r>
+                    <w:t xml:space="preserve">115%</w:t>
+                  </w:r>
+                </w:p>
+              </w:tc>
+            </w:tr>
+            <w:tr>
+              <w:tc>
+                <w:tcPr/>
+                <w:p>
+                  <w:pPr>
+                    <w:pStyle w:val="Compact"/>
+                    <w:jc w:val="left"/>
+                    <w:jc w:val="center"/>
+                  </w:pPr>
+                  <w:r>
+                    <w:t xml:space="preserve">qbr_140</w:t>
+                  </w:r>
+                </w:p>
+              </w:tc>
+              <w:tc>
+                <w:tcPr/>
+                <w:p>
+                  <w:pPr>
+                    <w:pStyle w:val="Compact"/>
+                    <w:jc w:val="left"/>
+                    <w:jc w:val="center"/>
+                  </w:pPr>
+                  <w:r>
+                    <w:t xml:space="preserve">84.6%</w:t>
+                  </w:r>
+                </w:p>
+              </w:tc>
+              <w:tc>
+                <w:tcPr/>
+                <w:p>
+                  <w:pPr>
+                    <w:pStyle w:val="Compact"/>
+                    <w:jc w:val="left"/>
+                    <w:jc w:val="center"/>
+                  </w:pPr>
+                  <w:r>
+                    <w:t xml:space="preserve">62.6%</w:t>
+                  </w:r>
+                </w:p>
+              </w:tc>
+              <w:tc>
+                <w:tcPr/>
+                <w:p>
+                  <w:pPr>
+                    <w:pStyle w:val="Compact"/>
+                    <w:jc w:val="left"/>
+                    <w:jc w:val="center"/>
+                  </w:pPr>
+                  <w:r>
+                    <w:t xml:space="preserve">115.6%</w:t>
+                  </w:r>
+                </w:p>
+              </w:tc>
+            </w:tr>
+            <w:tr>
+              <w:tc>
+                <w:tcPr/>
+                <w:p>
+                  <w:pPr>
+                    <w:pStyle w:val="Compact"/>
+                    <w:jc w:val="left"/>
+                    <w:jc w:val="center"/>
+                  </w:pPr>
+                  <w:r>
+                    <w:t xml:space="preserve">exp_400</w:t>
+                  </w:r>
+                </w:p>
+              </w:tc>
+              <w:tc>
+                <w:tcPr/>
+                <w:p>
+                  <w:pPr>
+                    <w:pStyle w:val="Compact"/>
+                    <w:jc w:val="left"/>
+                    <w:jc w:val="center"/>
+                  </w:pPr>
+                  <w:r>
+                    <w:t xml:space="preserve">92%</w:t>
+                  </w:r>
+                </w:p>
+              </w:tc>
+              <w:tc>
+                <w:tcPr/>
+                <w:p>
+                  <w:pPr>
+                    <w:pStyle w:val="Compact"/>
+                    <w:jc w:val="left"/>
+                    <w:jc w:val="center"/>
+                  </w:pPr>
+                  <w:r>
+                    <w:t xml:space="preserve">86.1%</w:t>
+                  </w:r>
+                </w:p>
+              </w:tc>
+              <w:tc>
+                <w:tcPr/>
+                <w:p>
+                  <w:pPr>
+                    <w:pStyle w:val="Compact"/>
+                    <w:jc w:val="left"/>
+                    <w:jc w:val="center"/>
+                  </w:pPr>
+                  <w:r>
+                    <w:t xml:space="preserve">98.5%</w:t>
+                  </w:r>
+                </w:p>
+              </w:tc>
+            </w:tr>
+            <w:tr>
+              <w:tc>
+                <w:tcPr/>
+                <w:p>
+                  <w:pPr>
+                    <w:pStyle w:val="Compact"/>
+                    <w:jc w:val="left"/>
+                    <w:jc w:val="center"/>
+                  </w:pPr>
+                  <w:r>
+                    <w:t xml:space="preserve">exp_600</w:t>
+                  </w:r>
+                </w:p>
+              </w:tc>
+              <w:tc>
+                <w:tcPr/>
+                <w:p>
+                  <w:pPr>
+                    <w:pStyle w:val="Compact"/>
+                    <w:jc w:val="left"/>
+                    <w:jc w:val="center"/>
+                  </w:pPr>
+                  <w:r>
+                    <w:t xml:space="preserve">100.7%</w:t>
+                  </w:r>
+                </w:p>
+              </w:tc>
+              <w:tc>
+                <w:tcPr/>
+                <w:p>
+                  <w:pPr>
+                    <w:pStyle w:val="Compact"/>
+                    <w:jc w:val="left"/>
+                    <w:jc w:val="center"/>
+                  </w:pPr>
+                  <w:r>
+                    <w:t xml:space="preserve">95.3%</w:t>
+                  </w:r>
+                </w:p>
+              </w:tc>
+              <w:tc>
+                <w:tcPr/>
+                <w:p>
+                  <w:pPr>
+                    <w:pStyle w:val="Compact"/>
+                    <w:jc w:val="left"/>
+                    <w:jc w:val="center"/>
+                  </w:pPr>
+                  <w:r>
+                    <w:t xml:space="preserve">106.2%</w:t>
+                  </w:r>
+                </w:p>
+              </w:tc>
+            </w:tr>
+            <w:tr>
+              <w:tc>
+                <w:tcPr/>
+                <w:p>
+                  <w:pPr>
+                    <w:pStyle w:val="Compact"/>
+                    <w:jc w:val="left"/>
+                    <w:jc w:val="center"/>
+                  </w:pPr>
+                  <w:r>
+                    <w:t xml:space="preserve">exp_1000</w:t>
+                  </w:r>
+                </w:p>
+              </w:tc>
+              <w:tc>
+                <w:tcPr/>
+                <w:p>
+                  <w:pPr>
+                    <w:pStyle w:val="Compact"/>
+                    <w:jc w:val="left"/>
+                    <w:jc w:val="center"/>
+                  </w:pPr>
+                  <w:r>
+                    <w:t xml:space="preserve">92.9%</w:t>
+                  </w:r>
+                </w:p>
+              </w:tc>
+              <w:tc>
+                <w:tcPr/>
+                <w:p>
+                  <w:pPr>
+                    <w:pStyle w:val="Compact"/>
+                    <w:jc w:val="left"/>
+                    <w:jc w:val="center"/>
+                  </w:pPr>
+                  <w:r>
+                    <w:t xml:space="preserve">87.8%</w:t>
+                  </w:r>
+                </w:p>
+              </w:tc>
+              <w:tc>
+                <w:tcPr/>
+                <w:p>
+                  <w:pPr>
+                    <w:pStyle w:val="Compact"/>
+                    <w:jc w:val="left"/>
+                    <w:jc w:val="center"/>
+                  </w:pPr>
+                  <w:r>
+                    <w:t xml:space="preserve">98.2%</w:t>
+                  </w:r>
+                </w:p>
+              </w:tc>
+            </w:tr>
+          </w:tbl>
+          <w:bookmarkEnd w:id="76"/>
+          <w:p/>
+        </w:tc>
+      </w:tr>
+    </w:tbl>
+    <w:p>
+      <w:pPr>
+        <w:pStyle w:val="BodyText"/>
+      </w:pPr>
+      <w:r>
+        <w:t xml:space="preserve">In the default condition (Control, 70ms) the average angular error is 16.9°, with some uncertainty (</w:t>
+      </w:r>
+      <w:hyperlink w:anchor="tbl-fixef-M5">
+        <w:r>
+          <w:rPr>
+            <w:rStyle w:val="Hyperlink"/>
+          </w:rPr>
+          <w:t xml:space="preserve">Table 2</w:t>
+        </w:r>
+      </w:hyperlink>
+      <w:r>
+        <w:t xml:space="preserve">), whereas the Quadbright condition produced error around twice as large. There appears to be a small improvement at 140ms, which is more pronounced for Quadbright (90.3% x 84.6%), but this is far from being certain. At 400ms errors drop to around 92% (conditions combined), which may be a little more or less, but it is credible on 95% level. At 600ms average angular error remains stable, before taking another drop by around 92.9%, which is sufficiently certain.</w:t>
+      </w:r>
+    </w:p>
+    <w:tbl>
+      <w:tblPr>
+        <w:tblStyle w:val="Table"/>
+        <w:tblW w:type="pct" w:w="5000"/>
+        <w:tblLayout w:type="fixed"/>
+        <w:tblLook w:firstRow="0" w:lastRow="0" w:firstColumn="0" w:lastColumn="0" w:noHBand="0" w:noVBand="0" w:val="0000"/>
+      </w:tblPr>
+      <w:tblGrid>
+        <w:gridCol w:w="7920"/>
+      </w:tblGrid>
+      <w:tr>
+        <w:tc>
+          <w:tcPr/>
+          <w:bookmarkStart w:id="81" w:name="fig-participant-trajectories-1"/>
+          <w:p>
+            <w:pPr>
+              <w:pStyle w:val="Compact"/>
+              <w:jc w:val="center"/>
+            </w:pPr>
+            <w:bookmarkStart w:id="80" w:name="fig-participant-trajectories-1"/>
+            <w:r>
+              <w:drawing>
+                <wp:inline>
+                  <wp:extent cx="5334000" cy="6667500"/>
+                  <wp:effectExtent b="0" l="0" r="0" t="0"/>
+                  <wp:docPr descr="" title="" id="78" name="Picture"/>
+                  <a:graphic>
+                    <a:graphicData uri="http://schemas.openxmlformats.org/drawingml/2006/picture">
+                      <pic:pic>
+                        <pic:nvPicPr>
+                          <pic:cNvPr descr="YET_CEHR_files/figure-docx/fig-participant-trajectories-1-1.png" id="79" name="Picture"/>
+                          <pic:cNvPicPr>
+                            <a:picLocks noChangeArrowheads="1" noChangeAspect="1"/>
+                          </pic:cNvPicPr>
+                        </pic:nvPicPr>
+                        <pic:blipFill>
+                          <a:blip r:embed="rId77"/>
+                          <a:stretch>
+                            <a:fillRect/>
+                          </a:stretch>
+                        </pic:blipFill>
+                        <pic:spPr bwMode="auto">
+                          <a:xfrm>
+                            <a:off x="0" y="0"/>
+                            <a:ext cx="5334000" cy="6667500"/>
+                          </a:xfrm>
+                          <a:prstGeom prst="rect">
+                            <a:avLst/>
+                          </a:prstGeom>
+                          <a:noFill/>
+                          <a:ln w="9525">
+                            <a:noFill/>
+                            <a:headEnd/>
+                            <a:tailEnd/>
+                          </a:ln>
+                        </pic:spPr>
+                      </pic:pic>
+                    </a:graphicData>
+                  </a:graphic>
+                </wp:inline>
+              </w:drawing>
+            </w:r>
+            <w:bookmarkEnd w:id="80"/>
+          </w:p>
+          <w:p>
+            <w:pPr>
+              <w:jc w:val="center"/>
+            </w:pPr>
+            <w:pPr>
+              <w:jc w:val="left"/>
+              <w:spacing w:before="200"/>
+              <w:pStyle w:val="ImageCaption"/>
+            </w:pPr>
+            <w:r>
+              <w:t xml:space="preserve">Figure 7</w:t>
+            </w:r>
+          </w:p>
+          <w:bookmarkEnd w:id="81"/>
+        </w:tc>
+      </w:tr>
+    </w:tbl>
+    <w:p>
+      <w:pPr>
+        <w:pStyle w:val="BodyText"/>
+      </w:pPr>
+      <w:r>
+        <w:t xml:space="preserve">Figure</w:t>
+      </w:r>
+      <w:r>
+        <w:t xml:space="preserve"> </w:t>
+      </w:r>
+      <w:hyperlink w:anchor="fig-participant-trajectories-1">
+        <w:r>
+          <w:rPr>
+            <w:rStyle w:val="Hyperlink"/>
+          </w:rPr>
+          <w:t xml:space="preserve">Figure 7</w:t>
+        </w:r>
+      </w:hyperlink>
+      <w:r>
+        <w:t xml:space="preserve"> </w:t>
+      </w:r>
+      <w:r>
+        <w:t xml:space="preserve">shows the participant-level predicted values. The ability to read glance directions in the control condition is fairly consistent below 10° across participants and is virtually unaffected by exposure times. There is moderate variation in overall accuracy.</w:t>
+      </w:r>
+    </w:p>
+    <w:p>
+      <w:pPr>
+        <w:pStyle w:val="BodyText"/>
+      </w:pPr>
+      <w:r>
+        <w:t xml:space="preserve">The disadvantage of Quadbright is fully consistent only at 70ms. In contrast, the ability to read Quadbright signals varies dramatically between participants and conditions. Even a group of super-performers exists (first six), where accuracy matches or even exceeds the control condition. This group is also characterized by an enormous difference between 70ms and 400ms, sometimes with an intermediate step at 140ms.</w:t>
+      </w:r>
+    </w:p>
+    <w:tbl>
+      <w:tblPr>
+        <w:tblStyle w:val="Table"/>
+        <w:tblW w:type="pct" w:w="5000"/>
+        <w:tblLayout w:type="fixed"/>
+        <w:tblLook w:firstRow="0" w:lastRow="0" w:firstColumn="0" w:lastColumn="0" w:noHBand="0" w:noVBand="0" w:val="0000"/>
+      </w:tblPr>
+      <w:tblGrid>
+        <w:gridCol w:w="7920"/>
+      </w:tblGrid>
+      <w:tr>
+        <w:tc>
+          <w:tcPr/>
+          <w:bookmarkStart w:id="86" w:name="fig-participant-trajectories"/>
+          <w:p>
+            <w:pPr>
+              <w:pStyle w:val="Compact"/>
+              <w:jc w:val="center"/>
+            </w:pPr>
+            <w:bookmarkStart w:id="85" w:name="fig-participant-trajectories"/>
+            <w:r>
+              <w:drawing>
+                <wp:inline>
+                  <wp:extent cx="5334000" cy="4000500"/>
+                  <wp:effectExtent b="0" l="0" r="0" t="0"/>
+                  <wp:docPr descr="" title="" id="83" name="Picture"/>
+                  <a:graphic>
+                    <a:graphicData uri="http://schemas.openxmlformats.org/drawingml/2006/picture">
+                      <pic:pic>
+                        <pic:nvPicPr>
+                          <pic:cNvPr descr="YET_CEHR_files/figure-docx/fig-participant-trajectories-1.png" id="84" name="Picture"/>
+                          <pic:cNvPicPr>
+                            <a:picLocks noChangeArrowheads="1" noChangeAspect="1"/>
+                          </pic:cNvPicPr>
+                        </pic:nvPicPr>
+                        <pic:blipFill>
+                          <a:blip r:embed="rId82"/>
                           <a:stretch>
                             <a:fillRect/>
                           </a:stretch>
@@ -3211,404 +3313,35 @@
                 </wp:inline>
               </w:drawing>
             </w:r>
-            <w:bookmarkEnd w:id="75"/>
+            <w:bookmarkEnd w:id="85"/>
           </w:p>
           <w:p>
             <w:pPr>
               <w:jc w:val="center"/>
             </w:pPr>
             <w:pPr>
-              <w:jc w:val="start"/>
+              <w:jc w:val="left"/>
               <w:spacing w:before="200"/>
               <w:pStyle w:val="ImageCaption"/>
             </w:pPr>
             <w:r>
-              <w:t xml:space="preserve">Figure 6</w:t>
+              <w:t xml:space="preserve">Figure 8</w:t>
             </w:r>
           </w:p>
-          <w:bookmarkEnd w:id="76"/>
+          <w:bookmarkEnd w:id="86"/>
         </w:tc>
       </w:tr>
     </w:tbl>
-    <w:p>
-      <w:pPr>
-        <w:pStyle w:val="BodyText"/>
-      </w:pPr>
-      <w:r>
-        <w:t xml:space="preserve">A related question is whether the population-level pattern is representative for all displayed eye directions on stimulus level.</w:t>
-      </w:r>
-      <w:r>
-        <w:t xml:space="preserve"> </w:t>
-      </w:r>
-      <w:hyperlink w:anchor="fig-stim-trajectories">
-        <w:r>
-          <w:rPr>
-            <w:rStyle w:val="Hyperlink"/>
-          </w:rPr>
-          <w:t xml:space="preserve">Figure 7</w:t>
-        </w:r>
-      </w:hyperlink>
-      <w:r>
-        <w:t xml:space="preserve"> </w:t>
-      </w:r>
-      <w:r>
-        <w:t xml:space="preserve">shows that this is not so.</w:t>
-      </w:r>
-    </w:p>
-    <w:tbl>
-      <w:tblPr>
-        <w:tblStyle w:val="Table"/>
-        <w:tblW w:type="pct" w:w="5000"/>
-        <w:tblLayout w:type="fixed"/>
-        <w:tblLook w:firstRow="0" w:lastRow="0" w:firstColumn="0" w:lastColumn="0" w:noHBand="0" w:noVBand="0" w:val="0000"/>
-      </w:tblPr>
-      <w:tblGrid>
-        <w:gridCol w:w="7920"/>
-      </w:tblGrid>
-      <w:tr>
-        <w:tc>
-          <w:tcPr/>
-          <w:bookmarkStart w:id="81" w:name="fig-stim-trajectories"/>
-          <w:p>
-            <w:pPr>
-              <w:pStyle w:val="Compact"/>
-              <w:jc w:val="center"/>
-            </w:pPr>
-            <w:bookmarkStart w:id="80" w:name="fig-stim-trajectories"/>
-            <w:r>
-              <w:drawing>
-                <wp:inline>
-                  <wp:extent cx="5334000" cy="4000500"/>
-                  <wp:effectExtent b="0" l="0" r="0" t="0"/>
-                  <wp:docPr descr="" title="" id="78" name="Picture"/>
-                  <a:graphic>
-                    <a:graphicData uri="http://schemas.openxmlformats.org/drawingml/2006/picture">
-                      <pic:pic>
-                        <pic:nvPicPr>
-                          <pic:cNvPr descr="YET_CEHR_files/figure-docx/fig-stim-trajectories-1.png" id="79" name="Picture"/>
-                          <pic:cNvPicPr>
-                            <a:picLocks noChangeArrowheads="1" noChangeAspect="1"/>
-                          </pic:cNvPicPr>
-                        </pic:nvPicPr>
-                        <pic:blipFill>
-                          <a:blip r:embed="rId77"/>
-                          <a:stretch>
-                            <a:fillRect/>
-                          </a:stretch>
-                        </pic:blipFill>
-                        <pic:spPr bwMode="auto">
-                          <a:xfrm>
-                            <a:off x="0" y="0"/>
-                            <a:ext cx="5334000" cy="4000500"/>
-                          </a:xfrm>
-                          <a:prstGeom prst="rect">
-                            <a:avLst/>
-                          </a:prstGeom>
-                          <a:noFill/>
-                          <a:ln w="9525">
-                            <a:noFill/>
-                            <a:headEnd/>
-                            <a:tailEnd/>
-                          </a:ln>
-                        </pic:spPr>
-                      </pic:pic>
-                    </a:graphicData>
-                  </a:graphic>
-                </wp:inline>
-              </w:drawing>
-            </w:r>
-            <w:bookmarkEnd w:id="80"/>
-          </w:p>
-          <w:p>
-            <w:pPr>
-              <w:jc w:val="center"/>
-            </w:pPr>
-            <w:pPr>
-              <w:jc w:val="start"/>
-              <w:spacing w:before="200"/>
-              <w:pStyle w:val="ImageCaption"/>
-            </w:pPr>
-            <w:r>
-              <w:t xml:space="preserve">Figure 7</w:t>
-            </w:r>
-          </w:p>
-          <w:bookmarkEnd w:id="81"/>
-        </w:tc>
-      </w:tr>
-    </w:tbl>
-    <w:bookmarkEnd w:id="82"/>
-    <w:bookmarkEnd w:id="83"/>
-    <w:bookmarkStart w:id="86" w:name="discussion"/>
-    <w:p>
-      <w:pPr>
-        <w:pStyle w:val="Heading2"/>
-      </w:pPr>
-      <w:r>
-        <w:t xml:space="preserve">Discussion</w:t>
-      </w:r>
-    </w:p>
-    <w:bookmarkStart w:id="84" w:name="evolution-of-the-effective-sender"/>
-    <w:p>
-      <w:pPr>
-        <w:pStyle w:val="Heading3"/>
-      </w:pPr>
-      <w:r>
-        <w:t xml:space="preserve">Evolution of the effective sender</w:t>
-      </w:r>
-    </w:p>
-    <w:p>
-      <w:pPr>
-        <w:pStyle w:val="FirstParagraph"/>
-      </w:pPr>
-      <w:r>
-        <w:t xml:space="preserve">The Cooperative Eye Theory implies that the eyeball is a very effective sender of glance direction signals, as simple receiver mechanisms are more likely to evolve. By construction of the most simple eye tracking device that can come to mind, we tried to establish a new limit on how effective the sender is.</w:t>
-      </w:r>
-    </w:p>
-    <w:p>
-      <w:pPr>
-        <w:pStyle w:val="BodyText"/>
-      </w:pPr>
-      <w:r>
-        <w:t xml:space="preserve">Overall, the Quadbright device showed very similar characteristics as human observers. Accuracy is in the same range as observed by</w:t>
-      </w:r>
-      <w:r>
-        <w:t xml:space="preserve"> </w:t>
-      </w:r>
-      <w:r>
-        <w:t xml:space="preserve">Gale &amp; Monk (2000)</w:t>
-      </w:r>
-      <w:r>
-        <w:t xml:space="preserve">, and the effect of eccentricity is also similar. In comparison with any other method of eye tracking the Quadbright device is extremely simple, with a 2x2 array of brightness sensors as input requirements.</w:t>
-      </w:r>
-    </w:p>
-    <w:p>
-      <w:pPr>
-        <w:pStyle w:val="BodyText"/>
-      </w:pPr>
-      <w:r>
-        <w:t xml:space="preserve">Quadbright is extremely efficient in memory consumption, as it works with four brightness levels, which makes a total of 4 byte in the input buffer. Computationally, Quadbright is extremely efficient, as it uses a linear model with only 12 parameters to calculate eye directions. By the method of minimizing the sum of squares, all calculations in the process have closed solutions, requiring no costly numerical approximations, recursions, or iterative procedures. From a biological perspective, every organism that can sense horizontal and vertical brightness changes, can evolve this function, or acquire it by learning.</w:t>
-      </w:r>
-    </w:p>
-    <w:p>
-      <w:pPr>
-        <w:pStyle w:val="BodyText"/>
-      </w:pPr>
-      <w:r>
-        <w:t xml:space="preserve">We may not forget here, that the spherical form of eye balls has evolved not for computational reasons, but for the physical requirements of creating a moving, variable-focus optical lens from a sack of pressurized liquid. The second salient cue of eyeballs is the dark iris, which adjusts the opening of the lens under varying light levels. Pigmentation in the iris seems to reduce stray light effects, where internal reflections reduce contrast levels</w:t>
-      </w:r>
-      <w:r>
-        <w:t xml:space="preserve"> </w:t>
-      </w:r>
-      <w:r>
-        <w:t xml:space="preserve">(Kruijt et al., 2011)</w:t>
-      </w:r>
-      <w:r>
-        <w:t xml:space="preserve">.</w:t>
-      </w:r>
-    </w:p>
-    <w:bookmarkEnd w:id="84"/>
-    <w:bookmarkStart w:id="85" w:name="evolution-of-the-receving-end"/>
-    <w:p>
-      <w:pPr>
-        <w:pStyle w:val="Heading3"/>
-      </w:pPr>
-      <w:r>
-        <w:t xml:space="preserve">Evolution of the receving end</w:t>
-      </w:r>
-    </w:p>
-    <w:p>
-      <w:pPr>
-        <w:pStyle w:val="FirstParagraph"/>
-      </w:pPr>
-      <w:r>
-        <w:t xml:space="preserve">The simplicity of the Quadbright device supports the idea of sclera camouflage as a default condition among apes, despite the metabolic effort. It is hardly conceivable that apex predators, and in particular big cats, would not evolve the ability to read the eyes of their prey.</w:t>
-      </w:r>
-      <w:r>
-        <w:t xml:space="preserve"> </w:t>
-      </w:r>
-      <w:r>
-        <w:t xml:space="preserve">This ability is not necessarily eye direction reading as observed in humans. Another scenario is that first evolved the ability to detect faces. Animals equipped with face detection and sufficiently large brains are likely to</w:t>
-      </w:r>
-      <w:r>
-        <w:t xml:space="preserve"> </w:t>
-      </w:r>
-      <w:r>
-        <w:rPr>
-          <w:i/>
-          <w:iCs/>
-        </w:rPr>
-        <w:t xml:space="preserve">learn by experience</w:t>
-      </w:r>
-      <w:r>
-        <w:t xml:space="preserve"> </w:t>
-      </w:r>
-      <w:r>
-        <w:t xml:space="preserve">that brightness changes in the eye region often precedes an escape.</w:t>
-      </w:r>
-    </w:p>
-    <w:p>
-      <w:pPr>
-        <w:pStyle w:val="BodyText"/>
-      </w:pPr>
-      <w:r>
-        <w:t xml:space="preserve">Is the Quadbright algorithm equivalent with human glance reading? Is input organized as an image of four areas and the visual system performs a series of simple linear equations? If Quadbright is a good model of human glance perception, then all humans should be able to read glance directions from brightness four grey areas.</w:t>
-      </w:r>
-      <w:r>
-        <w:t xml:space="preserve"> </w:t>
-      </w:r>
-      <w:r>
-        <w:t xml:space="preserve">Our second study showed that Quadbright degradation led to a strong overall decline in reading performance. Quadbright is definitely not the mechanism that drives modern human eye direction reading.</w:t>
-      </w:r>
-    </w:p>
-    <w:p>
-      <w:pPr>
-        <w:pStyle w:val="BodyText"/>
-      </w:pPr>
-      <w:r>
-        <w:t xml:space="preserve">While most participants were less accurate with degraded images, the majority of the participants was still much beyond guessing. Crucially, the Quadbright degradation makes it almost impossible for any mechanism that goes beyond brightness gradients, such as edge detection. We can conclude that a minimum of two processing modes for eye direction reading exists. The first one is based on brightness gradients with moderate accuracy, and the second one extracts higher-level features for high accuracy.</w:t>
-      </w:r>
-    </w:p>
-    <w:p>
-      <w:pPr>
-        <w:pStyle w:val="BodyText"/>
-      </w:pPr>
-      <w:r>
-        <w:t xml:space="preserve">A multiple receiver model has been proposed by</w:t>
-      </w:r>
-      <w:r>
-        <w:t xml:space="preserve"> </w:t>
-      </w:r>
-      <w:r>
-        <w:t xml:space="preserve">Anderson et al. (2016)</w:t>
-      </w:r>
-      <w:r>
-        <w:t xml:space="preserve">, who argue that there may be different mechanisms for precise gaze triangulation and coarse judgement of direction. By using a contrast reversal manipulation they showed that the first depends on geometric cues, whereas the second depends on luminance and motion cues.</w:t>
-      </w:r>
-    </w:p>
-    <w:p>
-      <w:pPr>
-        <w:pStyle w:val="BodyText"/>
-      </w:pPr>
-      <w:r>
-        <w:t xml:space="preserve">The multiple receiver model is also inline with the evolutionary process where a rudimentary cue receiver paves the way for the co-evolution of signals and more advanced receivers. Brightness gradient processing is not only a good candidate for such a proto-receiver, and there is no reason why this ability should vanish, especially when it still fulfills functions that the more advanced receiver cannot, such as long distance reading and peripheral change detection.</w:t>
-      </w:r>
-    </w:p>
-    <w:p>
-      <w:pPr>
-        <w:pStyle w:val="BodyText"/>
-      </w:pPr>
-      <w:r>
-        <w:t xml:space="preserve">Interestingly, some participants were not affected by the Quadbright image reduction and by tendency even performed better on a good level. This has two possible explanations: One is that Quadbright processing can be learned, and these individuals somehow have acquired this skill prior to the experiment. Under the multiple receiver hypothesis one can also speculate that these individuals do not possess the foveal receiver, but learned to compensate almost fully using brightness processing.</w:t>
-      </w:r>
-    </w:p>
-    <w:p>
-      <w:pPr>
-        <w:pStyle w:val="BodyText"/>
-      </w:pPr>
-      <w:r>
-        <w:t xml:space="preserve">When</w:t>
-      </w:r>
-      <w:r>
-        <w:t xml:space="preserve"> </w:t>
-      </w:r>
-      <w:r>
-        <w:t xml:space="preserve">Baron-Cohen (1995)</w:t>
-      </w:r>
-      <w:r>
-        <w:t xml:space="preserve"> </w:t>
-      </w:r>
-      <w:r>
-        <w:t xml:space="preserve">postulated an EDD, he argued that gaze reading is not just a utilitarian function for shared attention, but a primary cue for Theory-of-Mind (TM), i.e. the ability to attribute mental states to others.</w:t>
-      </w:r>
-      <w:r>
-        <w:t xml:space="preserve"> </w:t>
-      </w:r>
-      <w:r>
-        <w:t xml:space="preserve">Baron-Cohen (2000)</w:t>
-      </w:r>
-      <w:r>
-        <w:t xml:space="preserve"> </w:t>
-      </w:r>
-      <w:r>
-        <w:t xml:space="preserve">proposes a connection between autism spectrum disorders and a dysfunctional TM. If the lack of an EDD is part of this dysfunction, then we would expect diagnosed participant to show equal performance in the conditions of our experiment.</w:t>
-      </w:r>
-    </w:p>
-    <w:bookmarkEnd w:id="85"/>
-    <w:bookmarkEnd w:id="86"/>
-    <w:bookmarkStart w:id="88" w:name="limitations"/>
-    <w:p>
-      <w:pPr>
-        <w:pStyle w:val="Heading2"/>
-      </w:pPr>
-      <w:r>
-        <w:t xml:space="preserve">Limitations</w:t>
-      </w:r>
-    </w:p>
-    <w:bookmarkStart w:id="87" w:name="future-research"/>
-    <w:p>
-      <w:pPr>
-        <w:pStyle w:val="Heading3"/>
-      </w:pPr>
-      <w:r>
-        <w:t xml:space="preserve">Future research</w:t>
-      </w:r>
-    </w:p>
-    <w:p>
-      <w:pPr>
-        <w:pStyle w:val="FirstParagraph"/>
-      </w:pPr>
-      <w:r>
-        <w:t xml:space="preserve">Speculating about how receiver mechanisms evolved, and how many there exist is fascinating, but much more research needs to be conducted to make good for the fact that you cannot truly experiment with evolution. The eye tracking device, we developed, can be used to emulate other algorithms, for example using more fine-grained brightness distributions (</w:t>
-      </w:r>
-      <w:r>
-        <w:t xml:space="preserve">“Hexabright”</w:t>
-      </w:r>
-      <w:r>
-        <w:t xml:space="preserve">) or processing geometric cues.</w:t>
-      </w:r>
-    </w:p>
-    <w:p>
-      <w:pPr>
-        <w:pStyle w:val="BodyText"/>
-      </w:pPr>
-      <w:r>
-        <w:t xml:space="preserve">The dominant effect of the Quadbright manipulation is how differently it acts on individuals. The divide spans two magnitudes and must therefore have correlates in everyday performance. We would expect that performance in the Quadbright condition is correlated with the ability to read glances under poor conditions, for example with peripheral viewing or when the sender is wearing glasses.</w:t>
-      </w:r>
-    </w:p>
-    <w:p>
-      <w:pPr>
-        <w:pStyle w:val="BodyText"/>
-      </w:pPr>
-      <w:r>
-        <w:t xml:space="preserve">Studying how eye direction cues establish shared attention also has impact in at least two modern fields of application. One open problem in transport is how automated vehicles can effectively communicate attention and intentions with human traffic members. For example, making eye contact is often observed in communication between drivers and street-crossing pedestrians. External human-machine interfaces (e-HMI) have been tested for communication on the outside of cars, using text, icons and facial expressions. Understanding the role and processing modes of eye direction reading can be used to design more efficient signals.</w:t>
-      </w:r>
-    </w:p>
-    <w:p>
-      <w:pPr>
-        <w:pStyle w:val="BodyText"/>
-      </w:pPr>
-      <w:r>
-        <w:t xml:space="preserve">Another field of application is the design of artificial faces. In social robotics, robot faces are often designed to be expressive, and the role of glance reading in human-robot interaction is well established. However, designing more human-like eye regions for this purpose may result in an adverse effect known as the Uncanny Valley. Artificial faces that are too human-like, but not quite right, are perceived as creepy. The results of this study suggest that degraded eye regions can convey glance directions, which could facilitate the quality of interaction, without falling into the Uncanny Valley.</w:t>
-      </w:r>
-    </w:p>
-    <w:p>
-      <w:pPr>
-        <w:pStyle w:val="BodyText"/>
-      </w:pPr>
-      <w:r>
-        <w:t xml:space="preserve">Finally, the eye tracker we build to test our ideas about the receiving end has already been used extensively for bachelor-level student projects. With some refinement it could deliver sufficient accuracy for many psychological experiments and applied research studies, with the added benefit of being much easier to replicate for everyone than with using commercial eye tracking devices.</w:t>
-      </w:r>
-    </w:p>
     <w:bookmarkEnd w:id="87"/>
     <w:bookmarkEnd w:id="88"/>
     <w:bookmarkEnd w:id="89"/>
-    <w:bookmarkStart w:id="90" w:name="conclusion-1"/>
+    <w:bookmarkStart w:id="95" w:name="discussion"/>
     <w:p>
       <w:pPr>
         <w:pStyle w:val="Heading1"/>
       </w:pPr>
       <w:r>
-        <w:t xml:space="preserve">Conclusion</w:t>
+        <w:t xml:space="preserve">Discussion</w:t>
       </w:r>
     </w:p>
     <w:p>
@@ -3616,27 +3349,326 @@
         <w:pStyle w:val="FirstParagraph"/>
       </w:pPr>
       <w:r>
-        <w:t xml:space="preserve">The Cooperative Eye Hypothesis implies that eyes with a visible white sclera is sending exceptionally clear signals about gaze directions. While previous research made this assumption based on face validity, the successful implementation of the simplistic eye tracking algorithm supports this idea. By showing that humans can read glance directions under Quadbright conditions, but with reduced accuracy, lends support for multi-receiver theories, as well as the cue-before-signal theory of evolutionary origins.</w:t>
+        <w:t xml:space="preserve">The aim of the studies were to understand better how the signal-receiver system of glance direction reading in humans evolved. We approached this from two sides: First, we tested by construction of the Quadbright device how simple a receiver can be, which has consequences for how it co-evolved with sclera depigmentation. Second, we tested whether human observers possess a mininal receiver similar to Quadbright, or whether a more specialized mechanism exists.</w:t>
+      </w:r>
+    </w:p>
+    <w:p>
+      <w:pPr>
+        <w:pStyle w:val="BodyText"/>
+      </w:pPr>
+      <w:r>
+        <w:t xml:space="preserve">The first study aimed at testing the signal efficiency of depigmented eyeballs, as this . The level of accuracy reached with a simple prototype was ample to provide selection pressure under the Cooperative Eye Hypothesis. We will discuss that in more detail.</w:t>
+      </w:r>
+    </w:p>
+    <w:p>
+      <w:pPr>
+        <w:pStyle w:val="BodyText"/>
+      </w:pPr>
+      <w:r>
+        <w:t xml:space="preserve">The high accuracy even made us wonder whether the receiver in modern humans is similar to a Quadbright device, which gave rise to the second experiment.</w:t>
+      </w:r>
+      <w:r>
+        <w:t xml:space="preserve"> </w:t>
+      </w:r>
+      <w:r>
+        <w:t xml:space="preserve">The results of the second experiment clearly show that this is not the case. Another receiver clearly exists, which is quite accurate, makes use of more advanced visual features, is extremely fast and varies little between participants.</w:t>
+      </w:r>
+      <w:r>
+        <w:t xml:space="preserve"> </w:t>
+      </w:r>
+      <w:r>
+        <w:t xml:space="preserve">However, participants were still able to extract Quadbright glance directions at a lower accuracy most of the time. This mechanism requires longer exposure and varies dramatically between individuals.</w:t>
+      </w:r>
+    </w:p>
+    <w:p>
+      <w:pPr>
+        <w:pStyle w:val="BodyText"/>
+      </w:pPr>
+      <w:r>
+        <w:t xml:space="preserve">For theory-forming an important issue to discuss is whether observations in the Quadbright condition justify to speak of a secondary receiver, which operates on brightness levels and could be the progenitor mechanism according to the Cue-before-signal principle.</w:t>
+      </w:r>
+    </w:p>
+    <w:bookmarkStart w:id="90" w:name="the-effective-sender"/>
+    <w:p>
+      <w:pPr>
+        <w:pStyle w:val="Heading2"/>
+      </w:pPr>
+      <w:r>
+        <w:t xml:space="preserve">The effective sender</w:t>
+      </w:r>
+    </w:p>
+    <w:p>
+      <w:pPr>
+        <w:pStyle w:val="FirstParagraph"/>
+      </w:pPr>
+      <w:r>
+        <w:t xml:space="preserve">The Cooperative Eye Theory implies that the eyeball is a very effective sender of glance direction signals for two reasons: first, sclera camouflage as a defensive feature can only stabilize as a new feature when there is a detection mechanism to protect against, which again implies a sender. Second, a receiver for cooperative means is more likely to pre-exist or co-evolve, when it is simple.</w:t>
+      </w:r>
+    </w:p>
+    <w:p>
+      <w:pPr>
+        <w:pStyle w:val="BodyText"/>
+      </w:pPr>
+      <w:r>
+        <w:t xml:space="preserve">Overall, the Quadbright device showed good accuracy, in the same range as human observers</w:t>
+      </w:r>
+      <w:r>
+        <w:t xml:space="preserve"> </w:t>
+      </w:r>
+      <w:r>
+        <w:t xml:space="preserve">(Gale &amp; Monk, 2000)</w:t>
+      </w:r>
+      <w:r>
+        <w:t xml:space="preserve">.</w:t>
+      </w:r>
+      <w:r>
+        <w:t xml:space="preserve"> </w:t>
+      </w:r>
+      <w:r>
+        <w:t xml:space="preserve">A linear decoder—mathematically equivalent to linear regression—operates in</w:t>
+      </w:r>
+      <w:r>
+        <w:t xml:space="preserve"> </w:t>
+      </w:r>
+      <m:oMath>
+        <m:r>
+          <m:t>O</m:t>
+        </m:r>
+        <m:d>
+          <m:dPr>
+            <m:begChr m:val="("/>
+            <m:sepChr m:val=""/>
+            <m:endChr m:val=")"/>
+            <m:grow/>
+          </m:dPr>
+          <m:e>
+            <m:r>
+              <m:t>d</m:t>
+            </m:r>
+          </m:e>
+        </m:d>
+      </m:oMath>
+      <w:r>
+        <w:t xml:space="preserve"> </w:t>
+      </w:r>
+      <w:r>
+        <w:t xml:space="preserve">parameter space and performs inference in</w:t>
+      </w:r>
+      <w:r>
+        <w:t xml:space="preserve"> </w:t>
+      </w:r>
+      <m:oMath>
+        <m:r>
+          <m:t>O</m:t>
+        </m:r>
+        <m:d>
+          <m:dPr>
+            <m:begChr m:val="("/>
+            <m:sepChr m:val=""/>
+            <m:endChr m:val=")"/>
+            <m:grow/>
+          </m:dPr>
+          <m:e>
+            <m:r>
+              <m:t>d</m:t>
+            </m:r>
+          </m:e>
+        </m:d>
+      </m:oMath>
+      <w:r>
+        <w:t xml:space="preserve"> </w:t>
+      </w:r>
+      <w:r>
+        <w:t xml:space="preserve">time, making it one of the simplest possible mappings from sensory input to behavioral output.</w:t>
+      </w:r>
+    </w:p>
+    <w:p>
+      <w:pPr>
+        <w:pStyle w:val="BodyText"/>
+      </w:pPr>
+      <w:r>
+        <w:t xml:space="preserve">In contrast, signals whose discrimination requires multilayer, nonlinear decoders—such as those analogous to neural networks impose far greater metabolic, developmental, and evolutionary demands on receivers. This difference parallels well-established biological patterns: primitive photoreceptive organisms already exploit brightness gradients and coarse contrast edges as their primary visual features (</w:t>
+      </w:r>
+      <w:r>
+        <w:t xml:space="preserve">(</w:t>
+      </w:r>
+      <w:r>
+        <w:rPr>
+          <w:b/>
+          <w:bCs/>
+        </w:rPr>
+        <w:t xml:space="preserve">AnimalEyes?</w:t>
+      </w:r>
+      <w:r>
+        <w:t xml:space="preserve">)</w:t>
+      </w:r>
+      <w:r>
+        <w:t xml:space="preserve">, ch. 2), whereas predators and prey locked in visual arms races often evolve complex, fractal, or high-spatial-frequency patterns that require increasingly sophisticated detection mechanisms (</w:t>
+      </w:r>
+      <w:r>
+        <w:t xml:space="preserve">(</w:t>
+      </w:r>
+      <w:r>
+        <w:rPr>
+          <w:b/>
+          <w:bCs/>
+        </w:rPr>
+        <w:t xml:space="preserve">Stevens2009?</w:t>
+      </w:r>
+      <w:r>
+        <w:t xml:space="preserve">)</w:t>
+      </w:r>
+      <w:r>
+        <w:t xml:space="preserve">).</w:t>
+      </w:r>
+    </w:p>
+    <w:p>
+      <w:pPr>
+        <w:pStyle w:val="BodyText"/>
+      </w:pPr>
+      <w:r>
+        <w:t xml:space="preserve">It is important to note that the white sclera never evolved as a signal in vertebrates, but as a protection layer around the lense. Only, when the first vertebrates appeared on land, the sclera evolved into a ball, accommodating for the higher refractive index on the cornea-air surface</w:t>
+      </w:r>
+      <w:r>
+        <w:t xml:space="preserve"> </w:t>
+      </w:r>
+      <w:r>
+        <w:t xml:space="preserve">(</w:t>
+      </w:r>
+      <w:r>
+        <w:rPr>
+          <w:b/>
+          <w:bCs/>
+        </w:rPr>
+        <w:t xml:space="preserve">AnimalEyes?</w:t>
+      </w:r>
+      <w:r>
+        <w:t xml:space="preserve">, ch. 9)</w:t>
+      </w:r>
+      <w:r>
+        <w:t xml:space="preserve">. The second defining feature, the dark iris and pupil have likewise evolved for biophysical reasons, as a variable aperture to adjust the incoming light intensity to the dynamic range of the retina</w:t>
+      </w:r>
+      <w:r>
+        <w:t xml:space="preserve"> </w:t>
+      </w:r>
+      <w:r>
+        <w:t xml:space="preserve">(Kruijt et al., 2011)</w:t>
+      </w:r>
+      <w:r>
+        <w:t xml:space="preserve">.</w:t>
+      </w:r>
+    </w:p>
+    <w:p>
+      <w:pPr>
+        <w:pStyle w:val="BodyText"/>
+      </w:pPr>
+      <w:r>
+        <w:t xml:space="preserve">Still, other features of the human eye morphology may have co-evolved with the receiver mechanism. From a computational perspective, it is surprising that the human eyeball produces highly linear gradients, as spinning spherical objects generally produce sinusoidal signals. It is possible that other features have evolved to improve the linearity of the response, such as the high ratio of exposed sclera</w:t>
+      </w:r>
+      <w:r>
+        <w:t xml:space="preserve"> </w:t>
+      </w:r>
+      <w:r>
+        <w:t xml:space="preserve">(Kobayashi &amp; Kohshima, 2001)</w:t>
+      </w:r>
+      <w:r>
+        <w:t xml:space="preserve"> </w:t>
+      </w:r>
+      <w:r>
+        <w:t xml:space="preserve">or the shape of the eye lids. A testable consequence of this idea is that Quadbright devices are less effective for eye direction reading on other primate species, supposed they had a white sclera.</w:t>
       </w:r>
     </w:p>
     <w:bookmarkEnd w:id="90"/>
-    <w:bookmarkStart w:id="157" w:name="references"/>
-    <w:p>
-      <w:pPr>
-        <w:pStyle w:val="Heading1"/>
-      </w:pPr>
-      <w:r>
-        <w:t xml:space="preserve">References</w:t>
-      </w:r>
-    </w:p>
-    <w:bookmarkStart w:id="156" w:name="refs"/>
-    <w:bookmarkStart w:id="92" w:name="ref-Anderson2016"/>
-    <w:p>
-      <w:pPr>
-        <w:pStyle w:val="Bibliography"/>
-      </w:pPr>
-      <w:r>
-        <w:t xml:space="preserve">Anderson, N. C., Risko, E. F., &amp; Kingstone, A. (2016). Motion influences gaze direction discrimination and disambiguates contradictory luminance cues.</w:t>
+    <w:bookmarkStart w:id="91" w:name="evolution-of-the-receving-end"/>
+    <w:p>
+      <w:pPr>
+        <w:pStyle w:val="Heading2"/>
+      </w:pPr>
+      <w:r>
+        <w:t xml:space="preserve">Evolution of the receving end</w:t>
+      </w:r>
+    </w:p>
+    <w:p>
+      <w:pPr>
+        <w:pStyle w:val="FirstParagraph"/>
+      </w:pPr>
+      <w:r>
+        <w:t xml:space="preserve">By construction we have shown that a simple linear decoder suffices to read glance directions from depigmented eyeballs with astonishing accuracy.</w:t>
+      </w:r>
+      <w:r>
+        <w:t xml:space="preserve"> </w:t>
+      </w:r>
+      <w:r>
+        <w:t xml:space="preserve">This supports the idea that a primitive receiver could have existed prior to the evolution of white sclera. However, our results clearly show that human eyeball reading is is not a Quadbright device. A more complex receiver exists, which is extremely fast and accurate.</w:t>
+      </w:r>
+    </w:p>
+    <w:p>
+      <w:pPr>
+        <w:pStyle w:val="BodyText"/>
+      </w:pPr>
+      <w:r>
+        <w:t xml:space="preserve">While most participants were less accurate with degraded images, the majority of the participants was still much beyond guessing. Importantly, in the Quadbright condition, the rigorous data compression forbids any more advanced receiver gradients to reliably process images. We can assume that performance in the Quadbright condition relies solely on brightness differences.</w:t>
+      </w:r>
+    </w:p>
+    <w:p>
+      <w:pPr>
+        <w:pStyle w:val="BodyText"/>
+      </w:pPr>
+      <w:r>
+        <w:t xml:space="preserve">We can therefore conclude that a minimum of two receivers exist for eye direction reading. The first one is based on brightness gradients with moderate accuracy, and the second one extracts higher-level features for high accuracy. This idea is inline with a evolutionary process where a rudimentary cue receiver paves the way for the co-evolution of a signal and more advanced receiver. Usually, one would assume that the more advanced receiver evolves from primitive mechanism, effectively replacing it. Here it could be that the primitive receiver is still present, albeit with stark individual performance differences.</w:t>
+      </w:r>
+    </w:p>
+    <w:p>
+      <w:pPr>
+        <w:pStyle w:val="BodyText"/>
+      </w:pPr>
+      <w:r>
+        <w:t xml:space="preserve">If the Quadbright receiver existed prior to the de-pigmentation event and was just acquiring another function, there is no reason it should vanish when being replaced by the follower. A stronger theory is that both receivers co-exist, as they provide different functions. This has previously been proposed by</w:t>
+      </w:r>
+      <w:r>
+        <w:t xml:space="preserve"> </w:t>
+      </w:r>
+      <w:r>
+        <w:t xml:space="preserve">Anderson et al. (2016)</w:t>
+      </w:r>
+      <w:r>
+        <w:t xml:space="preserve">, who argue that there may be different mechanisms for precise gaze triangulation and coarse judgement of direction. By using a contrast reversal manipulation they showed that the first depends on geometric cues, whereas the second depends on luminance and motion cues.</w:t>
+      </w:r>
+    </w:p>
+    <w:p>
+      <w:pPr>
+        <w:pStyle w:val="BodyText"/>
+      </w:pPr>
+      <w:r>
+        <w:t xml:space="preserve">[ventral vs dorsal processing]</w:t>
+      </w:r>
+    </w:p>
+    <w:bookmarkEnd w:id="91"/>
+    <w:bookmarkStart w:id="92" w:name="limitations"/>
+    <w:p>
+      <w:pPr>
+        <w:pStyle w:val="Heading2"/>
+      </w:pPr>
+      <w:r>
+        <w:t xml:space="preserve">Limitations</w:t>
+      </w:r>
+    </w:p>
+    <w:bookmarkEnd w:id="92"/>
+    <w:bookmarkStart w:id="93" w:name="future-research"/>
+    <w:p>
+      <w:pPr>
+        <w:pStyle w:val="Heading2"/>
+      </w:pPr>
+      <w:r>
+        <w:t xml:space="preserve">Future research</w:t>
+      </w:r>
+    </w:p>
+    <w:p>
+      <w:pPr>
+        <w:pStyle w:val="FirstParagraph"/>
+      </w:pPr>
+      <w:r>
+        <w:t xml:space="preserve">Speculating about how receiver mechanisms evolved, and how many there exist is fascinating, but more research needs to be conducted to make good for the fact that we cannot truly experiment with evolution in this case. Still, there are testable hypotheses that can be derived from the current results. In particular, we can make specific predictions about the alleged pregenitor receiver. It may have provided two fitness advantages: providing coarse direction signals in the peripheral field or over a distance, or signalling</w:t>
       </w:r>
       <w:r>
         <w:t xml:space="preserve"> </w:t>
@@ -3646,10 +3678,76 @@
           <w:i/>
           <w:iCs/>
         </w:rPr>
-        <w:t xml:space="preserve">Psychonomic Bulletin and Review</w:t>
-      </w:r>
-      <w:r>
-        <w:t xml:space="preserve">,</w:t>
+        <w:t xml:space="preserve">change</w:t>
+      </w:r>
+      <w:r>
+        <w:t xml:space="preserve"> </w:t>
+      </w:r>
+      <w:r>
+        <w:t xml:space="preserve">of glance direction. Both capabilities can be tested experimentally.</w:t>
+      </w:r>
+    </w:p>
+    <w:p>
+      <w:pPr>
+        <w:pStyle w:val="BodyText"/>
+      </w:pPr>
+      <w:r>
+        <w:t xml:space="preserve">Studying how eye direction cues establish shared attention also has impact in at least two modern fields of application. One open problem in transport is how automated vehicles can effectively communicate attention and intentions with human traffic members. For example, making eye contact is often observed in communication between drivers and street-crossing pedestrians. External human-machine interfaces (e-HMI) have been tested for communication on the outside of cars, using text, icons and facial expressions. Understanding the role and processing modes of eye direction reading can be used to design more efficient signals.</w:t>
+      </w:r>
+    </w:p>
+    <w:p>
+      <w:pPr>
+        <w:pStyle w:val="BodyText"/>
+      </w:pPr>
+      <w:r>
+        <w:t xml:space="preserve">Another field of application is the design of artificial faces. In social robotics, robot faces are often designed to be expressive, and the role of glance reading in human-robot interaction is well established. However, designing more human-like eye regions for this purpose may result in an adverse effect known as the Uncanny Valley. Artificial faces that are too human-like, but not quite right, are perceived as creepy. The results of this study suggest that degraded eye regions can convey glance directions, which could facilitate the quality of interaction, without falling into the Uncanny Valley.</w:t>
+      </w:r>
+    </w:p>
+    <w:p>
+      <w:pPr>
+        <w:pStyle w:val="BodyText"/>
+      </w:pPr>
+      <w:r>
+        <w:t xml:space="preserve">Finally, the eye tracker we build to test our ideas about the receiving end has already been used extensively for bachelor-level student projects. With some refinement it could deliver sufficient accuracy for many psychological experiments and applied research studies, with the added benefit of being much easier to replicate for everyone than with using commercial eye tracking devices.</w:t>
+      </w:r>
+    </w:p>
+    <w:bookmarkEnd w:id="93"/>
+    <w:bookmarkStart w:id="94" w:name="conclusion-1"/>
+    <w:p>
+      <w:pPr>
+        <w:pStyle w:val="Heading2"/>
+      </w:pPr>
+      <w:r>
+        <w:t xml:space="preserve">Conclusion</w:t>
+      </w:r>
+    </w:p>
+    <w:p>
+      <w:pPr>
+        <w:pStyle w:val="FirstParagraph"/>
+      </w:pPr>
+      <w:r>
+        <w:t xml:space="preserve">The Cooperative Eye Hypothesis implies that eyes with a visible white sclera is sending exceptionally clear signals about gaze directions. While previous research made this assumption based on face validity, the successful implementation of the simplistic eye tracking algorithm supports this idea. By showing that humans can read glance directions under Quadbright conditions, but with reduced accuracy, lends support for multi-receiver theories, as well as the cue-before-signal theory of evolutionary origins.</w:t>
+      </w:r>
+    </w:p>
+    <w:bookmarkEnd w:id="94"/>
+    <w:bookmarkEnd w:id="95"/>
+    <w:bookmarkStart w:id="160" w:name="references"/>
+    <w:p>
+      <w:pPr>
+        <w:pStyle w:val="Heading1"/>
+      </w:pPr>
+      <w:r>
+        <w:t xml:space="preserve">References</w:t>
+      </w:r>
+    </w:p>
+    <w:bookmarkStart w:id="159" w:name="refs"/>
+    <w:bookmarkStart w:id="97" w:name="ref-Anderson2016"/>
+    <w:p>
+      <w:pPr>
+        <w:pStyle w:val="Bibliography"/>
+      </w:pPr>
+      <w:r>
+        <w:t xml:space="preserve">Anderson, N. C., Risko, E. F., &amp; Kingstone, A. (2016). Motion influences gaze direction discrimination and disambiguates contradictory luminance cues.</w:t>
       </w:r>
       <w:r>
         <w:t xml:space="preserve"> </w:t>
@@ -3659,6 +3757,19 @@
           <w:i/>
           <w:iCs/>
         </w:rPr>
+        <w:t xml:space="preserve">Psychonomic Bulletin and Review</w:t>
+      </w:r>
+      <w:r>
+        <w:t xml:space="preserve">,</w:t>
+      </w:r>
+      <w:r>
+        <w:t xml:space="preserve"> </w:t>
+      </w:r>
+      <w:r>
+        <w:rPr>
+          <w:i/>
+          <w:iCs/>
+        </w:rPr>
         <w:t xml:space="preserve">23</w:t>
       </w:r>
       <w:r>
@@ -3667,7 +3778,7 @@
       <w:r>
         <w:t xml:space="preserve"> </w:t>
       </w:r>
-      <w:hyperlink r:id="rId91">
+      <w:hyperlink r:id="rId96">
         <w:r>
           <w:rPr>
             <w:rStyle w:val="Hyperlink"/>
@@ -3676,8 +3787,8 @@
         </w:r>
       </w:hyperlink>
     </w:p>
-    <w:bookmarkEnd w:id="92"/>
-    <w:bookmarkStart w:id="94" w:name="ref-Babinet2021"/>
+    <w:bookmarkEnd w:id="97"/>
+    <w:bookmarkStart w:id="99" w:name="ref-Babinet2021"/>
     <w:p>
       <w:pPr>
         <w:pStyle w:val="Bibliography"/>
@@ -3714,7 +3825,7 @@
       <w:r>
         <w:t xml:space="preserve"> </w:t>
       </w:r>
-      <w:hyperlink r:id="rId93">
+      <w:hyperlink r:id="rId98">
         <w:r>
           <w:rPr>
             <w:rStyle w:val="Hyperlink"/>
@@ -3723,8 +3834,8 @@
         </w:r>
       </w:hyperlink>
     </w:p>
-    <w:bookmarkEnd w:id="94"/>
-    <w:bookmarkStart w:id="96" w:name="ref-Bakker2022"/>
+    <w:bookmarkEnd w:id="99"/>
+    <w:bookmarkStart w:id="101" w:name="ref-Bakker2022"/>
     <w:p>
       <w:pPr>
         <w:pStyle w:val="Bibliography"/>
@@ -3751,7 +3862,7 @@
       <w:r>
         <w:t xml:space="preserve"> </w:t>
       </w:r>
-      <w:hyperlink r:id="rId95">
+      <w:hyperlink r:id="rId100">
         <w:r>
           <w:rPr>
             <w:rStyle w:val="Hyperlink"/>
@@ -3760,8 +3871,8 @@
         </w:r>
       </w:hyperlink>
     </w:p>
-    <w:bookmarkEnd w:id="96"/>
-    <w:bookmarkStart w:id="98" w:name="ref-BARONCOHEN1995"/>
+    <w:bookmarkEnd w:id="101"/>
+    <w:bookmarkStart w:id="103" w:name="ref-BARONCOHEN1995"/>
     <w:p>
       <w:pPr>
         <w:pStyle w:val="Bibliography"/>
@@ -3785,7 +3896,7 @@
       <w:r>
         <w:t xml:space="preserve"> </w:t>
       </w:r>
-      <w:hyperlink r:id="rId97">
+      <w:hyperlink r:id="rId102">
         <w:r>
           <w:rPr>
             <w:rStyle w:val="Hyperlink"/>
@@ -3794,14 +3905,14 @@
         </w:r>
       </w:hyperlink>
     </w:p>
-    <w:bookmarkEnd w:id="98"/>
-    <w:bookmarkStart w:id="100" w:name="ref-BaronCohen2000"/>
+    <w:bookmarkEnd w:id="103"/>
+    <w:bookmarkStart w:id="105" w:name="ref-Bender2024"/>
     <w:p>
       <w:pPr>
         <w:pStyle w:val="Bibliography"/>
       </w:pPr>
       <w:r>
-        <w:t xml:space="preserve">Baron-Cohen, S. (2000). Theory of mind and autism: A review.</w:t>
+        <w:t xml:space="preserve">Bender, F. R., &amp; Schmettow, M. (2024).</w:t>
       </w:r>
       <w:r>
         <w:t xml:space="preserve"> </w:t>
@@ -3811,53 +3922,6 @@
           <w:i/>
           <w:iCs/>
         </w:rPr>
-        <w:t xml:space="preserve">International Review of Research in Mental Retardation</w:t>
-      </w:r>
-      <w:r>
-        <w:t xml:space="preserve">,</w:t>
-      </w:r>
-      <w:r>
-        <w:t xml:space="preserve"> </w:t>
-      </w:r>
-      <w:r>
-        <w:rPr>
-          <w:i/>
-          <w:iCs/>
-        </w:rPr>
-        <w:t xml:space="preserve">23</w:t>
-      </w:r>
-      <w:r>
-        <w:t xml:space="preserve">, 169–184.</w:t>
-      </w:r>
-      <w:r>
-        <w:t xml:space="preserve"> </w:t>
-      </w:r>
-      <w:hyperlink r:id="rId99">
-        <w:r>
-          <w:rPr>
-            <w:rStyle w:val="Hyperlink"/>
-          </w:rPr>
-          <w:t xml:space="preserve">https://doi.org/10.1016/S0074-7750(00)80010-5</w:t>
-        </w:r>
-      </w:hyperlink>
-    </w:p>
-    <w:bookmarkEnd w:id="100"/>
-    <w:bookmarkStart w:id="102" w:name="ref-Bender2024"/>
-    <w:p>
-      <w:pPr>
-        <w:pStyle w:val="Bibliography"/>
-      </w:pPr>
-      <w:r>
-        <w:t xml:space="preserve">Bender, F. R., &amp; Schmettow, M. (2024).</w:t>
-      </w:r>
-      <w:r>
-        <w:t xml:space="preserve"> </w:t>
-      </w:r>
-      <w:r>
-        <w:rPr>
-          <w:i/>
-          <w:iCs/>
-        </w:rPr>
         <w:t xml:space="preserve">Evaluaton of the low budget do it yourself eye tracking system: Your eye tracker (YET) human factors and engineering psychology</w:t>
       </w:r>
       <w:r>
@@ -3869,7 +3933,7 @@
       <w:r>
         <w:t xml:space="preserve"> </w:t>
       </w:r>
-      <w:hyperlink r:id="rId101">
+      <w:hyperlink r:id="rId104">
         <w:r>
           <w:rPr>
             <w:rStyle w:val="Hyperlink"/>
@@ -3878,8 +3942,8 @@
         </w:r>
       </w:hyperlink>
     </w:p>
-    <w:bookmarkEnd w:id="102"/>
-    <w:bookmarkStart w:id="103" w:name="ref-opencv-library"/>
+    <w:bookmarkEnd w:id="105"/>
+    <w:bookmarkStart w:id="106" w:name="ref-opencv-library"/>
     <w:p>
       <w:pPr>
         <w:pStyle w:val="Bibliography"/>
@@ -3910,8 +3974,8 @@
         <w:t xml:space="preserve">.</w:t>
       </w:r>
     </w:p>
-    <w:bookmarkEnd w:id="103"/>
-    <w:bookmarkStart w:id="105" w:name="ref-brms"/>
+    <w:bookmarkEnd w:id="106"/>
+    <w:bookmarkStart w:id="108" w:name="ref-brms"/>
     <w:p>
       <w:pPr>
         <w:pStyle w:val="Bibliography"/>
@@ -3981,7 +4045,7 @@
       <w:r>
         <w:t xml:space="preserve"> </w:t>
       </w:r>
-      <w:hyperlink r:id="rId104">
+      <w:hyperlink r:id="rId107">
         <w:r>
           <w:rPr>
             <w:rStyle w:val="Hyperlink"/>
@@ -3990,8 +4054,8 @@
         </w:r>
       </w:hyperlink>
     </w:p>
-    <w:bookmarkEnd w:id="105"/>
-    <w:bookmarkStart w:id="106" w:name="ref-Ciesla2012"/>
+    <w:bookmarkEnd w:id="108"/>
+    <w:bookmarkStart w:id="109" w:name="ref-Ciesla2012"/>
     <w:p>
       <w:pPr>
         <w:pStyle w:val="Bibliography"/>
@@ -4013,8 +4077,8 @@
         <w:t xml:space="preserve">, 1–11.</w:t>
       </w:r>
     </w:p>
-    <w:bookmarkEnd w:id="106"/>
-    <w:bookmarkStart w:id="108" w:name="ref-Dessinioti2009"/>
+    <w:bookmarkEnd w:id="109"/>
+    <w:bookmarkStart w:id="111" w:name="ref-Dessinioti2009"/>
     <w:p>
       <w:pPr>
         <w:pStyle w:val="Bibliography"/>
@@ -4051,7 +4115,7 @@
       <w:r>
         <w:t xml:space="preserve"> </w:t>
       </w:r>
-      <w:hyperlink r:id="rId107">
+      <w:hyperlink r:id="rId110">
         <w:r>
           <w:rPr>
             <w:rStyle w:val="Hyperlink"/>
@@ -4060,8 +4124,8 @@
         </w:r>
       </w:hyperlink>
     </w:p>
-    <w:bookmarkEnd w:id="108"/>
-    <w:bookmarkStart w:id="110" w:name="ref-Farroni2003"/>
+    <w:bookmarkEnd w:id="111"/>
+    <w:bookmarkStart w:id="113" w:name="ref-Farroni2003"/>
     <w:p>
       <w:pPr>
         <w:pStyle w:val="Bibliography"/>
@@ -4098,7 +4162,7 @@
       <w:r>
         <w:t xml:space="preserve"> </w:t>
       </w:r>
-      <w:hyperlink r:id="rId109">
+      <w:hyperlink r:id="rId112">
         <w:r>
           <w:rPr>
             <w:rStyle w:val="Hyperlink"/>
@@ -4107,8 +4171,8 @@
         </w:r>
       </w:hyperlink>
     </w:p>
-    <w:bookmarkEnd w:id="110"/>
-    <w:bookmarkStart w:id="112" w:name="ref-Farroni2007"/>
+    <w:bookmarkEnd w:id="113"/>
+    <w:bookmarkStart w:id="115" w:name="ref-Farroni2007"/>
     <w:p>
       <w:pPr>
         <w:pStyle w:val="Bibliography"/>
@@ -4145,7 +4209,7 @@
       <w:r>
         <w:t xml:space="preserve"> </w:t>
       </w:r>
-      <w:hyperlink r:id="rId111">
+      <w:hyperlink r:id="rId114">
         <w:r>
           <w:rPr>
             <w:rStyle w:val="Hyperlink"/>
@@ -4154,8 +4218,8 @@
         </w:r>
       </w:hyperlink>
     </w:p>
-    <w:bookmarkEnd w:id="112"/>
-    <w:bookmarkStart w:id="114" w:name="ref-Farroni2004"/>
+    <w:bookmarkEnd w:id="115"/>
+    <w:bookmarkStart w:id="117" w:name="ref-Farroni2004"/>
     <w:p>
       <w:pPr>
         <w:pStyle w:val="Bibliography"/>
@@ -4192,7 +4256,7 @@
       <w:r>
         <w:t xml:space="preserve"> </w:t>
       </w:r>
-      <w:hyperlink r:id="rId113">
+      <w:hyperlink r:id="rId116">
         <w:r>
           <w:rPr>
             <w:rStyle w:val="Hyperlink"/>
@@ -4201,8 +4265,8 @@
         </w:r>
       </w:hyperlink>
     </w:p>
-    <w:bookmarkEnd w:id="114"/>
-    <w:bookmarkStart w:id="116" w:name="ref-Gale2000"/>
+    <w:bookmarkEnd w:id="117"/>
+    <w:bookmarkStart w:id="119" w:name="ref-Gale2000"/>
     <w:p>
       <w:pPr>
         <w:pStyle w:val="Bibliography"/>
@@ -4239,7 +4303,7 @@
       <w:r>
         <w:t xml:space="preserve"> </w:t>
       </w:r>
-      <w:hyperlink r:id="rId115">
+      <w:hyperlink r:id="rId118">
         <w:r>
           <w:rPr>
             <w:rStyle w:val="Hyperlink"/>
@@ -4248,8 +4312,8 @@
         </w:r>
       </w:hyperlink>
     </w:p>
-    <w:bookmarkEnd w:id="116"/>
-    <w:bookmarkStart w:id="118" w:name="ref-Gronskov2007"/>
+    <w:bookmarkEnd w:id="119"/>
+    <w:bookmarkStart w:id="121" w:name="ref-Gronskov2007"/>
     <w:p>
       <w:pPr>
         <w:pStyle w:val="Bibliography"/>
@@ -4286,7 +4350,7 @@
       <w:r>
         <w:t xml:space="preserve"> </w:t>
       </w:r>
-      <w:hyperlink r:id="rId117">
+      <w:hyperlink r:id="rId120">
         <w:r>
           <w:rPr>
             <w:rStyle w:val="Hyperlink"/>
@@ -4295,8 +4359,8 @@
         </w:r>
       </w:hyperlink>
     </w:p>
-    <w:bookmarkEnd w:id="118"/>
-    <w:bookmarkStart w:id="120" w:name="ref-Grosserichter2025"/>
+    <w:bookmarkEnd w:id="121"/>
+    <w:bookmarkStart w:id="123" w:name="ref-Grosserichter2025"/>
     <w:p>
       <w:pPr>
         <w:pStyle w:val="Bibliography"/>
@@ -4320,7 +4384,7 @@
       <w:r>
         <w:t xml:space="preserve">[Thesis, University of Twente].</w:t>
       </w:r>
-      <w:hyperlink r:id="rId119">
+      <w:hyperlink r:id="rId122">
         <w:r>
           <w:rPr>
             <w:rStyle w:val="Hyperlink"/>
@@ -4329,8 +4393,8 @@
         </w:r>
       </w:hyperlink>
     </w:p>
-    <w:bookmarkEnd w:id="120"/>
-    <w:bookmarkStart w:id="122" w:name="ref-Guilford1991"/>
+    <w:bookmarkEnd w:id="123"/>
+    <w:bookmarkStart w:id="125" w:name="ref-Guilford1991"/>
     <w:p>
       <w:pPr>
         <w:pStyle w:val="Bibliography"/>
@@ -4367,7 +4431,7 @@
       <w:r>
         <w:t xml:space="preserve"> </w:t>
       </w:r>
-      <w:hyperlink r:id="rId121">
+      <w:hyperlink r:id="rId124">
         <w:r>
           <w:rPr>
             <w:rStyle w:val="Hyperlink"/>
@@ -4376,8 +4440,8 @@
         </w:r>
       </w:hyperlink>
     </w:p>
-    <w:bookmarkEnd w:id="122"/>
-    <w:bookmarkStart w:id="124" w:name="ref-Heck2023"/>
+    <w:bookmarkEnd w:id="125"/>
+    <w:bookmarkStart w:id="127" w:name="ref-Heck2023"/>
     <w:p>
       <w:pPr>
         <w:pStyle w:val="Bibliography"/>
@@ -4401,7 +4465,7 @@
       <w:r>
         <w:t xml:space="preserve"> </w:t>
       </w:r>
-      <w:hyperlink r:id="rId123">
+      <w:hyperlink r:id="rId126">
         <w:r>
           <w:rPr>
             <w:rStyle w:val="Hyperlink"/>
@@ -4410,8 +4474,8 @@
         </w:r>
       </w:hyperlink>
     </w:p>
-    <w:bookmarkEnd w:id="124"/>
-    <w:bookmarkStart w:id="126" w:name="ref-Hoelter2025"/>
+    <w:bookmarkEnd w:id="127"/>
+    <w:bookmarkStart w:id="129" w:name="ref-Hoelter2025"/>
     <w:p>
       <w:pPr>
         <w:pStyle w:val="Bibliography"/>
@@ -4435,7 +4499,7 @@
       <w:r>
         <w:t xml:space="preserve">[Thesis, University of Twente].</w:t>
       </w:r>
-      <w:hyperlink r:id="rId125">
+      <w:hyperlink r:id="rId128">
         <w:r>
           <w:rPr>
             <w:rStyle w:val="Hyperlink"/>
@@ -4444,8 +4508,8 @@
         </w:r>
       </w:hyperlink>
     </w:p>
-    <w:bookmarkEnd w:id="126"/>
-    <w:bookmarkStart w:id="128" w:name="ref-Kobayashi2001"/>
+    <w:bookmarkEnd w:id="129"/>
+    <w:bookmarkStart w:id="131" w:name="ref-Kobayashi2001"/>
     <w:p>
       <w:pPr>
         <w:pStyle w:val="Bibliography"/>
@@ -4482,7 +4546,7 @@
       <w:r>
         <w:t xml:space="preserve"> </w:t>
       </w:r>
-      <w:hyperlink r:id="rId127">
+      <w:hyperlink r:id="rId130">
         <w:r>
           <w:rPr>
             <w:rStyle w:val="Hyperlink"/>
@@ -4491,8 +4555,8 @@
         </w:r>
       </w:hyperlink>
     </w:p>
-    <w:bookmarkEnd w:id="128"/>
-    <w:bookmarkStart w:id="130" w:name="ref-Krafka2016"/>
+    <w:bookmarkEnd w:id="131"/>
+    <w:bookmarkStart w:id="133" w:name="ref-Krafka2016"/>
     <w:p>
       <w:pPr>
         <w:pStyle w:val="Bibliography"/>
@@ -4516,7 +4580,7 @@
       <w:r>
         <w:t xml:space="preserve"> </w:t>
       </w:r>
-      <w:hyperlink r:id="rId129">
+      <w:hyperlink r:id="rId132">
         <w:r>
           <w:rPr>
             <w:rStyle w:val="Hyperlink"/>
@@ -4525,8 +4589,8 @@
         </w:r>
       </w:hyperlink>
     </w:p>
-    <w:bookmarkEnd w:id="130"/>
-    <w:bookmarkStart w:id="132" w:name="ref-Kruijt2011"/>
+    <w:bookmarkEnd w:id="133"/>
+    <w:bookmarkStart w:id="135" w:name="ref-Kruijt2011"/>
     <w:p>
       <w:pPr>
         <w:pStyle w:val="Bibliography"/>
@@ -4563,7 +4627,7 @@
       <w:r>
         <w:t xml:space="preserve"> </w:t>
       </w:r>
-      <w:hyperlink r:id="rId131">
+      <w:hyperlink r:id="rId134">
         <w:r>
           <w:rPr>
             <w:rStyle w:val="Hyperlink"/>
@@ -4572,8 +4636,8 @@
         </w:r>
       </w:hyperlink>
     </w:p>
-    <w:bookmarkEnd w:id="132"/>
-    <w:bookmarkStart w:id="134" w:name="ref-Laidre2013"/>
+    <w:bookmarkEnd w:id="135"/>
+    <w:bookmarkStart w:id="137" w:name="ref-Laidre2013"/>
     <w:p>
       <w:pPr>
         <w:pStyle w:val="Bibliography"/>
@@ -4610,7 +4674,7 @@
       <w:r>
         <w:t xml:space="preserve"> </w:t>
       </w:r>
-      <w:hyperlink r:id="rId133">
+      <w:hyperlink r:id="rId136">
         <w:r>
           <w:rPr>
             <w:rStyle w:val="Hyperlink"/>
@@ -4619,8 +4683,8 @@
         </w:r>
       </w:hyperlink>
     </w:p>
-    <w:bookmarkEnd w:id="134"/>
-    <w:bookmarkStart w:id="136" w:name="ref-Loomis2008"/>
+    <w:bookmarkEnd w:id="137"/>
+    <w:bookmarkStart w:id="139" w:name="ref-Loomis2008"/>
     <w:p>
       <w:pPr>
         <w:pStyle w:val="Bibliography"/>
@@ -4657,7 +4721,7 @@
       <w:r>
         <w:t xml:space="preserve"> </w:t>
       </w:r>
-      <w:hyperlink r:id="rId135">
+      <w:hyperlink r:id="rId138">
         <w:r>
           <w:rPr>
             <w:rStyle w:val="Hyperlink"/>
@@ -4666,8 +4730,8 @@
         </w:r>
       </w:hyperlink>
     </w:p>
-    <w:bookmarkEnd w:id="136"/>
-    <w:bookmarkStart w:id="138" w:name="ref-Mayhew2015"/>
+    <w:bookmarkEnd w:id="139"/>
+    <w:bookmarkStart w:id="141" w:name="ref-Mayhew2015"/>
     <w:p>
       <w:pPr>
         <w:pStyle w:val="Bibliography"/>
@@ -4704,7 +4768,7 @@
       <w:r>
         <w:t xml:space="preserve"> </w:t>
       </w:r>
-      <w:hyperlink r:id="rId137">
+      <w:hyperlink r:id="rId140">
         <w:r>
           <w:rPr>
             <w:rStyle w:val="Hyperlink"/>
@@ -4713,8 +4777,8 @@
         </w:r>
       </w:hyperlink>
     </w:p>
-    <w:bookmarkEnd w:id="138"/>
-    <w:bookmarkStart w:id="140" w:name="ref-Mearing2022"/>
+    <w:bookmarkEnd w:id="141"/>
+    <w:bookmarkStart w:id="143" w:name="ref-Mearing2022"/>
     <w:p>
       <w:pPr>
         <w:pStyle w:val="Bibliography"/>
@@ -4751,7 +4815,7 @@
       <w:r>
         <w:t xml:space="preserve"> </w:t>
       </w:r>
-      <w:hyperlink r:id="rId139">
+      <w:hyperlink r:id="rId142">
         <w:r>
           <w:rPr>
             <w:rStyle w:val="Hyperlink"/>
@@ -4760,8 +4824,8 @@
         </w:r>
       </w:hyperlink>
     </w:p>
-    <w:bookmarkEnd w:id="140"/>
-    <w:bookmarkStart w:id="142" w:name="ref-Pastel2021"/>
+    <w:bookmarkEnd w:id="143"/>
+    <w:bookmarkStart w:id="145" w:name="ref-Pastel2021"/>
     <w:p>
       <w:pPr>
         <w:pStyle w:val="Bibliography"/>
@@ -4798,7 +4862,7 @@
       <w:r>
         <w:t xml:space="preserve"> </w:t>
       </w:r>
-      <w:hyperlink r:id="rId141">
+      <w:hyperlink r:id="rId144">
         <w:r>
           <w:rPr>
             <w:rStyle w:val="Hyperlink"/>
@@ -4807,8 +4871,8 @@
         </w:r>
       </w:hyperlink>
     </w:p>
-    <w:bookmarkEnd w:id="142"/>
-    <w:bookmarkStart w:id="143" w:name="ref-scikit-learn"/>
+    <w:bookmarkEnd w:id="145"/>
+    <w:bookmarkStart w:id="146" w:name="ref-scikit-learn"/>
     <w:p>
       <w:pPr>
         <w:pStyle w:val="Bibliography"/>
@@ -4852,8 +4916,8 @@
         <w:t xml:space="preserve">, 2825–2830.</w:t>
       </w:r>
     </w:p>
-    <w:bookmarkEnd w:id="143"/>
-    <w:bookmarkStart w:id="145" w:name="ref-Rlang"/>
+    <w:bookmarkEnd w:id="146"/>
+    <w:bookmarkStart w:id="148" w:name="ref-Rlang"/>
     <w:p>
       <w:pPr>
         <w:pStyle w:val="Bibliography"/>
@@ -4877,7 +4941,7 @@
       <w:r>
         <w:t xml:space="preserve"> </w:t>
       </w:r>
-      <w:hyperlink r:id="rId144">
+      <w:hyperlink r:id="rId147">
         <w:r>
           <w:rPr>
             <w:rStyle w:val="Hyperlink"/>
@@ -4886,8 +4950,8 @@
         </w:r>
       </w:hyperlink>
     </w:p>
-    <w:bookmarkEnd w:id="145"/>
-    <w:bookmarkStart w:id="147" w:name="ref-Singh2012"/>
+    <w:bookmarkEnd w:id="148"/>
+    <w:bookmarkStart w:id="150" w:name="ref-Singh2012"/>
     <w:p>
       <w:pPr>
         <w:pStyle w:val="Bibliography"/>
@@ -4924,7 +4988,7 @@
       <w:r>
         <w:t xml:space="preserve"> </w:t>
       </w:r>
-      <w:hyperlink r:id="rId146">
+      <w:hyperlink r:id="rId149">
         <w:r>
           <w:rPr>
             <w:rStyle w:val="Hyperlink"/>
@@ -4933,8 +4997,8 @@
         </w:r>
       </w:hyperlink>
     </w:p>
-    <w:bookmarkEnd w:id="147"/>
-    <w:bookmarkStart w:id="149" w:name="ref-Tomasello2007"/>
+    <w:bookmarkEnd w:id="150"/>
+    <w:bookmarkStart w:id="152" w:name="ref-Tomasello2007"/>
     <w:p>
       <w:pPr>
         <w:pStyle w:val="Bibliography"/>
@@ -4971,7 +5035,7 @@
       <w:r>
         <w:t xml:space="preserve"> </w:t>
       </w:r>
-      <w:hyperlink r:id="rId148">
+      <w:hyperlink r:id="rId151">
         <w:r>
           <w:rPr>
             <w:rStyle w:val="Hyperlink"/>
@@ -4980,8 +5044,8 @@
         </w:r>
       </w:hyperlink>
     </w:p>
-    <w:bookmarkEnd w:id="149"/>
-    <w:bookmarkStart w:id="151" w:name="ref-Wolf2023"/>
+    <w:bookmarkEnd w:id="152"/>
+    <w:bookmarkStart w:id="154" w:name="ref-Wolf2023"/>
     <w:p>
       <w:pPr>
         <w:pStyle w:val="Bibliography"/>
@@ -5018,7 +5082,7 @@
       <w:r>
         <w:t xml:space="preserve"> </w:t>
       </w:r>
-      <w:hyperlink r:id="rId150">
+      <w:hyperlink r:id="rId153">
         <w:r>
           <w:rPr>
             <w:rStyle w:val="Hyperlink"/>
@@ -5027,8 +5091,8 @@
         </w:r>
       </w:hyperlink>
     </w:p>
-    <w:bookmarkEnd w:id="151"/>
-    <w:bookmarkStart w:id="153" w:name="ref-Yorzinski2021"/>
+    <w:bookmarkEnd w:id="154"/>
+    <w:bookmarkStart w:id="156" w:name="ref-Yorzinski2021"/>
     <w:p>
       <w:pPr>
         <w:pStyle w:val="Bibliography"/>
@@ -5065,7 +5129,7 @@
       <w:r>
         <w:t xml:space="preserve"> </w:t>
       </w:r>
-      <w:hyperlink r:id="rId152">
+      <w:hyperlink r:id="rId155">
         <w:r>
           <w:rPr>
             <w:rStyle w:val="Hyperlink"/>
@@ -5074,8 +5138,8 @@
         </w:r>
       </w:hyperlink>
     </w:p>
-    <w:bookmarkEnd w:id="153"/>
-    <w:bookmarkStart w:id="155" w:name="ref-Zhou2004"/>
+    <w:bookmarkEnd w:id="156"/>
+    <w:bookmarkStart w:id="158" w:name="ref-Zhou2004"/>
     <w:p>
       <w:pPr>
         <w:pStyle w:val="Bibliography"/>
@@ -5112,7 +5176,7 @@
       <w:r>
         <w:t xml:space="preserve"> </w:t>
       </w:r>
-      <w:hyperlink r:id="rId154">
+      <w:hyperlink r:id="rId157">
         <w:r>
           <w:rPr>
             <w:rStyle w:val="Hyperlink"/>
@@ -5121,9 +5185,9 @@
         </w:r>
       </w:hyperlink>
     </w:p>
-    <w:bookmarkEnd w:id="155"/>
-    <w:bookmarkEnd w:id="156"/>
-    <w:bookmarkEnd w:id="157"/>
+    <w:bookmarkEnd w:id="158"/>
+    <w:bookmarkEnd w:id="159"/>
+    <w:bookmarkEnd w:id="160"/>
     <w:sectPr>
       <w:footnotePr>
         <w:numRestart w:val="eachSect"/>

</xml_diff>

<commit_message>
Added pleiotropy as an alternative theory
</commit_message>
<xml_diff>
--- a/YET_CEHR.docx
+++ b/YET_CEHR.docx
@@ -2128,7 +2128,7 @@
     </w:p>
     <w:bookmarkEnd w:id="55"/>
     <w:bookmarkEnd w:id="56"/>
-    <w:bookmarkStart w:id="90" w:name="X739e7a8d01a3a8db6358f3cf49c7af788e1739a"/>
+    <w:bookmarkStart w:id="85" w:name="X739e7a8d01a3a8db6358f3cf49c7af788e1739a"/>
     <w:p>
       <w:pPr>
         <w:pStyle w:val="Heading1"/>
@@ -2179,7 +2179,7 @@
         <w:t xml:space="preserve">A problematic outcome of the experiment would be if participants cannot read the Quadbright condition at all. In this case, we have no possibility to decide whether a progenitor receiver exists, or whether this just uses a mechanism yet unknown.</w:t>
       </w:r>
     </w:p>
-    <w:bookmarkStart w:id="89" w:name="methods-1"/>
+    <w:bookmarkStart w:id="84" w:name="methods-1"/>
     <w:p>
       <w:pPr>
         <w:pStyle w:val="Heading2"/>
@@ -2474,7 +2474,7 @@
       </w:r>
     </w:p>
     <w:bookmarkEnd w:id="68"/>
-    <w:bookmarkStart w:id="88" w:name="results-1"/>
+    <w:bookmarkStart w:id="83" w:name="results-1"/>
     <w:p>
       <w:pPr>
         <w:pStyle w:val="Heading3"/>
@@ -2715,2292 +2715,9 @@
               <w:pStyle w:val="ImageCaption"/>
             </w:pPr>
             <w:r>
-              <w:t xml:space="preserve">Table 2: MCMC posterior with 2000 samples of 378 parameters in 1 model(s)</w:t>
+              <w:t xml:space="preserve">Table 2</w:t>
             </w:r>
           </w:p>
-          <w:tbl>
-            <w:tblPr>
-              <w:tblStyle w:val="Table"/>
-              <w:tblW w:type="auto" w:w="0"/>
-              <w:tblLook w:firstRow="1" w:lastRow="0" w:firstColumn="0" w:lastColumn="0" w:noHBand="0" w:noVBand="0" w:val="0020"/>
-            </w:tblPr>
-            <w:tblGrid>
-              <w:gridCol w:w="1320"/>
-              <w:gridCol w:w="1320"/>
-              <w:gridCol w:w="1320"/>
-              <w:gridCol w:w="1320"/>
-              <w:gridCol w:w="1320"/>
-              <w:gridCol w:w="1320"/>
-            </w:tblGrid>
-            <w:tr>
-              <w:trPr>
-                <w:tblHeader w:val="on"/>
-              </w:trPr>
-              <w:tc>
-                <w:tcPr/>
-                <w:p>
-                  <w:pPr>
-                    <w:pStyle w:val="Compact"/>
-                    <w:jc w:val="left"/>
-                    <w:jc w:val="center"/>
-                  </w:pPr>
-                  <w:r>
-                    <w:t xml:space="preserve">model</w:t>
-                  </w:r>
-                </w:p>
-              </w:tc>
-              <w:tc>
-                <w:tcPr/>
-                <w:p>
-                  <w:pPr>
-                    <w:pStyle w:val="Compact"/>
-                    <w:jc w:val="left"/>
-                    <w:jc w:val="center"/>
-                  </w:pPr>
-                  <w:r>
-                    <w:t xml:space="preserve">parameter</w:t>
-                  </w:r>
-                </w:p>
-              </w:tc>
-              <w:tc>
-                <w:tcPr/>
-                <w:p>
-                  <w:pPr>
-                    <w:pStyle w:val="Compact"/>
-                    <w:jc w:val="left"/>
-                    <w:jc w:val="center"/>
-                  </w:pPr>
-                  <w:r>
-                    <w:t xml:space="preserve">type</w:t>
-                  </w:r>
-                </w:p>
-              </w:tc>
-              <w:tc>
-                <w:tcPr/>
-                <w:p>
-                  <w:pPr>
-                    <w:pStyle w:val="Compact"/>
-                    <w:jc w:val="left"/>
-                    <w:jc w:val="center"/>
-                  </w:pPr>
-                  <w:r>
-                    <w:t xml:space="preserve">fixef</w:t>
-                  </w:r>
-                </w:p>
-              </w:tc>
-              <w:tc>
-                <w:tcPr/>
-                <w:p>
-                  <w:pPr>
-                    <w:pStyle w:val="Compact"/>
-                    <w:jc w:val="left"/>
-                    <w:jc w:val="center"/>
-                  </w:pPr>
-                  <w:r>
-                    <w:t xml:space="preserve">re_factor</w:t>
-                  </w:r>
-                </w:p>
-              </w:tc>
-              <w:tc>
-                <w:tcPr/>
-                <w:p>
-                  <w:pPr>
-                    <w:pStyle w:val="Compact"/>
-                    <w:jc w:val="right"/>
-                    <w:jc w:val="center"/>
-                  </w:pPr>
-                  <w:r>
-                    <w:t xml:space="preserve">count</w:t>
-                  </w:r>
-                </w:p>
-              </w:tc>
-            </w:tr>
-            <w:tr>
-              <w:tc>
-                <w:tcPr/>
-                <w:p>
-                  <w:pPr>
-                    <w:pStyle w:val="Compact"/>
-                    <w:jc w:val="left"/>
-                    <w:jc w:val="center"/>
-                  </w:pPr>
-                  <w:r>
-                    <w:t xml:space="preserve">M_5_stw</w:t>
-                  </w:r>
-                </w:p>
-              </w:tc>
-              <w:tc>
-                <w:tcPr/>
-                <w:p>
-                  <w:pPr>
-                    <w:pStyle w:val="Compact"/>
-                  </w:pPr>
-                </w:p>
-              </w:tc>
-              <w:tc>
-                <w:tcPr/>
-                <w:p>
-                  <w:pPr>
-                    <w:pStyle w:val="Compact"/>
-                    <w:jc w:val="left"/>
-                    <w:jc w:val="center"/>
-                  </w:pPr>
-                  <w:r>
-                    <w:t xml:space="preserve">ranef</w:t>
-                  </w:r>
-                </w:p>
-              </w:tc>
-              <w:tc>
-                <w:tcPr/>
-                <w:p>
-                  <w:pPr>
-                    <w:pStyle w:val="Compact"/>
-                    <w:jc w:val="left"/>
-                    <w:jc w:val="center"/>
-                  </w:pPr>
-                  <w:r>
-                    <w:t xml:space="preserve">Control_70</w:t>
-                  </w:r>
-                </w:p>
-              </w:tc>
-              <w:tc>
-                <w:tcPr/>
-                <w:p>
-                  <w:pPr>
-                    <w:pStyle w:val="Compact"/>
-                    <w:jc w:val="left"/>
-                    <w:jc w:val="center"/>
-                  </w:pPr>
-                  <w:r>
-                    <w:t xml:space="preserve">Part</w:t>
-                  </w:r>
-                </w:p>
-              </w:tc>
-              <w:tc>
-                <w:tcPr/>
-                <w:p>
-                  <w:pPr>
-                    <w:pStyle w:val="Compact"/>
-                    <w:jc w:val="right"/>
-                    <w:jc w:val="center"/>
-                  </w:pPr>
-                  <w:r>
-                    <w:t xml:space="preserve">43</w:t>
-                  </w:r>
-                </w:p>
-              </w:tc>
-            </w:tr>
-            <w:tr>
-              <w:tc>
-                <w:tcPr/>
-                <w:p>
-                  <w:pPr>
-                    <w:pStyle w:val="Compact"/>
-                    <w:jc w:val="left"/>
-                    <w:jc w:val="center"/>
-                  </w:pPr>
-                  <w:r>
-                    <w:t xml:space="preserve">M_5_stw</w:t>
-                  </w:r>
-                </w:p>
-              </w:tc>
-              <w:tc>
-                <w:tcPr/>
-                <w:p>
-                  <w:pPr>
-                    <w:pStyle w:val="Compact"/>
-                  </w:pPr>
-                </w:p>
-              </w:tc>
-              <w:tc>
-                <w:tcPr/>
-                <w:p>
-                  <w:pPr>
-                    <w:pStyle w:val="Compact"/>
-                    <w:jc w:val="left"/>
-                    <w:jc w:val="center"/>
-                  </w:pPr>
-                  <w:r>
-                    <w:t xml:space="preserve">ranef</w:t>
-                  </w:r>
-                </w:p>
-              </w:tc>
-              <w:tc>
-                <w:tcPr/>
-                <w:p>
-                  <w:pPr>
-                    <w:pStyle w:val="Compact"/>
-                    <w:jc w:val="left"/>
-                    <w:jc w:val="center"/>
-                  </w:pPr>
-                  <w:r>
-                    <w:t xml:space="preserve">Control_70</w:t>
-                  </w:r>
-                </w:p>
-              </w:tc>
-              <w:tc>
-                <w:tcPr/>
-                <w:p>
-                  <w:pPr>
-                    <w:pStyle w:val="Compact"/>
-                    <w:jc w:val="left"/>
-                    <w:jc w:val="center"/>
-                  </w:pPr>
-                  <w:r>
-                    <w:t xml:space="preserve">Stim</w:t>
-                  </w:r>
-                </w:p>
-              </w:tc>
-              <w:tc>
-                <w:tcPr/>
-                <w:p>
-                  <w:pPr>
-                    <w:pStyle w:val="Compact"/>
-                    <w:jc w:val="right"/>
-                    <w:jc w:val="center"/>
-                  </w:pPr>
-                  <w:r>
-                    <w:t xml:space="preserve">12</w:t>
-                  </w:r>
-                </w:p>
-              </w:tc>
-            </w:tr>
-            <w:tr>
-              <w:tc>
-                <w:tcPr/>
-                <w:p>
-                  <w:pPr>
-                    <w:pStyle w:val="Compact"/>
-                    <w:jc w:val="left"/>
-                    <w:jc w:val="center"/>
-                  </w:pPr>
-                  <w:r>
-                    <w:t xml:space="preserve">M_5_stw</w:t>
-                  </w:r>
-                </w:p>
-              </w:tc>
-              <w:tc>
-                <w:tcPr/>
-                <w:p>
-                  <w:pPr>
-                    <w:pStyle w:val="Compact"/>
-                  </w:pPr>
-                </w:p>
-              </w:tc>
-              <w:tc>
-                <w:tcPr/>
-                <w:p>
-                  <w:pPr>
-                    <w:pStyle w:val="Compact"/>
-                    <w:jc w:val="left"/>
-                    <w:jc w:val="center"/>
-                  </w:pPr>
-                  <w:r>
-                    <w:t xml:space="preserve">ranef</w:t>
-                  </w:r>
-                </w:p>
-              </w:tc>
-              <w:tc>
-                <w:tcPr/>
-                <w:p>
-                  <w:pPr>
-                    <w:pStyle w:val="Compact"/>
-                    <w:jc w:val="left"/>
-                    <w:jc w:val="center"/>
-                  </w:pPr>
-                  <w:r>
-                    <w:t xml:space="preserve">exp_1000</w:t>
-                  </w:r>
-                </w:p>
-              </w:tc>
-              <w:tc>
-                <w:tcPr/>
-                <w:p>
-                  <w:pPr>
-                    <w:pStyle w:val="Compact"/>
-                    <w:jc w:val="left"/>
-                    <w:jc w:val="center"/>
-                  </w:pPr>
-                  <w:r>
-                    <w:t xml:space="preserve">Part</w:t>
-                  </w:r>
-                </w:p>
-              </w:tc>
-              <w:tc>
-                <w:tcPr/>
-                <w:p>
-                  <w:pPr>
-                    <w:pStyle w:val="Compact"/>
-                    <w:jc w:val="right"/>
-                    <w:jc w:val="center"/>
-                  </w:pPr>
-                  <w:r>
-                    <w:t xml:space="preserve">43</w:t>
-                  </w:r>
-                </w:p>
-              </w:tc>
-            </w:tr>
-            <w:tr>
-              <w:tc>
-                <w:tcPr/>
-                <w:p>
-                  <w:pPr>
-                    <w:pStyle w:val="Compact"/>
-                    <w:jc w:val="left"/>
-                    <w:jc w:val="center"/>
-                  </w:pPr>
-                  <w:r>
-                    <w:t xml:space="preserve">M_5_stw</w:t>
-                  </w:r>
-                </w:p>
-              </w:tc>
-              <w:tc>
-                <w:tcPr/>
-                <w:p>
-                  <w:pPr>
-                    <w:pStyle w:val="Compact"/>
-                  </w:pPr>
-                </w:p>
-              </w:tc>
-              <w:tc>
-                <w:tcPr/>
-                <w:p>
-                  <w:pPr>
-                    <w:pStyle w:val="Compact"/>
-                    <w:jc w:val="left"/>
-                    <w:jc w:val="center"/>
-                  </w:pPr>
-                  <w:r>
-                    <w:t xml:space="preserve">ranef</w:t>
-                  </w:r>
-                </w:p>
-              </w:tc>
-              <w:tc>
-                <w:tcPr/>
-                <w:p>
-                  <w:pPr>
-                    <w:pStyle w:val="Compact"/>
-                    <w:jc w:val="left"/>
-                    <w:jc w:val="center"/>
-                  </w:pPr>
-                  <w:r>
-                    <w:t xml:space="preserve">exp_140</w:t>
-                  </w:r>
-                </w:p>
-              </w:tc>
-              <w:tc>
-                <w:tcPr/>
-                <w:p>
-                  <w:pPr>
-                    <w:pStyle w:val="Compact"/>
-                    <w:jc w:val="left"/>
-                    <w:jc w:val="center"/>
-                  </w:pPr>
-                  <w:r>
-                    <w:t xml:space="preserve">Part</w:t>
-                  </w:r>
-                </w:p>
-              </w:tc>
-              <w:tc>
-                <w:tcPr/>
-                <w:p>
-                  <w:pPr>
-                    <w:pStyle w:val="Compact"/>
-                    <w:jc w:val="right"/>
-                    <w:jc w:val="center"/>
-                  </w:pPr>
-                  <w:r>
-                    <w:t xml:space="preserve">43</w:t>
-                  </w:r>
-                </w:p>
-              </w:tc>
-            </w:tr>
-            <w:tr>
-              <w:tc>
-                <w:tcPr/>
-                <w:p>
-                  <w:pPr>
-                    <w:pStyle w:val="Compact"/>
-                    <w:jc w:val="left"/>
-                    <w:jc w:val="center"/>
-                  </w:pPr>
-                  <w:r>
-                    <w:t xml:space="preserve">M_5_stw</w:t>
-                  </w:r>
-                </w:p>
-              </w:tc>
-              <w:tc>
-                <w:tcPr/>
-                <w:p>
-                  <w:pPr>
-                    <w:pStyle w:val="Compact"/>
-                  </w:pPr>
-                </w:p>
-              </w:tc>
-              <w:tc>
-                <w:tcPr/>
-                <w:p>
-                  <w:pPr>
-                    <w:pStyle w:val="Compact"/>
-                    <w:jc w:val="left"/>
-                    <w:jc w:val="center"/>
-                  </w:pPr>
-                  <w:r>
-                    <w:t xml:space="preserve">ranef</w:t>
-                  </w:r>
-                </w:p>
-              </w:tc>
-              <w:tc>
-                <w:tcPr/>
-                <w:p>
-                  <w:pPr>
-                    <w:pStyle w:val="Compact"/>
-                    <w:jc w:val="left"/>
-                    <w:jc w:val="center"/>
-                  </w:pPr>
-                  <w:r>
-                    <w:t xml:space="preserve">exp_140</w:t>
-                  </w:r>
-                </w:p>
-              </w:tc>
-              <w:tc>
-                <w:tcPr/>
-                <w:p>
-                  <w:pPr>
-                    <w:pStyle w:val="Compact"/>
-                    <w:jc w:val="left"/>
-                    <w:jc w:val="center"/>
-                  </w:pPr>
-                  <w:r>
-                    <w:t xml:space="preserve">Stim</w:t>
-                  </w:r>
-                </w:p>
-              </w:tc>
-              <w:tc>
-                <w:tcPr/>
-                <w:p>
-                  <w:pPr>
-                    <w:pStyle w:val="Compact"/>
-                    <w:jc w:val="right"/>
-                    <w:jc w:val="center"/>
-                  </w:pPr>
-                  <w:r>
-                    <w:t xml:space="preserve">12</w:t>
-                  </w:r>
-                </w:p>
-              </w:tc>
-            </w:tr>
-            <w:tr>
-              <w:tc>
-                <w:tcPr/>
-                <w:p>
-                  <w:pPr>
-                    <w:pStyle w:val="Compact"/>
-                    <w:jc w:val="left"/>
-                    <w:jc w:val="center"/>
-                  </w:pPr>
-                  <w:r>
-                    <w:t xml:space="preserve">M_5_stw</w:t>
-                  </w:r>
-                </w:p>
-              </w:tc>
-              <w:tc>
-                <w:tcPr/>
-                <w:p>
-                  <w:pPr>
-                    <w:pStyle w:val="Compact"/>
-                  </w:pPr>
-                </w:p>
-              </w:tc>
-              <w:tc>
-                <w:tcPr/>
-                <w:p>
-                  <w:pPr>
-                    <w:pStyle w:val="Compact"/>
-                    <w:jc w:val="left"/>
-                    <w:jc w:val="center"/>
-                  </w:pPr>
-                  <w:r>
-                    <w:t xml:space="preserve">ranef</w:t>
-                  </w:r>
-                </w:p>
-              </w:tc>
-              <w:tc>
-                <w:tcPr/>
-                <w:p>
-                  <w:pPr>
-                    <w:pStyle w:val="Compact"/>
-                    <w:jc w:val="left"/>
-                    <w:jc w:val="center"/>
-                  </w:pPr>
-                  <w:r>
-                    <w:t xml:space="preserve">exp_400</w:t>
-                  </w:r>
-                </w:p>
-              </w:tc>
-              <w:tc>
-                <w:tcPr/>
-                <w:p>
-                  <w:pPr>
-                    <w:pStyle w:val="Compact"/>
-                    <w:jc w:val="left"/>
-                    <w:jc w:val="center"/>
-                  </w:pPr>
-                  <w:r>
-                    <w:t xml:space="preserve">Part</w:t>
-                  </w:r>
-                </w:p>
-              </w:tc>
-              <w:tc>
-                <w:tcPr/>
-                <w:p>
-                  <w:pPr>
-                    <w:pStyle w:val="Compact"/>
-                    <w:jc w:val="right"/>
-                    <w:jc w:val="center"/>
-                  </w:pPr>
-                  <w:r>
-                    <w:t xml:space="preserve">43</w:t>
-                  </w:r>
-                </w:p>
-              </w:tc>
-            </w:tr>
-            <w:tr>
-              <w:tc>
-                <w:tcPr/>
-                <w:p>
-                  <w:pPr>
-                    <w:pStyle w:val="Compact"/>
-                    <w:jc w:val="left"/>
-                    <w:jc w:val="center"/>
-                  </w:pPr>
-                  <w:r>
-                    <w:t xml:space="preserve">M_5_stw</w:t>
-                  </w:r>
-                </w:p>
-              </w:tc>
-              <w:tc>
-                <w:tcPr/>
-                <w:p>
-                  <w:pPr>
-                    <w:pStyle w:val="Compact"/>
-                  </w:pPr>
-                </w:p>
-              </w:tc>
-              <w:tc>
-                <w:tcPr/>
-                <w:p>
-                  <w:pPr>
-                    <w:pStyle w:val="Compact"/>
-                    <w:jc w:val="left"/>
-                    <w:jc w:val="center"/>
-                  </w:pPr>
-                  <w:r>
-                    <w:t xml:space="preserve">ranef</w:t>
-                  </w:r>
-                </w:p>
-              </w:tc>
-              <w:tc>
-                <w:tcPr/>
-                <w:p>
-                  <w:pPr>
-                    <w:pStyle w:val="Compact"/>
-                    <w:jc w:val="left"/>
-                    <w:jc w:val="center"/>
-                  </w:pPr>
-                  <w:r>
-                    <w:t xml:space="preserve">exp_600</w:t>
-                  </w:r>
-                </w:p>
-              </w:tc>
-              <w:tc>
-                <w:tcPr/>
-                <w:p>
-                  <w:pPr>
-                    <w:pStyle w:val="Compact"/>
-                    <w:jc w:val="left"/>
-                    <w:jc w:val="center"/>
-                  </w:pPr>
-                  <w:r>
-                    <w:t xml:space="preserve">Part</w:t>
-                  </w:r>
-                </w:p>
-              </w:tc>
-              <w:tc>
-                <w:tcPr/>
-                <w:p>
-                  <w:pPr>
-                    <w:pStyle w:val="Compact"/>
-                    <w:jc w:val="right"/>
-                    <w:jc w:val="center"/>
-                  </w:pPr>
-                  <w:r>
-                    <w:t xml:space="preserve">43</w:t>
-                  </w:r>
-                </w:p>
-              </w:tc>
-            </w:tr>
-            <w:tr>
-              <w:tc>
-                <w:tcPr/>
-                <w:p>
-                  <w:pPr>
-                    <w:pStyle w:val="Compact"/>
-                    <w:jc w:val="left"/>
-                    <w:jc w:val="center"/>
-                  </w:pPr>
-                  <w:r>
-                    <w:t xml:space="preserve">M_5_stw</w:t>
-                  </w:r>
-                </w:p>
-              </w:tc>
-              <w:tc>
-                <w:tcPr/>
-                <w:p>
-                  <w:pPr>
-                    <w:pStyle w:val="Compact"/>
-                  </w:pPr>
-                </w:p>
-              </w:tc>
-              <w:tc>
-                <w:tcPr/>
-                <w:p>
-                  <w:pPr>
-                    <w:pStyle w:val="Compact"/>
-                    <w:jc w:val="left"/>
-                    <w:jc w:val="center"/>
-                  </w:pPr>
-                  <w:r>
-                    <w:t xml:space="preserve">ranef</w:t>
-                  </w:r>
-                </w:p>
-              </w:tc>
-              <w:tc>
-                <w:tcPr/>
-                <w:p>
-                  <w:pPr>
-                    <w:pStyle w:val="Compact"/>
-                    <w:jc w:val="left"/>
-                    <w:jc w:val="center"/>
-                  </w:pPr>
-                  <w:r>
-                    <w:t xml:space="preserve">qbr_140</w:t>
-                  </w:r>
-                </w:p>
-              </w:tc>
-              <w:tc>
-                <w:tcPr/>
-                <w:p>
-                  <w:pPr>
-                    <w:pStyle w:val="Compact"/>
-                    <w:jc w:val="left"/>
-                    <w:jc w:val="center"/>
-                  </w:pPr>
-                  <w:r>
-                    <w:t xml:space="preserve">Part</w:t>
-                  </w:r>
-                </w:p>
-              </w:tc>
-              <w:tc>
-                <w:tcPr/>
-                <w:p>
-                  <w:pPr>
-                    <w:pStyle w:val="Compact"/>
-                    <w:jc w:val="right"/>
-                    <w:jc w:val="center"/>
-                  </w:pPr>
-                  <w:r>
-                    <w:t xml:space="preserve">43</w:t>
-                  </w:r>
-                </w:p>
-              </w:tc>
-            </w:tr>
-            <w:tr>
-              <w:tc>
-                <w:tcPr/>
-                <w:p>
-                  <w:pPr>
-                    <w:pStyle w:val="Compact"/>
-                    <w:jc w:val="left"/>
-                    <w:jc w:val="center"/>
-                  </w:pPr>
-                  <w:r>
-                    <w:t xml:space="preserve">M_5_stw</w:t>
-                  </w:r>
-                </w:p>
-              </w:tc>
-              <w:tc>
-                <w:tcPr/>
-                <w:p>
-                  <w:pPr>
-                    <w:pStyle w:val="Compact"/>
-                  </w:pPr>
-                </w:p>
-              </w:tc>
-              <w:tc>
-                <w:tcPr/>
-                <w:p>
-                  <w:pPr>
-                    <w:pStyle w:val="Compact"/>
-                    <w:jc w:val="left"/>
-                    <w:jc w:val="center"/>
-                  </w:pPr>
-                  <w:r>
-                    <w:t xml:space="preserve">ranef</w:t>
-                  </w:r>
-                </w:p>
-              </w:tc>
-              <w:tc>
-                <w:tcPr/>
-                <w:p>
-                  <w:pPr>
-                    <w:pStyle w:val="Compact"/>
-                    <w:jc w:val="left"/>
-                    <w:jc w:val="center"/>
-                  </w:pPr>
-                  <w:r>
-                    <w:t xml:space="preserve">qbr_140</w:t>
-                  </w:r>
-                </w:p>
-              </w:tc>
-              <w:tc>
-                <w:tcPr/>
-                <w:p>
-                  <w:pPr>
-                    <w:pStyle w:val="Compact"/>
-                    <w:jc w:val="left"/>
-                    <w:jc w:val="center"/>
-                  </w:pPr>
-                  <w:r>
-                    <w:t xml:space="preserve">Stim</w:t>
-                  </w:r>
-                </w:p>
-              </w:tc>
-              <w:tc>
-                <w:tcPr/>
-                <w:p>
-                  <w:pPr>
-                    <w:pStyle w:val="Compact"/>
-                    <w:jc w:val="right"/>
-                    <w:jc w:val="center"/>
-                  </w:pPr>
-                  <w:r>
-                    <w:t xml:space="preserve">12</w:t>
-                  </w:r>
-                </w:p>
-              </w:tc>
-            </w:tr>
-            <w:tr>
-              <w:tc>
-                <w:tcPr/>
-                <w:p>
-                  <w:pPr>
-                    <w:pStyle w:val="Compact"/>
-                    <w:jc w:val="left"/>
-                    <w:jc w:val="center"/>
-                  </w:pPr>
-                  <w:r>
-                    <w:t xml:space="preserve">M_5_stw</w:t>
-                  </w:r>
-                </w:p>
-              </w:tc>
-              <w:tc>
-                <w:tcPr/>
-                <w:p>
-                  <w:pPr>
-                    <w:pStyle w:val="Compact"/>
-                  </w:pPr>
-                </w:p>
-              </w:tc>
-              <w:tc>
-                <w:tcPr/>
-                <w:p>
-                  <w:pPr>
-                    <w:pStyle w:val="Compact"/>
-                    <w:jc w:val="left"/>
-                    <w:jc w:val="center"/>
-                  </w:pPr>
-                  <w:r>
-                    <w:t xml:space="preserve">ranef</w:t>
-                  </w:r>
-                </w:p>
-              </w:tc>
-              <w:tc>
-                <w:tcPr/>
-                <w:p>
-                  <w:pPr>
-                    <w:pStyle w:val="Compact"/>
-                    <w:jc w:val="left"/>
-                    <w:jc w:val="center"/>
-                  </w:pPr>
-                  <w:r>
-                    <w:t xml:space="preserve">qbr_70</w:t>
-                  </w:r>
-                </w:p>
-              </w:tc>
-              <w:tc>
-                <w:tcPr/>
-                <w:p>
-                  <w:pPr>
-                    <w:pStyle w:val="Compact"/>
-                    <w:jc w:val="left"/>
-                    <w:jc w:val="center"/>
-                  </w:pPr>
-                  <w:r>
-                    <w:t xml:space="preserve">Part</w:t>
-                  </w:r>
-                </w:p>
-              </w:tc>
-              <w:tc>
-                <w:tcPr/>
-                <w:p>
-                  <w:pPr>
-                    <w:pStyle w:val="Compact"/>
-                    <w:jc w:val="right"/>
-                    <w:jc w:val="center"/>
-                  </w:pPr>
-                  <w:r>
-                    <w:t xml:space="preserve">43</w:t>
-                  </w:r>
-                </w:p>
-              </w:tc>
-            </w:tr>
-            <w:tr>
-              <w:tc>
-                <w:tcPr/>
-                <w:p>
-                  <w:pPr>
-                    <w:pStyle w:val="Compact"/>
-                    <w:jc w:val="left"/>
-                    <w:jc w:val="center"/>
-                  </w:pPr>
-                  <w:r>
-                    <w:t xml:space="preserve">M_5_stw</w:t>
-                  </w:r>
-                </w:p>
-              </w:tc>
-              <w:tc>
-                <w:tcPr/>
-                <w:p>
-                  <w:pPr>
-                    <w:pStyle w:val="Compact"/>
-                    <w:jc w:val="left"/>
-                    <w:jc w:val="center"/>
-                  </w:pPr>
-                  <w:r>
-                    <w:t xml:space="preserve">b_Control_70</w:t>
-                  </w:r>
-                </w:p>
-              </w:tc>
-              <w:tc>
-                <w:tcPr/>
-                <w:p>
-                  <w:pPr>
-                    <w:pStyle w:val="Compact"/>
-                    <w:jc w:val="left"/>
-                    <w:jc w:val="center"/>
-                  </w:pPr>
-                  <w:r>
-                    <w:t xml:space="preserve">fixef</w:t>
-                  </w:r>
-                </w:p>
-              </w:tc>
-              <w:tc>
-                <w:tcPr/>
-                <w:p>
-                  <w:pPr>
-                    <w:pStyle w:val="Compact"/>
-                    <w:jc w:val="left"/>
-                    <w:jc w:val="center"/>
-                  </w:pPr>
-                  <w:r>
-                    <w:t xml:space="preserve">Control_70</w:t>
-                  </w:r>
-                </w:p>
-              </w:tc>
-              <w:tc>
-                <w:tcPr/>
-                <w:p>
-                  <w:pPr>
-                    <w:pStyle w:val="Compact"/>
-                    <w:jc w:val="left"/>
-                    <w:jc w:val="center"/>
-                  </w:pPr>
-                  <w:r>
-                    <w:t xml:space="preserve">NA</w:t>
-                  </w:r>
-                </w:p>
-              </w:tc>
-              <w:tc>
-                <w:tcPr/>
-                <w:p>
-                  <w:pPr>
-                    <w:pStyle w:val="Compact"/>
-                    <w:jc w:val="right"/>
-                    <w:jc w:val="center"/>
-                  </w:pPr>
-                  <w:r>
-                    <w:t xml:space="preserve">1</w:t>
-                  </w:r>
-                </w:p>
-              </w:tc>
-            </w:tr>
-            <w:tr>
-              <w:tc>
-                <w:tcPr/>
-                <w:p>
-                  <w:pPr>
-                    <w:pStyle w:val="Compact"/>
-                    <w:jc w:val="left"/>
-                    <w:jc w:val="center"/>
-                  </w:pPr>
-                  <w:r>
-                    <w:t xml:space="preserve">M_5_stw</w:t>
-                  </w:r>
-                </w:p>
-              </w:tc>
-              <w:tc>
-                <w:tcPr/>
-                <w:p>
-                  <w:pPr>
-                    <w:pStyle w:val="Compact"/>
-                    <w:jc w:val="left"/>
-                    <w:jc w:val="center"/>
-                  </w:pPr>
-                  <w:r>
-                    <w:t xml:space="preserve">b_exp_1000</w:t>
-                  </w:r>
-                </w:p>
-              </w:tc>
-              <w:tc>
-                <w:tcPr/>
-                <w:p>
-                  <w:pPr>
-                    <w:pStyle w:val="Compact"/>
-                    <w:jc w:val="left"/>
-                    <w:jc w:val="center"/>
-                  </w:pPr>
-                  <w:r>
-                    <w:t xml:space="preserve">fixef</w:t>
-                  </w:r>
-                </w:p>
-              </w:tc>
-              <w:tc>
-                <w:tcPr/>
-                <w:p>
-                  <w:pPr>
-                    <w:pStyle w:val="Compact"/>
-                    <w:jc w:val="left"/>
-                    <w:jc w:val="center"/>
-                  </w:pPr>
-                  <w:r>
-                    <w:t xml:space="preserve">exp_1000</w:t>
-                  </w:r>
-                </w:p>
-              </w:tc>
-              <w:tc>
-                <w:tcPr/>
-                <w:p>
-                  <w:pPr>
-                    <w:pStyle w:val="Compact"/>
-                    <w:jc w:val="left"/>
-                    <w:jc w:val="center"/>
-                  </w:pPr>
-                  <w:r>
-                    <w:t xml:space="preserve">NA</w:t>
-                  </w:r>
-                </w:p>
-              </w:tc>
-              <w:tc>
-                <w:tcPr/>
-                <w:p>
-                  <w:pPr>
-                    <w:pStyle w:val="Compact"/>
-                    <w:jc w:val="right"/>
-                    <w:jc w:val="center"/>
-                  </w:pPr>
-                  <w:r>
-                    <w:t xml:space="preserve">1</w:t>
-                  </w:r>
-                </w:p>
-              </w:tc>
-            </w:tr>
-            <w:tr>
-              <w:tc>
-                <w:tcPr/>
-                <w:p>
-                  <w:pPr>
-                    <w:pStyle w:val="Compact"/>
-                    <w:jc w:val="left"/>
-                    <w:jc w:val="center"/>
-                  </w:pPr>
-                  <w:r>
-                    <w:t xml:space="preserve">M_5_stw</w:t>
-                  </w:r>
-                </w:p>
-              </w:tc>
-              <w:tc>
-                <w:tcPr/>
-                <w:p>
-                  <w:pPr>
-                    <w:pStyle w:val="Compact"/>
-                    <w:jc w:val="left"/>
-                    <w:jc w:val="center"/>
-                  </w:pPr>
-                  <w:r>
-                    <w:t xml:space="preserve">b_exp_140</w:t>
-                  </w:r>
-                </w:p>
-              </w:tc>
-              <w:tc>
-                <w:tcPr/>
-                <w:p>
-                  <w:pPr>
-                    <w:pStyle w:val="Compact"/>
-                    <w:jc w:val="left"/>
-                    <w:jc w:val="center"/>
-                  </w:pPr>
-                  <w:r>
-                    <w:t xml:space="preserve">fixef</w:t>
-                  </w:r>
-                </w:p>
-              </w:tc>
-              <w:tc>
-                <w:tcPr/>
-                <w:p>
-                  <w:pPr>
-                    <w:pStyle w:val="Compact"/>
-                    <w:jc w:val="left"/>
-                    <w:jc w:val="center"/>
-                  </w:pPr>
-                  <w:r>
-                    <w:t xml:space="preserve">exp_140</w:t>
-                  </w:r>
-                </w:p>
-              </w:tc>
-              <w:tc>
-                <w:tcPr/>
-                <w:p>
-                  <w:pPr>
-                    <w:pStyle w:val="Compact"/>
-                    <w:jc w:val="left"/>
-                    <w:jc w:val="center"/>
-                  </w:pPr>
-                  <w:r>
-                    <w:t xml:space="preserve">NA</w:t>
-                  </w:r>
-                </w:p>
-              </w:tc>
-              <w:tc>
-                <w:tcPr/>
-                <w:p>
-                  <w:pPr>
-                    <w:pStyle w:val="Compact"/>
-                    <w:jc w:val="right"/>
-                    <w:jc w:val="center"/>
-                  </w:pPr>
-                  <w:r>
-                    <w:t xml:space="preserve">1</w:t>
-                  </w:r>
-                </w:p>
-              </w:tc>
-            </w:tr>
-            <w:tr>
-              <w:tc>
-                <w:tcPr/>
-                <w:p>
-                  <w:pPr>
-                    <w:pStyle w:val="Compact"/>
-                    <w:jc w:val="left"/>
-                    <w:jc w:val="center"/>
-                  </w:pPr>
-                  <w:r>
-                    <w:t xml:space="preserve">M_5_stw</w:t>
-                  </w:r>
-                </w:p>
-              </w:tc>
-              <w:tc>
-                <w:tcPr/>
-                <w:p>
-                  <w:pPr>
-                    <w:pStyle w:val="Compact"/>
-                    <w:jc w:val="left"/>
-                    <w:jc w:val="center"/>
-                  </w:pPr>
-                  <w:r>
-                    <w:t xml:space="preserve">b_exp_400</w:t>
-                  </w:r>
-                </w:p>
-              </w:tc>
-              <w:tc>
-                <w:tcPr/>
-                <w:p>
-                  <w:pPr>
-                    <w:pStyle w:val="Compact"/>
-                    <w:jc w:val="left"/>
-                    <w:jc w:val="center"/>
-                  </w:pPr>
-                  <w:r>
-                    <w:t xml:space="preserve">fixef</w:t>
-                  </w:r>
-                </w:p>
-              </w:tc>
-              <w:tc>
-                <w:tcPr/>
-                <w:p>
-                  <w:pPr>
-                    <w:pStyle w:val="Compact"/>
-                    <w:jc w:val="left"/>
-                    <w:jc w:val="center"/>
-                  </w:pPr>
-                  <w:r>
-                    <w:t xml:space="preserve">exp_400</w:t>
-                  </w:r>
-                </w:p>
-              </w:tc>
-              <w:tc>
-                <w:tcPr/>
-                <w:p>
-                  <w:pPr>
-                    <w:pStyle w:val="Compact"/>
-                    <w:jc w:val="left"/>
-                    <w:jc w:val="center"/>
-                  </w:pPr>
-                  <w:r>
-                    <w:t xml:space="preserve">NA</w:t>
-                  </w:r>
-                </w:p>
-              </w:tc>
-              <w:tc>
-                <w:tcPr/>
-                <w:p>
-                  <w:pPr>
-                    <w:pStyle w:val="Compact"/>
-                    <w:jc w:val="right"/>
-                    <w:jc w:val="center"/>
-                  </w:pPr>
-                  <w:r>
-                    <w:t xml:space="preserve">1</w:t>
-                  </w:r>
-                </w:p>
-              </w:tc>
-            </w:tr>
-            <w:tr>
-              <w:tc>
-                <w:tcPr/>
-                <w:p>
-                  <w:pPr>
-                    <w:pStyle w:val="Compact"/>
-                    <w:jc w:val="left"/>
-                    <w:jc w:val="center"/>
-                  </w:pPr>
-                  <w:r>
-                    <w:t xml:space="preserve">M_5_stw</w:t>
-                  </w:r>
-                </w:p>
-              </w:tc>
-              <w:tc>
-                <w:tcPr/>
-                <w:p>
-                  <w:pPr>
-                    <w:pStyle w:val="Compact"/>
-                    <w:jc w:val="left"/>
-                    <w:jc w:val="center"/>
-                  </w:pPr>
-                  <w:r>
-                    <w:t xml:space="preserve">b_exp_600</w:t>
-                  </w:r>
-                </w:p>
-              </w:tc>
-              <w:tc>
-                <w:tcPr/>
-                <w:p>
-                  <w:pPr>
-                    <w:pStyle w:val="Compact"/>
-                    <w:jc w:val="left"/>
-                    <w:jc w:val="center"/>
-                  </w:pPr>
-                  <w:r>
-                    <w:t xml:space="preserve">fixef</w:t>
-                  </w:r>
-                </w:p>
-              </w:tc>
-              <w:tc>
-                <w:tcPr/>
-                <w:p>
-                  <w:pPr>
-                    <w:pStyle w:val="Compact"/>
-                    <w:jc w:val="left"/>
-                    <w:jc w:val="center"/>
-                  </w:pPr>
-                  <w:r>
-                    <w:t xml:space="preserve">exp_600</w:t>
-                  </w:r>
-                </w:p>
-              </w:tc>
-              <w:tc>
-                <w:tcPr/>
-                <w:p>
-                  <w:pPr>
-                    <w:pStyle w:val="Compact"/>
-                    <w:jc w:val="left"/>
-                    <w:jc w:val="center"/>
-                  </w:pPr>
-                  <w:r>
-                    <w:t xml:space="preserve">NA</w:t>
-                  </w:r>
-                </w:p>
-              </w:tc>
-              <w:tc>
-                <w:tcPr/>
-                <w:p>
-                  <w:pPr>
-                    <w:pStyle w:val="Compact"/>
-                    <w:jc w:val="right"/>
-                    <w:jc w:val="center"/>
-                  </w:pPr>
-                  <w:r>
-                    <w:t xml:space="preserve">1</w:t>
-                  </w:r>
-                </w:p>
-              </w:tc>
-            </w:tr>
-            <w:tr>
-              <w:tc>
-                <w:tcPr/>
-                <w:p>
-                  <w:pPr>
-                    <w:pStyle w:val="Compact"/>
-                    <w:jc w:val="left"/>
-                    <w:jc w:val="center"/>
-                  </w:pPr>
-                  <w:r>
-                    <w:t xml:space="preserve">M_5_stw</w:t>
-                  </w:r>
-                </w:p>
-              </w:tc>
-              <w:tc>
-                <w:tcPr/>
-                <w:p>
-                  <w:pPr>
-                    <w:pStyle w:val="Compact"/>
-                    <w:jc w:val="left"/>
-                    <w:jc w:val="center"/>
-                  </w:pPr>
-                  <w:r>
-                    <w:t xml:space="preserve">b_qbr_140</w:t>
-                  </w:r>
-                </w:p>
-              </w:tc>
-              <w:tc>
-                <w:tcPr/>
-                <w:p>
-                  <w:pPr>
-                    <w:pStyle w:val="Compact"/>
-                    <w:jc w:val="left"/>
-                    <w:jc w:val="center"/>
-                  </w:pPr>
-                  <w:r>
-                    <w:t xml:space="preserve">fixef</w:t>
-                  </w:r>
-                </w:p>
-              </w:tc>
-              <w:tc>
-                <w:tcPr/>
-                <w:p>
-                  <w:pPr>
-                    <w:pStyle w:val="Compact"/>
-                    <w:jc w:val="left"/>
-                    <w:jc w:val="center"/>
-                  </w:pPr>
-                  <w:r>
-                    <w:t xml:space="preserve">qbr_140</w:t>
-                  </w:r>
-                </w:p>
-              </w:tc>
-              <w:tc>
-                <w:tcPr/>
-                <w:p>
-                  <w:pPr>
-                    <w:pStyle w:val="Compact"/>
-                    <w:jc w:val="left"/>
-                    <w:jc w:val="center"/>
-                  </w:pPr>
-                  <w:r>
-                    <w:t xml:space="preserve">NA</w:t>
-                  </w:r>
-                </w:p>
-              </w:tc>
-              <w:tc>
-                <w:tcPr/>
-                <w:p>
-                  <w:pPr>
-                    <w:pStyle w:val="Compact"/>
-                    <w:jc w:val="right"/>
-                    <w:jc w:val="center"/>
-                  </w:pPr>
-                  <w:r>
-                    <w:t xml:space="preserve">1</w:t>
-                  </w:r>
-                </w:p>
-              </w:tc>
-            </w:tr>
-            <w:tr>
-              <w:tc>
-                <w:tcPr/>
-                <w:p>
-                  <w:pPr>
-                    <w:pStyle w:val="Compact"/>
-                    <w:jc w:val="left"/>
-                    <w:jc w:val="center"/>
-                  </w:pPr>
-                  <w:r>
-                    <w:t xml:space="preserve">M_5_stw</w:t>
-                  </w:r>
-                </w:p>
-              </w:tc>
-              <w:tc>
-                <w:tcPr/>
-                <w:p>
-                  <w:pPr>
-                    <w:pStyle w:val="Compact"/>
-                    <w:jc w:val="left"/>
-                    <w:jc w:val="center"/>
-                  </w:pPr>
-                  <w:r>
-                    <w:t xml:space="preserve">b_qbr_70</w:t>
-                  </w:r>
-                </w:p>
-              </w:tc>
-              <w:tc>
-                <w:tcPr/>
-                <w:p>
-                  <w:pPr>
-                    <w:pStyle w:val="Compact"/>
-                    <w:jc w:val="left"/>
-                    <w:jc w:val="center"/>
-                  </w:pPr>
-                  <w:r>
-                    <w:t xml:space="preserve">fixef</w:t>
-                  </w:r>
-                </w:p>
-              </w:tc>
-              <w:tc>
-                <w:tcPr/>
-                <w:p>
-                  <w:pPr>
-                    <w:pStyle w:val="Compact"/>
-                    <w:jc w:val="left"/>
-                    <w:jc w:val="center"/>
-                  </w:pPr>
-                  <w:r>
-                    <w:t xml:space="preserve">qbr_70</w:t>
-                  </w:r>
-                </w:p>
-              </w:tc>
-              <w:tc>
-                <w:tcPr/>
-                <w:p>
-                  <w:pPr>
-                    <w:pStyle w:val="Compact"/>
-                    <w:jc w:val="left"/>
-                    <w:jc w:val="center"/>
-                  </w:pPr>
-                  <w:r>
-                    <w:t xml:space="preserve">NA</w:t>
-                  </w:r>
-                </w:p>
-              </w:tc>
-              <w:tc>
-                <w:tcPr/>
-                <w:p>
-                  <w:pPr>
-                    <w:pStyle w:val="Compact"/>
-                    <w:jc w:val="right"/>
-                    <w:jc w:val="center"/>
-                  </w:pPr>
-                  <w:r>
-                    <w:t xml:space="preserve">1</w:t>
-                  </w:r>
-                </w:p>
-              </w:tc>
-            </w:tr>
-            <w:tr>
-              <w:tc>
-                <w:tcPr/>
-                <w:p>
-                  <w:pPr>
-                    <w:pStyle w:val="Compact"/>
-                    <w:jc w:val="left"/>
-                    <w:jc w:val="center"/>
-                  </w:pPr>
-                  <w:r>
-                    <w:t xml:space="preserve">M_5_stw</w:t>
-                  </w:r>
-                </w:p>
-              </w:tc>
-              <w:tc>
-                <w:tcPr/>
-                <w:p>
-                  <w:pPr>
-                    <w:pStyle w:val="Compact"/>
-                    <w:jc w:val="left"/>
-                    <w:jc w:val="center"/>
-                  </w:pPr>
-                  <w:r>
-                    <w:t xml:space="preserve">sd_Part__Control_70</w:t>
-                  </w:r>
-                </w:p>
-              </w:tc>
-              <w:tc>
-                <w:tcPr/>
-                <w:p>
-                  <w:pPr>
-                    <w:pStyle w:val="Compact"/>
-                    <w:jc w:val="left"/>
-                    <w:jc w:val="center"/>
-                  </w:pPr>
-                  <w:r>
-                    <w:t xml:space="preserve">grpef</w:t>
-                  </w:r>
-                </w:p>
-              </w:tc>
-              <w:tc>
-                <w:tcPr/>
-                <w:p>
-                  <w:pPr>
-                    <w:pStyle w:val="Compact"/>
-                    <w:jc w:val="left"/>
-                    <w:jc w:val="center"/>
-                  </w:pPr>
-                  <w:r>
-                    <w:t xml:space="preserve">Control_70</w:t>
-                  </w:r>
-                </w:p>
-              </w:tc>
-              <w:tc>
-                <w:tcPr/>
-                <w:p>
-                  <w:pPr>
-                    <w:pStyle w:val="Compact"/>
-                    <w:jc w:val="left"/>
-                    <w:jc w:val="center"/>
-                  </w:pPr>
-                  <w:r>
-                    <w:t xml:space="preserve">NA</w:t>
-                  </w:r>
-                </w:p>
-              </w:tc>
-              <w:tc>
-                <w:tcPr/>
-                <w:p>
-                  <w:pPr>
-                    <w:pStyle w:val="Compact"/>
-                    <w:jc w:val="right"/>
-                    <w:jc w:val="center"/>
-                  </w:pPr>
-                  <w:r>
-                    <w:t xml:space="preserve">NA</w:t>
-                  </w:r>
-                </w:p>
-              </w:tc>
-            </w:tr>
-            <w:tr>
-              <w:tc>
-                <w:tcPr/>
-                <w:p>
-                  <w:pPr>
-                    <w:pStyle w:val="Compact"/>
-                    <w:jc w:val="left"/>
-                    <w:jc w:val="center"/>
-                  </w:pPr>
-                  <w:r>
-                    <w:t xml:space="preserve">M_5_stw</w:t>
-                  </w:r>
-                </w:p>
-              </w:tc>
-              <w:tc>
-                <w:tcPr/>
-                <w:p>
-                  <w:pPr>
-                    <w:pStyle w:val="Compact"/>
-                    <w:jc w:val="left"/>
-                    <w:jc w:val="center"/>
-                  </w:pPr>
-                  <w:r>
-                    <w:t xml:space="preserve">sd_Part__exp_1000</w:t>
-                  </w:r>
-                </w:p>
-              </w:tc>
-              <w:tc>
-                <w:tcPr/>
-                <w:p>
-                  <w:pPr>
-                    <w:pStyle w:val="Compact"/>
-                    <w:jc w:val="left"/>
-                    <w:jc w:val="center"/>
-                  </w:pPr>
-                  <w:r>
-                    <w:t xml:space="preserve">grpef</w:t>
-                  </w:r>
-                </w:p>
-              </w:tc>
-              <w:tc>
-                <w:tcPr/>
-                <w:p>
-                  <w:pPr>
-                    <w:pStyle w:val="Compact"/>
-                    <w:jc w:val="left"/>
-                    <w:jc w:val="center"/>
-                  </w:pPr>
-                  <w:r>
-                    <w:t xml:space="preserve">exp_1000</w:t>
-                  </w:r>
-                </w:p>
-              </w:tc>
-              <w:tc>
-                <w:tcPr/>
-                <w:p>
-                  <w:pPr>
-                    <w:pStyle w:val="Compact"/>
-                    <w:jc w:val="left"/>
-                    <w:jc w:val="center"/>
-                  </w:pPr>
-                  <w:r>
-                    <w:t xml:space="preserve">NA</w:t>
-                  </w:r>
-                </w:p>
-              </w:tc>
-              <w:tc>
-                <w:tcPr/>
-                <w:p>
-                  <w:pPr>
-                    <w:pStyle w:val="Compact"/>
-                    <w:jc w:val="right"/>
-                    <w:jc w:val="center"/>
-                  </w:pPr>
-                  <w:r>
-                    <w:t xml:space="preserve">NA</w:t>
-                  </w:r>
-                </w:p>
-              </w:tc>
-            </w:tr>
-            <w:tr>
-              <w:tc>
-                <w:tcPr/>
-                <w:p>
-                  <w:pPr>
-                    <w:pStyle w:val="Compact"/>
-                    <w:jc w:val="left"/>
-                    <w:jc w:val="center"/>
-                  </w:pPr>
-                  <w:r>
-                    <w:t xml:space="preserve">M_5_stw</w:t>
-                  </w:r>
-                </w:p>
-              </w:tc>
-              <w:tc>
-                <w:tcPr/>
-                <w:p>
-                  <w:pPr>
-                    <w:pStyle w:val="Compact"/>
-                    <w:jc w:val="left"/>
-                    <w:jc w:val="center"/>
-                  </w:pPr>
-                  <w:r>
-                    <w:t xml:space="preserve">sd_Part__exp_140</w:t>
-                  </w:r>
-                </w:p>
-              </w:tc>
-              <w:tc>
-                <w:tcPr/>
-                <w:p>
-                  <w:pPr>
-                    <w:pStyle w:val="Compact"/>
-                    <w:jc w:val="left"/>
-                    <w:jc w:val="center"/>
-                  </w:pPr>
-                  <w:r>
-                    <w:t xml:space="preserve">grpef</w:t>
-                  </w:r>
-                </w:p>
-              </w:tc>
-              <w:tc>
-                <w:tcPr/>
-                <w:p>
-                  <w:pPr>
-                    <w:pStyle w:val="Compact"/>
-                    <w:jc w:val="left"/>
-                    <w:jc w:val="center"/>
-                  </w:pPr>
-                  <w:r>
-                    <w:t xml:space="preserve">exp_140</w:t>
-                  </w:r>
-                </w:p>
-              </w:tc>
-              <w:tc>
-                <w:tcPr/>
-                <w:p>
-                  <w:pPr>
-                    <w:pStyle w:val="Compact"/>
-                    <w:jc w:val="left"/>
-                    <w:jc w:val="center"/>
-                  </w:pPr>
-                  <w:r>
-                    <w:t xml:space="preserve">NA</w:t>
-                  </w:r>
-                </w:p>
-              </w:tc>
-              <w:tc>
-                <w:tcPr/>
-                <w:p>
-                  <w:pPr>
-                    <w:pStyle w:val="Compact"/>
-                    <w:jc w:val="right"/>
-                    <w:jc w:val="center"/>
-                  </w:pPr>
-                  <w:r>
-                    <w:t xml:space="preserve">NA</w:t>
-                  </w:r>
-                </w:p>
-              </w:tc>
-            </w:tr>
-            <w:tr>
-              <w:tc>
-                <w:tcPr/>
-                <w:p>
-                  <w:pPr>
-                    <w:pStyle w:val="Compact"/>
-                    <w:jc w:val="left"/>
-                    <w:jc w:val="center"/>
-                  </w:pPr>
-                  <w:r>
-                    <w:t xml:space="preserve">M_5_stw</w:t>
-                  </w:r>
-                </w:p>
-              </w:tc>
-              <w:tc>
-                <w:tcPr/>
-                <w:p>
-                  <w:pPr>
-                    <w:pStyle w:val="Compact"/>
-                    <w:jc w:val="left"/>
-                    <w:jc w:val="center"/>
-                  </w:pPr>
-                  <w:r>
-                    <w:t xml:space="preserve">sd_Part__exp_400</w:t>
-                  </w:r>
-                </w:p>
-              </w:tc>
-              <w:tc>
-                <w:tcPr/>
-                <w:p>
-                  <w:pPr>
-                    <w:pStyle w:val="Compact"/>
-                    <w:jc w:val="left"/>
-                    <w:jc w:val="center"/>
-                  </w:pPr>
-                  <w:r>
-                    <w:t xml:space="preserve">grpef</w:t>
-                  </w:r>
-                </w:p>
-              </w:tc>
-              <w:tc>
-                <w:tcPr/>
-                <w:p>
-                  <w:pPr>
-                    <w:pStyle w:val="Compact"/>
-                    <w:jc w:val="left"/>
-                    <w:jc w:val="center"/>
-                  </w:pPr>
-                  <w:r>
-                    <w:t xml:space="preserve">exp_400</w:t>
-                  </w:r>
-                </w:p>
-              </w:tc>
-              <w:tc>
-                <w:tcPr/>
-                <w:p>
-                  <w:pPr>
-                    <w:pStyle w:val="Compact"/>
-                    <w:jc w:val="left"/>
-                    <w:jc w:val="center"/>
-                  </w:pPr>
-                  <w:r>
-                    <w:t xml:space="preserve">NA</w:t>
-                  </w:r>
-                </w:p>
-              </w:tc>
-              <w:tc>
-                <w:tcPr/>
-                <w:p>
-                  <w:pPr>
-                    <w:pStyle w:val="Compact"/>
-                    <w:jc w:val="right"/>
-                    <w:jc w:val="center"/>
-                  </w:pPr>
-                  <w:r>
-                    <w:t xml:space="preserve">NA</w:t>
-                  </w:r>
-                </w:p>
-              </w:tc>
-            </w:tr>
-            <w:tr>
-              <w:tc>
-                <w:tcPr/>
-                <w:p>
-                  <w:pPr>
-                    <w:pStyle w:val="Compact"/>
-                    <w:jc w:val="left"/>
-                    <w:jc w:val="center"/>
-                  </w:pPr>
-                  <w:r>
-                    <w:t xml:space="preserve">M_5_stw</w:t>
-                  </w:r>
-                </w:p>
-              </w:tc>
-              <w:tc>
-                <w:tcPr/>
-                <w:p>
-                  <w:pPr>
-                    <w:pStyle w:val="Compact"/>
-                    <w:jc w:val="left"/>
-                    <w:jc w:val="center"/>
-                  </w:pPr>
-                  <w:r>
-                    <w:t xml:space="preserve">sd_Part__exp_600</w:t>
-                  </w:r>
-                </w:p>
-              </w:tc>
-              <w:tc>
-                <w:tcPr/>
-                <w:p>
-                  <w:pPr>
-                    <w:pStyle w:val="Compact"/>
-                    <w:jc w:val="left"/>
-                    <w:jc w:val="center"/>
-                  </w:pPr>
-                  <w:r>
-                    <w:t xml:space="preserve">grpef</w:t>
-                  </w:r>
-                </w:p>
-              </w:tc>
-              <w:tc>
-                <w:tcPr/>
-                <w:p>
-                  <w:pPr>
-                    <w:pStyle w:val="Compact"/>
-                    <w:jc w:val="left"/>
-                    <w:jc w:val="center"/>
-                  </w:pPr>
-                  <w:r>
-                    <w:t xml:space="preserve">exp_600</w:t>
-                  </w:r>
-                </w:p>
-              </w:tc>
-              <w:tc>
-                <w:tcPr/>
-                <w:p>
-                  <w:pPr>
-                    <w:pStyle w:val="Compact"/>
-                    <w:jc w:val="left"/>
-                    <w:jc w:val="center"/>
-                  </w:pPr>
-                  <w:r>
-                    <w:t xml:space="preserve">NA</w:t>
-                  </w:r>
-                </w:p>
-              </w:tc>
-              <w:tc>
-                <w:tcPr/>
-                <w:p>
-                  <w:pPr>
-                    <w:pStyle w:val="Compact"/>
-                    <w:jc w:val="right"/>
-                    <w:jc w:val="center"/>
-                  </w:pPr>
-                  <w:r>
-                    <w:t xml:space="preserve">NA</w:t>
-                  </w:r>
-                </w:p>
-              </w:tc>
-            </w:tr>
-            <w:tr>
-              <w:tc>
-                <w:tcPr/>
-                <w:p>
-                  <w:pPr>
-                    <w:pStyle w:val="Compact"/>
-                    <w:jc w:val="left"/>
-                    <w:jc w:val="center"/>
-                  </w:pPr>
-                  <w:r>
-                    <w:t xml:space="preserve">M_5_stw</w:t>
-                  </w:r>
-                </w:p>
-              </w:tc>
-              <w:tc>
-                <w:tcPr/>
-                <w:p>
-                  <w:pPr>
-                    <w:pStyle w:val="Compact"/>
-                    <w:jc w:val="left"/>
-                    <w:jc w:val="center"/>
-                  </w:pPr>
-                  <w:r>
-                    <w:t xml:space="preserve">sd_Part__qbr_140</w:t>
-                  </w:r>
-                </w:p>
-              </w:tc>
-              <w:tc>
-                <w:tcPr/>
-                <w:p>
-                  <w:pPr>
-                    <w:pStyle w:val="Compact"/>
-                    <w:jc w:val="left"/>
-                    <w:jc w:val="center"/>
-                  </w:pPr>
-                  <w:r>
-                    <w:t xml:space="preserve">grpef</w:t>
-                  </w:r>
-                </w:p>
-              </w:tc>
-              <w:tc>
-                <w:tcPr/>
-                <w:p>
-                  <w:pPr>
-                    <w:pStyle w:val="Compact"/>
-                    <w:jc w:val="left"/>
-                    <w:jc w:val="center"/>
-                  </w:pPr>
-                  <w:r>
-                    <w:t xml:space="preserve">qbr_140</w:t>
-                  </w:r>
-                </w:p>
-              </w:tc>
-              <w:tc>
-                <w:tcPr/>
-                <w:p>
-                  <w:pPr>
-                    <w:pStyle w:val="Compact"/>
-                    <w:jc w:val="left"/>
-                    <w:jc w:val="center"/>
-                  </w:pPr>
-                  <w:r>
-                    <w:t xml:space="preserve">NA</w:t>
-                  </w:r>
-                </w:p>
-              </w:tc>
-              <w:tc>
-                <w:tcPr/>
-                <w:p>
-                  <w:pPr>
-                    <w:pStyle w:val="Compact"/>
-                    <w:jc w:val="right"/>
-                    <w:jc w:val="center"/>
-                  </w:pPr>
-                  <w:r>
-                    <w:t xml:space="preserve">NA</w:t>
-                  </w:r>
-                </w:p>
-              </w:tc>
-            </w:tr>
-            <w:tr>
-              <w:tc>
-                <w:tcPr/>
-                <w:p>
-                  <w:pPr>
-                    <w:pStyle w:val="Compact"/>
-                    <w:jc w:val="left"/>
-                    <w:jc w:val="center"/>
-                  </w:pPr>
-                  <w:r>
-                    <w:t xml:space="preserve">M_5_stw</w:t>
-                  </w:r>
-                </w:p>
-              </w:tc>
-              <w:tc>
-                <w:tcPr/>
-                <w:p>
-                  <w:pPr>
-                    <w:pStyle w:val="Compact"/>
-                    <w:jc w:val="left"/>
-                    <w:jc w:val="center"/>
-                  </w:pPr>
-                  <w:r>
-                    <w:t xml:space="preserve">sd_Part__qbr_70</w:t>
-                  </w:r>
-                </w:p>
-              </w:tc>
-              <w:tc>
-                <w:tcPr/>
-                <w:p>
-                  <w:pPr>
-                    <w:pStyle w:val="Compact"/>
-                    <w:jc w:val="left"/>
-                    <w:jc w:val="center"/>
-                  </w:pPr>
-                  <w:r>
-                    <w:t xml:space="preserve">grpef</w:t>
-                  </w:r>
-                </w:p>
-              </w:tc>
-              <w:tc>
-                <w:tcPr/>
-                <w:p>
-                  <w:pPr>
-                    <w:pStyle w:val="Compact"/>
-                    <w:jc w:val="left"/>
-                    <w:jc w:val="center"/>
-                  </w:pPr>
-                  <w:r>
-                    <w:t xml:space="preserve">qbr_70</w:t>
-                  </w:r>
-                </w:p>
-              </w:tc>
-              <w:tc>
-                <w:tcPr/>
-                <w:p>
-                  <w:pPr>
-                    <w:pStyle w:val="Compact"/>
-                    <w:jc w:val="left"/>
-                    <w:jc w:val="center"/>
-                  </w:pPr>
-                  <w:r>
-                    <w:t xml:space="preserve">NA</w:t>
-                  </w:r>
-                </w:p>
-              </w:tc>
-              <w:tc>
-                <w:tcPr/>
-                <w:p>
-                  <w:pPr>
-                    <w:pStyle w:val="Compact"/>
-                    <w:jc w:val="right"/>
-                    <w:jc w:val="center"/>
-                  </w:pPr>
-                  <w:r>
-                    <w:t xml:space="preserve">NA</w:t>
-                  </w:r>
-                </w:p>
-              </w:tc>
-            </w:tr>
-            <w:tr>
-              <w:tc>
-                <w:tcPr/>
-                <w:p>
-                  <w:pPr>
-                    <w:pStyle w:val="Compact"/>
-                    <w:jc w:val="left"/>
-                    <w:jc w:val="center"/>
-                  </w:pPr>
-                  <w:r>
-                    <w:t xml:space="preserve">M_5_stw</w:t>
-                  </w:r>
-                </w:p>
-              </w:tc>
-              <w:tc>
-                <w:tcPr/>
-                <w:p>
-                  <w:pPr>
-                    <w:pStyle w:val="Compact"/>
-                    <w:jc w:val="left"/>
-                    <w:jc w:val="center"/>
-                  </w:pPr>
-                  <w:r>
-                    <w:t xml:space="preserve">sd_Stim__Control_70</w:t>
-                  </w:r>
-                </w:p>
-              </w:tc>
-              <w:tc>
-                <w:tcPr/>
-                <w:p>
-                  <w:pPr>
-                    <w:pStyle w:val="Compact"/>
-                    <w:jc w:val="left"/>
-                    <w:jc w:val="center"/>
-                  </w:pPr>
-                  <w:r>
-                    <w:t xml:space="preserve">grpef</w:t>
-                  </w:r>
-                </w:p>
-              </w:tc>
-              <w:tc>
-                <w:tcPr/>
-                <w:p>
-                  <w:pPr>
-                    <w:pStyle w:val="Compact"/>
-                    <w:jc w:val="left"/>
-                    <w:jc w:val="center"/>
-                  </w:pPr>
-                  <w:r>
-                    <w:t xml:space="preserve">Control_70</w:t>
-                  </w:r>
-                </w:p>
-              </w:tc>
-              <w:tc>
-                <w:tcPr/>
-                <w:p>
-                  <w:pPr>
-                    <w:pStyle w:val="Compact"/>
-                    <w:jc w:val="left"/>
-                    <w:jc w:val="center"/>
-                  </w:pPr>
-                  <w:r>
-                    <w:t xml:space="preserve">NA</w:t>
-                  </w:r>
-                </w:p>
-              </w:tc>
-              <w:tc>
-                <w:tcPr/>
-                <w:p>
-                  <w:pPr>
-                    <w:pStyle w:val="Compact"/>
-                    <w:jc w:val="right"/>
-                    <w:jc w:val="center"/>
-                  </w:pPr>
-                  <w:r>
-                    <w:t xml:space="preserve">NA</w:t>
-                  </w:r>
-                </w:p>
-              </w:tc>
-            </w:tr>
-            <w:tr>
-              <w:tc>
-                <w:tcPr/>
-                <w:p>
-                  <w:pPr>
-                    <w:pStyle w:val="Compact"/>
-                    <w:jc w:val="left"/>
-                    <w:jc w:val="center"/>
-                  </w:pPr>
-                  <w:r>
-                    <w:t xml:space="preserve">M_5_stw</w:t>
-                  </w:r>
-                </w:p>
-              </w:tc>
-              <w:tc>
-                <w:tcPr/>
-                <w:p>
-                  <w:pPr>
-                    <w:pStyle w:val="Compact"/>
-                    <w:jc w:val="left"/>
-                    <w:jc w:val="center"/>
-                  </w:pPr>
-                  <w:r>
-                    <w:t xml:space="preserve">sd_Stim__exp_140</w:t>
-                  </w:r>
-                </w:p>
-              </w:tc>
-              <w:tc>
-                <w:tcPr/>
-                <w:p>
-                  <w:pPr>
-                    <w:pStyle w:val="Compact"/>
-                    <w:jc w:val="left"/>
-                    <w:jc w:val="center"/>
-                  </w:pPr>
-                  <w:r>
-                    <w:t xml:space="preserve">grpef</w:t>
-                  </w:r>
-                </w:p>
-              </w:tc>
-              <w:tc>
-                <w:tcPr/>
-                <w:p>
-                  <w:pPr>
-                    <w:pStyle w:val="Compact"/>
-                    <w:jc w:val="left"/>
-                    <w:jc w:val="center"/>
-                  </w:pPr>
-                  <w:r>
-                    <w:t xml:space="preserve">exp_140</w:t>
-                  </w:r>
-                </w:p>
-              </w:tc>
-              <w:tc>
-                <w:tcPr/>
-                <w:p>
-                  <w:pPr>
-                    <w:pStyle w:val="Compact"/>
-                    <w:jc w:val="left"/>
-                    <w:jc w:val="center"/>
-                  </w:pPr>
-                  <w:r>
-                    <w:t xml:space="preserve">NA</w:t>
-                  </w:r>
-                </w:p>
-              </w:tc>
-              <w:tc>
-                <w:tcPr/>
-                <w:p>
-                  <w:pPr>
-                    <w:pStyle w:val="Compact"/>
-                    <w:jc w:val="right"/>
-                    <w:jc w:val="center"/>
-                  </w:pPr>
-                  <w:r>
-                    <w:t xml:space="preserve">NA</w:t>
-                  </w:r>
-                </w:p>
-              </w:tc>
-            </w:tr>
-            <w:tr>
-              <w:tc>
-                <w:tcPr/>
-                <w:p>
-                  <w:pPr>
-                    <w:pStyle w:val="Compact"/>
-                    <w:jc w:val="left"/>
-                    <w:jc w:val="center"/>
-                  </w:pPr>
-                  <w:r>
-                    <w:t xml:space="preserve">M_5_stw</w:t>
-                  </w:r>
-                </w:p>
-              </w:tc>
-              <w:tc>
-                <w:tcPr/>
-                <w:p>
-                  <w:pPr>
-                    <w:pStyle w:val="Compact"/>
-                    <w:jc w:val="left"/>
-                    <w:jc w:val="center"/>
-                  </w:pPr>
-                  <w:r>
-                    <w:t xml:space="preserve">sd_Stim__qbr_140</w:t>
-                  </w:r>
-                </w:p>
-              </w:tc>
-              <w:tc>
-                <w:tcPr/>
-                <w:p>
-                  <w:pPr>
-                    <w:pStyle w:val="Compact"/>
-                    <w:jc w:val="left"/>
-                    <w:jc w:val="center"/>
-                  </w:pPr>
-                  <w:r>
-                    <w:t xml:space="preserve">grpef</w:t>
-                  </w:r>
-                </w:p>
-              </w:tc>
-              <w:tc>
-                <w:tcPr/>
-                <w:p>
-                  <w:pPr>
-                    <w:pStyle w:val="Compact"/>
-                    <w:jc w:val="left"/>
-                    <w:jc w:val="center"/>
-                  </w:pPr>
-                  <w:r>
-                    <w:t xml:space="preserve">qbr_140</w:t>
-                  </w:r>
-                </w:p>
-              </w:tc>
-              <w:tc>
-                <w:tcPr/>
-                <w:p>
-                  <w:pPr>
-                    <w:pStyle w:val="Compact"/>
-                    <w:jc w:val="left"/>
-                    <w:jc w:val="center"/>
-                  </w:pPr>
-                  <w:r>
-                    <w:t xml:space="preserve">NA</w:t>
-                  </w:r>
-                </w:p>
-              </w:tc>
-              <w:tc>
-                <w:tcPr/>
-                <w:p>
-                  <w:pPr>
-                    <w:pStyle w:val="Compact"/>
-                    <w:jc w:val="right"/>
-                    <w:jc w:val="center"/>
-                  </w:pPr>
-                  <w:r>
-                    <w:t xml:space="preserve">NA</w:t>
-                  </w:r>
-                </w:p>
-              </w:tc>
-            </w:tr>
-            <w:tr>
-              <w:tc>
-                <w:tcPr/>
-                <w:p>
-                  <w:pPr>
-                    <w:pStyle w:val="Compact"/>
-                    <w:jc w:val="left"/>
-                    <w:jc w:val="center"/>
-                  </w:pPr>
-                  <w:r>
-                    <w:t xml:space="preserve">M_5_stw</w:t>
-                  </w:r>
-                </w:p>
-              </w:tc>
-              <w:tc>
-                <w:tcPr/>
-                <w:p>
-                  <w:pPr>
-                    <w:pStyle w:val="Compact"/>
-                  </w:pPr>
-                </w:p>
-              </w:tc>
-              <w:tc>
-                <w:tcPr/>
-                <w:p>
-                  <w:pPr>
-                    <w:pStyle w:val="Compact"/>
-                    <w:jc w:val="left"/>
-                    <w:jc w:val="center"/>
-                  </w:pPr>
-                  <w:r>
-                    <w:t xml:space="preserve">cor</w:t>
-                  </w:r>
-                </w:p>
-              </w:tc>
-              <w:tc>
-                <w:tcPr/>
-                <w:p>
-                  <w:pPr>
-                    <w:pStyle w:val="Compact"/>
-                    <w:jc w:val="left"/>
-                    <w:jc w:val="center"/>
-                  </w:pPr>
-                  <w:r>
-                    <w:t xml:space="preserve">NA</w:t>
-                  </w:r>
-                </w:p>
-              </w:tc>
-              <w:tc>
-                <w:tcPr/>
-                <w:p>
-                  <w:pPr>
-                    <w:pStyle w:val="Compact"/>
-                    <w:jc w:val="left"/>
-                    <w:jc w:val="center"/>
-                  </w:pPr>
-                  <w:r>
-                    <w:t xml:space="preserve">NA</w:t>
-                  </w:r>
-                </w:p>
-              </w:tc>
-              <w:tc>
-                <w:tcPr/>
-                <w:p>
-                  <w:pPr>
-                    <w:pStyle w:val="Compact"/>
-                    <w:jc w:val="right"/>
-                    <w:jc w:val="center"/>
-                  </w:pPr>
-                  <w:r>
-                    <w:t xml:space="preserve">24</w:t>
-                  </w:r>
-                </w:p>
-              </w:tc>
-            </w:tr>
-          </w:tbl>
           <w:tbl>
             <w:tblPr>
               <w:tblStyle w:val="Table"/>
@@ -5587,91 +3304,10 @@
         <w:t xml:space="preserve">The disadvantage of Quadbright is fully consistent only at 70ms. In contrast, the ability to read Quadbright signals varies dramatically between participants and conditions. Even a group of super-performers exists (first six), where accuracy matches or even exceeds the control condition. This group is also characterized by an enormous difference between 70ms and 400ms, sometimes with an intermediate step at 140ms.</w:t>
       </w:r>
     </w:p>
-    <w:tbl>
-      <w:tblPr>
-        <w:tblStyle w:val="Table"/>
-        <w:tblW w:type="pct" w:w="5000"/>
-        <w:tblLayout w:type="fixed"/>
-        <w:tblLook w:firstRow="0" w:lastRow="0" w:firstColumn="0" w:lastColumn="0" w:noHBand="0" w:noVBand="0" w:val="0000"/>
-      </w:tblPr>
-      <w:tblGrid>
-        <w:gridCol w:w="7920"/>
-      </w:tblGrid>
-      <w:tr>
-        <w:tc>
-          <w:tcPr/>
-          <w:bookmarkStart w:id="87" w:name="fig-participant-trajectories"/>
-          <w:p>
-            <w:pPr>
-              <w:pStyle w:val="Compact"/>
-              <w:jc w:val="center"/>
-            </w:pPr>
-            <w:bookmarkStart w:id="86" w:name="fig-participant-trajectories"/>
-            <w:r>
-              <w:drawing>
-                <wp:inline>
-                  <wp:extent cx="5334000" cy="4000500"/>
-                  <wp:effectExtent b="0" l="0" r="0" t="0"/>
-                  <wp:docPr descr="" title="" id="84" name="Picture"/>
-                  <a:graphic>
-                    <a:graphicData uri="http://schemas.openxmlformats.org/drawingml/2006/picture">
-                      <pic:pic>
-                        <pic:nvPicPr>
-                          <pic:cNvPr descr="YET_CEHR_files/figure-docx/fig-participant-trajectories-1.png" id="85" name="Picture"/>
-                          <pic:cNvPicPr>
-                            <a:picLocks noChangeArrowheads="1" noChangeAspect="1"/>
-                          </pic:cNvPicPr>
-                        </pic:nvPicPr>
-                        <pic:blipFill>
-                          <a:blip r:embed="rId83"/>
-                          <a:stretch>
-                            <a:fillRect/>
-                          </a:stretch>
-                        </pic:blipFill>
-                        <pic:spPr bwMode="auto">
-                          <a:xfrm>
-                            <a:off x="0" y="0"/>
-                            <a:ext cx="5334000" cy="4000500"/>
-                          </a:xfrm>
-                          <a:prstGeom prst="rect">
-                            <a:avLst/>
-                          </a:prstGeom>
-                          <a:noFill/>
-                          <a:ln w="9525">
-                            <a:noFill/>
-                            <a:headEnd/>
-                            <a:tailEnd/>
-                          </a:ln>
-                        </pic:spPr>
-                      </pic:pic>
-                    </a:graphicData>
-                  </a:graphic>
-                </wp:inline>
-              </w:drawing>
-            </w:r>
-            <w:bookmarkEnd w:id="86"/>
-          </w:p>
-          <w:p>
-            <w:pPr>
-              <w:jc w:val="center"/>
-            </w:pPr>
-            <w:pPr>
-              <w:jc w:val="left"/>
-              <w:spacing w:before="200"/>
-              <w:pStyle w:val="ImageCaption"/>
-            </w:pPr>
-            <w:r>
-              <w:t xml:space="preserve">Figure 8</w:t>
-            </w:r>
-          </w:p>
-          <w:bookmarkEnd w:id="87"/>
-        </w:tc>
-      </w:tr>
-    </w:tbl>
-    <w:bookmarkEnd w:id="88"/>
-    <w:bookmarkEnd w:id="89"/>
-    <w:bookmarkEnd w:id="90"/>
-    <w:bookmarkStart w:id="96" w:name="discussion"/>
+    <w:bookmarkEnd w:id="83"/>
+    <w:bookmarkEnd w:id="84"/>
+    <w:bookmarkEnd w:id="85"/>
+    <w:bookmarkStart w:id="91" w:name="discussion"/>
     <w:p>
       <w:pPr>
         <w:pStyle w:val="Heading1"/>
@@ -5712,7 +3348,7 @@
         <w:t xml:space="preserve">For theory-forming an important issue to discuss is whether observations in the Quadbright condition justify to speak of a secondary receiver, which operates on brightness levels and could be the progenitor mechanism according to the Cue-before-signal principle.</w:t>
       </w:r>
     </w:p>
-    <w:bookmarkStart w:id="91" w:name="the-effective-sender"/>
+    <w:bookmarkStart w:id="86" w:name="the-effective-sender"/>
     <w:p>
       <w:pPr>
         <w:pStyle w:val="Heading2"/>
@@ -5845,7 +3481,7 @@
         <w:pStyle w:val="BodyText"/>
       </w:pPr>
       <w:r>
-        <w:t xml:space="preserve">Still, other features of the human eye morphology may have co-evolved with the receiver mechanism. From a computational perspective, it is surprising that the human eyeball produces highly linear gradients, as spinning spherical objects generally produce sinusoidal signals. It is possible that other features have evolved to improve the linearity of the response, such as the high ratio of exposed sclera</w:t>
+        <w:t xml:space="preserve">While the white sclera has certainly not evolved to be a clear signal in the first place, other features of the human eye morphology may have co-evolved with the receiver mechanism. From a computational perspective, it is surprising that the human eyeball produces highly linear gradients, as spinning spherical objects generally produce sinusoidal signals. It is possible that other features have evolved to improve the linearity of the response, such as the high ratio of exposed sclera</w:t>
       </w:r>
       <w:r>
         <w:t xml:space="preserve"> </w:t>
@@ -5857,94 +3493,7 @@
         <w:t xml:space="preserve"> </w:t>
       </w:r>
       <w:r>
-        <w:t xml:space="preserve">or the shape of the eye lids. A testable consequence of this idea is that Quadbright devices are less effective for eye direction reading on other primate species, supposed they had a white sclera.</w:t>
-      </w:r>
-    </w:p>
-    <w:bookmarkEnd w:id="91"/>
-    <w:bookmarkStart w:id="92" w:name="evolution-of-the-receving-end"/>
-    <w:p>
-      <w:pPr>
-        <w:pStyle w:val="Heading2"/>
-      </w:pPr>
-      <w:r>
-        <w:t xml:space="preserve">Evolution of the receving end</w:t>
-      </w:r>
-    </w:p>
-    <w:p>
-      <w:pPr>
-        <w:pStyle w:val="FirstParagraph"/>
-      </w:pPr>
-      <w:r>
-        <w:t xml:space="preserve">By construction we have shown that a simple linear decoder suffices to read glance directions from depigmented eyeballs with astonishing accuracy. This supports the idea that a primitive receiver could have existed prior to the evolution of white sclera. However, our results clearly show that human eyeball reading is is not a Quadbright device. A more complex receiver exists, which is extremely fast and accurate.</w:t>
-      </w:r>
-    </w:p>
-    <w:p>
-      <w:pPr>
-        <w:pStyle w:val="BodyText"/>
-      </w:pPr>
-      <w:r>
-        <w:t xml:space="preserve">While most participants were less accurate with degraded images, the majority of the participants was still much beyond guessing. Importantly, in the Quadbright condition, the rigorous data compression forbids any more advanced receiver gradients to reliably process images. We can assume that performance in the Quadbright condition relies solely on brightness differences.</w:t>
-      </w:r>
-    </w:p>
-    <w:p>
-      <w:pPr>
-        <w:pStyle w:val="BodyText"/>
-      </w:pPr>
-      <w:r>
-        <w:t xml:space="preserve">We can therefore conclude that a minimum of two receivers exist for eye direction reading. The first one is based on brightness gradients with moderate accuracy, and the second one extracts higher-level features for high accuracy. This idea is inline with a evolutionary process where a rudimentary cue receiver paves the way for the co-evolution of a signal and more advanced receiver. Usually, one would assume that the more advanced receiver evolves from primitive mechanism, effectively replacing it. Here it could be that the primitive receiver is still present, albeit with stark individual performance differences.</w:t>
-      </w:r>
-    </w:p>
-    <w:p>
-      <w:pPr>
-        <w:pStyle w:val="BodyText"/>
-      </w:pPr>
-      <w:r>
-        <w:t xml:space="preserve">If the Quadbright receiver existed prior to the de-pigmentation event and was just acquiring another function, there is no reason it should vanish when being replaced by the follower. A stronger theory is that both receivers co-exist, as they provide different functions. This has previously been proposed by</w:t>
-      </w:r>
-      <w:r>
-        <w:t xml:space="preserve"> </w:t>
-      </w:r>
-      <w:r>
-        <w:t xml:space="preserve">Anderson et al. (2016)</w:t>
-      </w:r>
-      <w:r>
-        <w:t xml:space="preserve">, who argue that there may be different mechanisms for precise gaze triangulation and coarse judgement of direction. By using a contrast reversal manipulation they showed that the first depends on geometric cues, whereas the second depends on luminance and motion cues.</w:t>
-      </w:r>
-    </w:p>
-    <w:p>
-      <w:pPr>
-        <w:pStyle w:val="BodyText"/>
-      </w:pPr>
-      <w:r>
-        <w:t xml:space="preserve">[ventral vs dorsal processing]</w:t>
-      </w:r>
-    </w:p>
-    <w:bookmarkEnd w:id="92"/>
-    <w:bookmarkStart w:id="93" w:name="limitations"/>
-    <w:p>
-      <w:pPr>
-        <w:pStyle w:val="Heading2"/>
-      </w:pPr>
-      <w:r>
-        <w:t xml:space="preserve">Limitations</w:t>
-      </w:r>
-    </w:p>
-    <w:bookmarkEnd w:id="93"/>
-    <w:bookmarkStart w:id="94" w:name="future-research"/>
-    <w:p>
-      <w:pPr>
-        <w:pStyle w:val="Heading2"/>
-      </w:pPr>
-      <w:r>
-        <w:t xml:space="preserve">Future research</w:t>
-      </w:r>
-    </w:p>
-    <w:p>
-      <w:pPr>
-        <w:pStyle w:val="FirstParagraph"/>
-      </w:pPr>
-      <w:r>
-        <w:t xml:space="preserve">Speculating about how receiver mechanisms evolved, and how many there exist is fascinating, but more research needs to be conducted to make good for the fact that we cannot truly experiment with evolution in this case. Still, there are testable hypotheses that can be derived from the current results. In particular, we can make specific predictions about the alleged pregenitor receiver. It may have provided two fitness advantages: providing coarse direction signals in the peripheral field or over a distance, or signalling</w:t>
+        <w:t xml:space="preserve">or the shape of the eye lids. A testable consequence of this idea is that Quadbright devices are less effective for eye direction reading on other primate species,</w:t>
       </w:r>
       <w:r>
         <w:t xml:space="preserve"> </w:t>
@@ -5954,13 +3503,31 @@
           <w:i/>
           <w:iCs/>
         </w:rPr>
-        <w:t xml:space="preserve">change</w:t>
-      </w:r>
-      <w:r>
-        <w:t xml:space="preserve"> </w:t>
-      </w:r>
-      <w:r>
-        <w:t xml:space="preserve">of glance direction. Both capabilities can be tested experimentally.</w:t>
+        <w:t xml:space="preserve">supposed</w:t>
+      </w:r>
+      <w:r>
+        <w:t xml:space="preserve"> </w:t>
+      </w:r>
+      <w:r>
+        <w:t xml:space="preserve">they had a white sclera.</w:t>
+      </w:r>
+    </w:p>
+    <w:bookmarkEnd w:id="86"/>
+    <w:bookmarkStart w:id="87" w:name="evolution-of-the-receiving-end"/>
+    <w:p>
+      <w:pPr>
+        <w:pStyle w:val="Heading2"/>
+      </w:pPr>
+      <w:r>
+        <w:t xml:space="preserve">Evolution of the receiving end</w:t>
+      </w:r>
+    </w:p>
+    <w:p>
+      <w:pPr>
+        <w:pStyle w:val="FirstParagraph"/>
+      </w:pPr>
+      <w:r>
+        <w:t xml:space="preserve">By construction we have shown that a simple linear decoder suffices to read glance directions from depigmented eyeballs with astonishing accuracy. This supports the idea that a primitive receiver could have existed prior to the evolution of white sclera. However, our results clearly show that human eyeball reading is is not a Quadbright device. A more complex receiver exists, which is extremely fast and accurate.</w:t>
       </w:r>
     </w:p>
     <w:p>
@@ -5968,7 +3535,7 @@
         <w:pStyle w:val="BodyText"/>
       </w:pPr>
       <w:r>
-        <w:t xml:space="preserve">Studying how eye direction cues establish shared attention also has impact in at least two modern fields of application. One open problem in transport is how automated vehicles can effectively communicate attention and intentions with human traffic members. For example, making eye contact is often observed in communication between drivers and street-crossing pedestrians. External human-machine interfaces (e-HMI) have been tested for communication on the outside of cars, using text, icons and facial expressions. Understanding the role and processing modes of eye direction reading can be used to design more efficient signals.</w:t>
+        <w:t xml:space="preserve">While most participants were less accurate with degraded images, the majority of the participants was still much beyond guessing. Importantly, in the Quadbright condition, the rigorous data compression forbids any more advanced receiver gradients to reliably process images. We can assume that performance in the Quadbright condition relies solely on brightness differences.</w:t>
       </w:r>
     </w:p>
     <w:p>
@@ -5976,7 +3543,13 @@
         <w:pStyle w:val="BodyText"/>
       </w:pPr>
       <w:r>
-        <w:t xml:space="preserve">Another field of application is the design of artificial faces. In social robotics, robot faces are often designed to be expressive, and the role of glance reading in human-robot interaction is well established. However, designing more human-like eye regions for this purpose may result in an adverse effect known as the Uncanny Valley. Artificial faces that are too human-like, but not quite right, are perceived as creepy. The results of this study suggest that degraded eye regions can convey glance directions, which could facilitate the quality of interaction, without falling into the Uncanny Valley.</w:t>
+        <w:t xml:space="preserve">We can therefore conclude that a minimum of two receivers exists for eye direction reading. The first one is based on brightness gradients with moderate accuracy, and the second one extracts higher-level features for high accuracy.</w:t>
+      </w:r>
+      <w:r>
+        <w:br/>
+      </w:r>
+      <w:r>
+        <w:t xml:space="preserve">This idea is inline with a evolutionary process where cue receiver paves the way for the co-evolution of a signal and receiver, except that in this case the primitive receiver still seems exists, implying that the advanced receiver emerged from a different structure.</w:t>
       </w:r>
     </w:p>
     <w:p>
@@ -5984,17 +3557,44 @@
         <w:pStyle w:val="BodyText"/>
       </w:pPr>
       <w:r>
-        <w:t xml:space="preserve">Finally, the eye tracker we build to test our ideas about the receiving end has already been used extensively for bachelor-level student projects. With some refinement it could deliver sufficient accuracy for many psychological experiments and applied research studies, with the added benefit of being much easier to replicate for everyone than with using commercial eye tracking devices.</w:t>
-      </w:r>
-    </w:p>
-    <w:bookmarkEnd w:id="94"/>
-    <w:bookmarkStart w:id="95" w:name="conclusion-1"/>
+        <w:t xml:space="preserve">An even stronger theory is that both receivers co-exist as they provide different functions. This has previously been proposed by</w:t>
+      </w:r>
+      <w:r>
+        <w:t xml:space="preserve"> </w:t>
+      </w:r>
+      <w:r>
+        <w:t xml:space="preserve">Anderson et al. (2016)</w:t>
+      </w:r>
+      <w:r>
+        <w:t xml:space="preserve">, who argue that there may be different mechanisms for precise gaze triangulation and coarse judgement of direction. By using a contrast reversal manipulation they showed that the first depends on geometric cues, whereas the second depends on luminance and motion cues.</w:t>
+      </w:r>
+    </w:p>
+    <w:p>
+      <w:pPr>
+        <w:pStyle w:val="BodyText"/>
+      </w:pPr>
+      <w:r>
+        <w:t xml:space="preserve">[ventral vs dorsal processing]</w:t>
+      </w:r>
+    </w:p>
+    <w:bookmarkEnd w:id="87"/>
+    <w:bookmarkStart w:id="88" w:name="limitations"/>
     <w:p>
       <w:pPr>
         <w:pStyle w:val="Heading2"/>
       </w:pPr>
       <w:r>
-        <w:t xml:space="preserve">Conclusion</w:t>
+        <w:t xml:space="preserve">Limitations</w:t>
+      </w:r>
+    </w:p>
+    <w:bookmarkEnd w:id="88"/>
+    <w:bookmarkStart w:id="89" w:name="future-research"/>
+    <w:p>
+      <w:pPr>
+        <w:pStyle w:val="Heading2"/>
+      </w:pPr>
+      <w:r>
+        <w:t xml:space="preserve">Future research</w:t>
       </w:r>
     </w:p>
     <w:p>
@@ -6002,28 +3602,7 @@
         <w:pStyle w:val="FirstParagraph"/>
       </w:pPr>
       <w:r>
-        <w:t xml:space="preserve">The Cooperative Eye Hypothesis implies that eyes with a visible white sclera is sending exceptionally clear signals about gaze directions. While previous research made this assumption based on face validity, the successful implementation of the simplistic eye tracking algorithm supports this idea. By showing that humans can read glance directions under Quadbright conditions, but with reduced accuracy, lends support for multi-receiver theories, as well as the cue-before-signal theory of evolutionary origins.</w:t>
-      </w:r>
-    </w:p>
-    <w:bookmarkEnd w:id="95"/>
-    <w:bookmarkEnd w:id="96"/>
-    <w:bookmarkStart w:id="159" w:name="references"/>
-    <w:p>
-      <w:pPr>
-        <w:pStyle w:val="Heading1"/>
-      </w:pPr>
-      <w:r>
-        <w:t xml:space="preserve">References</w:t>
-      </w:r>
-    </w:p>
-    <w:bookmarkStart w:id="158" w:name="refs"/>
-    <w:bookmarkStart w:id="98" w:name="ref-Anderson2016"/>
-    <w:p>
-      <w:pPr>
-        <w:pStyle w:val="Bibliography"/>
-      </w:pPr>
-      <w:r>
-        <w:t xml:space="preserve">Anderson, N. C., Risko, E. F., &amp; Kingstone, A. (2016). Motion influences gaze direction discrimination and disambiguates contradictory luminance cues.</w:t>
+        <w:t xml:space="preserve">Speculating about how receiver mechanisms evolved, and how many there exist is fascinating, but more research needs to be conducted to make good for the fact that we cannot truly experiment with evolution in this case. Still, there are testable hypotheses that can be derived from the current results. In particular, we can make specific predictions about the alleged pregenitor receiver. It may have provided two fitness advantages: providing coarse direction signals in the peripheral field or over a distance, or signalling</w:t>
       </w:r>
       <w:r>
         <w:t xml:space="preserve"> </w:t>
@@ -6033,10 +3612,76 @@
           <w:i/>
           <w:iCs/>
         </w:rPr>
-        <w:t xml:space="preserve">Psychonomic Bulletin and Review</w:t>
-      </w:r>
-      <w:r>
-        <w:t xml:space="preserve">,</w:t>
+        <w:t xml:space="preserve">change</w:t>
+      </w:r>
+      <w:r>
+        <w:t xml:space="preserve"> </w:t>
+      </w:r>
+      <w:r>
+        <w:t xml:space="preserve">of glance direction. Both capabilities can be tested experimentally.</w:t>
+      </w:r>
+    </w:p>
+    <w:p>
+      <w:pPr>
+        <w:pStyle w:val="BodyText"/>
+      </w:pPr>
+      <w:r>
+        <w:t xml:space="preserve">Studying how eye direction cues establish shared attention also has impact in at least two modern fields of application. One open problem in transport is how automated vehicles can effectively communicate attention and intentions with human traffic members. For example, making eye contact is often observed in communication between drivers and street-crossing pedestrians. External human-machine interfaces (e-HMI) have been tested for communication on the outside of cars, using text, icons and facial expressions. Understanding the role and processing modes of eye direction reading can be used to design more efficient signals.</w:t>
+      </w:r>
+    </w:p>
+    <w:p>
+      <w:pPr>
+        <w:pStyle w:val="BodyText"/>
+      </w:pPr>
+      <w:r>
+        <w:t xml:space="preserve">Another field of application is the design of artificial faces. In social robotics, robot faces are often designed to be expressive, and the role of glance reading in human-robot interaction is well established. However, designing more human-like eye regions for this purpose may result in an adverse effect known as the Uncanny Valley. Artificial faces that are too human-like, but not quite right, are perceived as creepy. The results of this study suggest that degraded eye regions can convey glance directions, which could facilitate the quality of interaction, without falling into the Uncanny Valley.</w:t>
+      </w:r>
+    </w:p>
+    <w:p>
+      <w:pPr>
+        <w:pStyle w:val="BodyText"/>
+      </w:pPr>
+      <w:r>
+        <w:t xml:space="preserve">Finally, the eye tracker we build to test our ideas about the receiving end has already been used extensively for bachelor-level student projects. With some refinement it could deliver sufficient accuracy for many psychological experiments and applied research studies, with the added benefit of being much easier to replicate for everyone than with using commercial eye tracking devices.</w:t>
+      </w:r>
+    </w:p>
+    <w:bookmarkEnd w:id="89"/>
+    <w:bookmarkStart w:id="90" w:name="conclusion-1"/>
+    <w:p>
+      <w:pPr>
+        <w:pStyle w:val="Heading2"/>
+      </w:pPr>
+      <w:r>
+        <w:t xml:space="preserve">Conclusion</w:t>
+      </w:r>
+    </w:p>
+    <w:p>
+      <w:pPr>
+        <w:pStyle w:val="FirstParagraph"/>
+      </w:pPr>
+      <w:r>
+        <w:t xml:space="preserve">The Cooperative Eye Hypothesis implies that eyes with a visible white sclera is sending exceptionally clear signals about gaze directions. While previous research made this assumption based on face validity, the successful implementation of the simplistic eye tracking algorithm supports this idea. By showing that humans can read glance directions under Quadbright conditions, but with reduced accuracy, lends support for multi-receiver theories, as well as the cue-before-signal theory of evolutionary origins.</w:t>
+      </w:r>
+    </w:p>
+    <w:bookmarkEnd w:id="90"/>
+    <w:bookmarkEnd w:id="91"/>
+    <w:bookmarkStart w:id="154" w:name="references"/>
+    <w:p>
+      <w:pPr>
+        <w:pStyle w:val="Heading1"/>
+      </w:pPr>
+      <w:r>
+        <w:t xml:space="preserve">References</w:t>
+      </w:r>
+    </w:p>
+    <w:bookmarkStart w:id="153" w:name="refs"/>
+    <w:bookmarkStart w:id="93" w:name="ref-Anderson2016"/>
+    <w:p>
+      <w:pPr>
+        <w:pStyle w:val="Bibliography"/>
+      </w:pPr>
+      <w:r>
+        <w:t xml:space="preserve">Anderson, N. C., Risko, E. F., &amp; Kingstone, A. (2016). Motion influences gaze direction discrimination and disambiguates contradictory luminance cues.</w:t>
       </w:r>
       <w:r>
         <w:t xml:space="preserve"> </w:t>
@@ -6046,6 +3691,19 @@
           <w:i/>
           <w:iCs/>
         </w:rPr>
+        <w:t xml:space="preserve">Psychonomic Bulletin and Review</w:t>
+      </w:r>
+      <w:r>
+        <w:t xml:space="preserve">,</w:t>
+      </w:r>
+      <w:r>
+        <w:t xml:space="preserve"> </w:t>
+      </w:r>
+      <w:r>
+        <w:rPr>
+          <w:i/>
+          <w:iCs/>
+        </w:rPr>
         <w:t xml:space="preserve">23</w:t>
       </w:r>
       <w:r>
@@ -6054,7 +3712,7 @@
       <w:r>
         <w:t xml:space="preserve"> </w:t>
       </w:r>
-      <w:hyperlink r:id="rId97">
+      <w:hyperlink r:id="rId92">
         <w:r>
           <w:rPr>
             <w:rStyle w:val="Hyperlink"/>
@@ -6063,8 +3721,8 @@
         </w:r>
       </w:hyperlink>
     </w:p>
-    <w:bookmarkEnd w:id="98"/>
-    <w:bookmarkStart w:id="100" w:name="ref-Babinet2021"/>
+    <w:bookmarkEnd w:id="93"/>
+    <w:bookmarkStart w:id="95" w:name="ref-Babinet2021"/>
     <w:p>
       <w:pPr>
         <w:pStyle w:val="Bibliography"/>
@@ -6101,7 +3759,7 @@
       <w:r>
         <w:t xml:space="preserve"> </w:t>
       </w:r>
-      <w:hyperlink r:id="rId99">
+      <w:hyperlink r:id="rId94">
         <w:r>
           <w:rPr>
             <w:rStyle w:val="Hyperlink"/>
@@ -6110,8 +3768,8 @@
         </w:r>
       </w:hyperlink>
     </w:p>
-    <w:bookmarkEnd w:id="100"/>
-    <w:bookmarkStart w:id="102" w:name="ref-Bakker2022"/>
+    <w:bookmarkEnd w:id="95"/>
+    <w:bookmarkStart w:id="97" w:name="ref-Bakker2022"/>
     <w:p>
       <w:pPr>
         <w:pStyle w:val="Bibliography"/>
@@ -6138,7 +3796,7 @@
       <w:r>
         <w:t xml:space="preserve"> </w:t>
       </w:r>
-      <w:hyperlink r:id="rId101">
+      <w:hyperlink r:id="rId96">
         <w:r>
           <w:rPr>
             <w:rStyle w:val="Hyperlink"/>
@@ -6147,8 +3805,8 @@
         </w:r>
       </w:hyperlink>
     </w:p>
-    <w:bookmarkEnd w:id="102"/>
-    <w:bookmarkStart w:id="104" w:name="ref-BARONCOHEN1995"/>
+    <w:bookmarkEnd w:id="97"/>
+    <w:bookmarkStart w:id="99" w:name="ref-BARONCOHEN1995"/>
     <w:p>
       <w:pPr>
         <w:pStyle w:val="Bibliography"/>
@@ -6172,7 +3830,7 @@
       <w:r>
         <w:t xml:space="preserve"> </w:t>
       </w:r>
-      <w:hyperlink r:id="rId103">
+      <w:hyperlink r:id="rId98">
         <w:r>
           <w:rPr>
             <w:rStyle w:val="Hyperlink"/>
@@ -6181,8 +3839,8 @@
         </w:r>
       </w:hyperlink>
     </w:p>
-    <w:bookmarkEnd w:id="104"/>
-    <w:bookmarkStart w:id="106" w:name="ref-Bender2024"/>
+    <w:bookmarkEnd w:id="99"/>
+    <w:bookmarkStart w:id="101" w:name="ref-Bender2024"/>
     <w:p>
       <w:pPr>
         <w:pStyle w:val="Bibliography"/>
@@ -6209,7 +3867,7 @@
       <w:r>
         <w:t xml:space="preserve"> </w:t>
       </w:r>
-      <w:hyperlink r:id="rId105">
+      <w:hyperlink r:id="rId100">
         <w:r>
           <w:rPr>
             <w:rStyle w:val="Hyperlink"/>
@@ -6218,8 +3876,8 @@
         </w:r>
       </w:hyperlink>
     </w:p>
-    <w:bookmarkEnd w:id="106"/>
-    <w:bookmarkStart w:id="107" w:name="ref-opencv-library"/>
+    <w:bookmarkEnd w:id="101"/>
+    <w:bookmarkStart w:id="102" w:name="ref-opencv-library"/>
     <w:p>
       <w:pPr>
         <w:pStyle w:val="Bibliography"/>
@@ -6250,8 +3908,8 @@
         <w:t xml:space="preserve">.</w:t>
       </w:r>
     </w:p>
-    <w:bookmarkEnd w:id="107"/>
-    <w:bookmarkStart w:id="109" w:name="ref-brms"/>
+    <w:bookmarkEnd w:id="102"/>
+    <w:bookmarkStart w:id="104" w:name="ref-brms"/>
     <w:p>
       <w:pPr>
         <w:pStyle w:val="Bibliography"/>
@@ -6321,7 +3979,7 @@
       <w:r>
         <w:t xml:space="preserve"> </w:t>
       </w:r>
-      <w:hyperlink r:id="rId108">
+      <w:hyperlink r:id="rId103">
         <w:r>
           <w:rPr>
             <w:rStyle w:val="Hyperlink"/>
@@ -6330,8 +3988,8 @@
         </w:r>
       </w:hyperlink>
     </w:p>
-    <w:bookmarkEnd w:id="109"/>
-    <w:bookmarkStart w:id="110" w:name="ref-Ciesla2012"/>
+    <w:bookmarkEnd w:id="104"/>
+    <w:bookmarkStart w:id="105" w:name="ref-Ciesla2012"/>
     <w:p>
       <w:pPr>
         <w:pStyle w:val="Bibliography"/>
@@ -6353,8 +4011,8 @@
         <w:t xml:space="preserve">, 1–11.</w:t>
       </w:r>
     </w:p>
-    <w:bookmarkEnd w:id="110"/>
-    <w:bookmarkStart w:id="112" w:name="ref-Dessinioti2009"/>
+    <w:bookmarkEnd w:id="105"/>
+    <w:bookmarkStart w:id="107" w:name="ref-Dessinioti2009"/>
     <w:p>
       <w:pPr>
         <w:pStyle w:val="Bibliography"/>
@@ -6391,7 +4049,7 @@
       <w:r>
         <w:t xml:space="preserve"> </w:t>
       </w:r>
-      <w:hyperlink r:id="rId111">
+      <w:hyperlink r:id="rId106">
         <w:r>
           <w:rPr>
             <w:rStyle w:val="Hyperlink"/>
@@ -6400,8 +4058,8 @@
         </w:r>
       </w:hyperlink>
     </w:p>
-    <w:bookmarkEnd w:id="112"/>
-    <w:bookmarkStart w:id="114" w:name="ref-Farroni2003"/>
+    <w:bookmarkEnd w:id="107"/>
+    <w:bookmarkStart w:id="109" w:name="ref-Farroni2003"/>
     <w:p>
       <w:pPr>
         <w:pStyle w:val="Bibliography"/>
@@ -6438,7 +4096,7 @@
       <w:r>
         <w:t xml:space="preserve"> </w:t>
       </w:r>
-      <w:hyperlink r:id="rId113">
+      <w:hyperlink r:id="rId108">
         <w:r>
           <w:rPr>
             <w:rStyle w:val="Hyperlink"/>
@@ -6447,8 +4105,8 @@
         </w:r>
       </w:hyperlink>
     </w:p>
-    <w:bookmarkEnd w:id="114"/>
-    <w:bookmarkStart w:id="116" w:name="ref-Farroni2007"/>
+    <w:bookmarkEnd w:id="109"/>
+    <w:bookmarkStart w:id="111" w:name="ref-Farroni2007"/>
     <w:p>
       <w:pPr>
         <w:pStyle w:val="Bibliography"/>
@@ -6485,7 +4143,7 @@
       <w:r>
         <w:t xml:space="preserve"> </w:t>
       </w:r>
-      <w:hyperlink r:id="rId115">
+      <w:hyperlink r:id="rId110">
         <w:r>
           <w:rPr>
             <w:rStyle w:val="Hyperlink"/>
@@ -6494,8 +4152,8 @@
         </w:r>
       </w:hyperlink>
     </w:p>
-    <w:bookmarkEnd w:id="116"/>
-    <w:bookmarkStart w:id="118" w:name="ref-Farroni2004"/>
+    <w:bookmarkEnd w:id="111"/>
+    <w:bookmarkStart w:id="113" w:name="ref-Farroni2004"/>
     <w:p>
       <w:pPr>
         <w:pStyle w:val="Bibliography"/>
@@ -6532,7 +4190,7 @@
       <w:r>
         <w:t xml:space="preserve"> </w:t>
       </w:r>
-      <w:hyperlink r:id="rId117">
+      <w:hyperlink r:id="rId112">
         <w:r>
           <w:rPr>
             <w:rStyle w:val="Hyperlink"/>
@@ -6541,8 +4199,8 @@
         </w:r>
       </w:hyperlink>
     </w:p>
-    <w:bookmarkEnd w:id="118"/>
-    <w:bookmarkStart w:id="120" w:name="ref-Gale2000"/>
+    <w:bookmarkEnd w:id="113"/>
+    <w:bookmarkStart w:id="115" w:name="ref-Gale2000"/>
     <w:p>
       <w:pPr>
         <w:pStyle w:val="Bibliography"/>
@@ -6579,7 +4237,7 @@
       <w:r>
         <w:t xml:space="preserve"> </w:t>
       </w:r>
-      <w:hyperlink r:id="rId119">
+      <w:hyperlink r:id="rId114">
         <w:r>
           <w:rPr>
             <w:rStyle w:val="Hyperlink"/>
@@ -6588,8 +4246,8 @@
         </w:r>
       </w:hyperlink>
     </w:p>
-    <w:bookmarkEnd w:id="120"/>
-    <w:bookmarkStart w:id="122" w:name="ref-Gronskov2007"/>
+    <w:bookmarkEnd w:id="115"/>
+    <w:bookmarkStart w:id="117" w:name="ref-Gronskov2007"/>
     <w:p>
       <w:pPr>
         <w:pStyle w:val="Bibliography"/>
@@ -6626,7 +4284,7 @@
       <w:r>
         <w:t xml:space="preserve"> </w:t>
       </w:r>
-      <w:hyperlink r:id="rId121">
+      <w:hyperlink r:id="rId116">
         <w:r>
           <w:rPr>
             <w:rStyle w:val="Hyperlink"/>
@@ -6635,8 +4293,8 @@
         </w:r>
       </w:hyperlink>
     </w:p>
-    <w:bookmarkEnd w:id="122"/>
-    <w:bookmarkStart w:id="124" w:name="ref-Grosserichter2025"/>
+    <w:bookmarkEnd w:id="117"/>
+    <w:bookmarkStart w:id="119" w:name="ref-Grosserichter2025"/>
     <w:p>
       <w:pPr>
         <w:pStyle w:val="Bibliography"/>
@@ -6660,7 +4318,7 @@
       <w:r>
         <w:t xml:space="preserve">[Thesis, University of Twente].</w:t>
       </w:r>
-      <w:hyperlink r:id="rId123">
+      <w:hyperlink r:id="rId118">
         <w:r>
           <w:rPr>
             <w:rStyle w:val="Hyperlink"/>
@@ -6669,8 +4327,8 @@
         </w:r>
       </w:hyperlink>
     </w:p>
-    <w:bookmarkEnd w:id="124"/>
-    <w:bookmarkStart w:id="126" w:name="ref-Guilford1991"/>
+    <w:bookmarkEnd w:id="119"/>
+    <w:bookmarkStart w:id="121" w:name="ref-Guilford1991"/>
     <w:p>
       <w:pPr>
         <w:pStyle w:val="Bibliography"/>
@@ -6707,7 +4365,7 @@
       <w:r>
         <w:t xml:space="preserve"> </w:t>
       </w:r>
-      <w:hyperlink r:id="rId125">
+      <w:hyperlink r:id="rId120">
         <w:r>
           <w:rPr>
             <w:rStyle w:val="Hyperlink"/>
@@ -6716,8 +4374,8 @@
         </w:r>
       </w:hyperlink>
     </w:p>
-    <w:bookmarkEnd w:id="126"/>
-    <w:bookmarkStart w:id="128" w:name="ref-Heck2023"/>
+    <w:bookmarkEnd w:id="121"/>
+    <w:bookmarkStart w:id="123" w:name="ref-Heck2023"/>
     <w:p>
       <w:pPr>
         <w:pStyle w:val="Bibliography"/>
@@ -6741,7 +4399,7 @@
       <w:r>
         <w:t xml:space="preserve"> </w:t>
       </w:r>
-      <w:hyperlink r:id="rId127">
+      <w:hyperlink r:id="rId122">
         <w:r>
           <w:rPr>
             <w:rStyle w:val="Hyperlink"/>
@@ -6750,8 +4408,8 @@
         </w:r>
       </w:hyperlink>
     </w:p>
-    <w:bookmarkEnd w:id="128"/>
-    <w:bookmarkStart w:id="130" w:name="ref-Hoelter2025"/>
+    <w:bookmarkEnd w:id="123"/>
+    <w:bookmarkStart w:id="125" w:name="ref-Hoelter2025"/>
     <w:p>
       <w:pPr>
         <w:pStyle w:val="Bibliography"/>
@@ -6775,7 +4433,7 @@
       <w:r>
         <w:t xml:space="preserve">[Thesis, University of Twente].</w:t>
       </w:r>
-      <w:hyperlink r:id="rId129">
+      <w:hyperlink r:id="rId124">
         <w:r>
           <w:rPr>
             <w:rStyle w:val="Hyperlink"/>
@@ -6784,8 +4442,8 @@
         </w:r>
       </w:hyperlink>
     </w:p>
-    <w:bookmarkEnd w:id="130"/>
-    <w:bookmarkStart w:id="132" w:name="ref-Kobayashi2001"/>
+    <w:bookmarkEnd w:id="125"/>
+    <w:bookmarkStart w:id="127" w:name="ref-Kobayashi2001"/>
     <w:p>
       <w:pPr>
         <w:pStyle w:val="Bibliography"/>
@@ -6822,7 +4480,7 @@
       <w:r>
         <w:t xml:space="preserve"> </w:t>
       </w:r>
-      <w:hyperlink r:id="rId131">
+      <w:hyperlink r:id="rId126">
         <w:r>
           <w:rPr>
             <w:rStyle w:val="Hyperlink"/>
@@ -6831,8 +4489,8 @@
         </w:r>
       </w:hyperlink>
     </w:p>
-    <w:bookmarkEnd w:id="132"/>
-    <w:bookmarkStart w:id="134" w:name="ref-Krafka2016"/>
+    <w:bookmarkEnd w:id="127"/>
+    <w:bookmarkStart w:id="129" w:name="ref-Krafka2016"/>
     <w:p>
       <w:pPr>
         <w:pStyle w:val="Bibliography"/>
@@ -6856,7 +4514,7 @@
       <w:r>
         <w:t xml:space="preserve"> </w:t>
       </w:r>
-      <w:hyperlink r:id="rId133">
+      <w:hyperlink r:id="rId128">
         <w:r>
           <w:rPr>
             <w:rStyle w:val="Hyperlink"/>
@@ -6865,8 +4523,8 @@
         </w:r>
       </w:hyperlink>
     </w:p>
-    <w:bookmarkEnd w:id="134"/>
-    <w:bookmarkStart w:id="136" w:name="ref-Kruijt2011"/>
+    <w:bookmarkEnd w:id="129"/>
+    <w:bookmarkStart w:id="131" w:name="ref-Kruijt2011"/>
     <w:p>
       <w:pPr>
         <w:pStyle w:val="Bibliography"/>
@@ -6903,7 +4561,7 @@
       <w:r>
         <w:t xml:space="preserve"> </w:t>
       </w:r>
-      <w:hyperlink r:id="rId135">
+      <w:hyperlink r:id="rId130">
         <w:r>
           <w:rPr>
             <w:rStyle w:val="Hyperlink"/>
@@ -6912,8 +4570,8 @@
         </w:r>
       </w:hyperlink>
     </w:p>
-    <w:bookmarkEnd w:id="136"/>
-    <w:bookmarkStart w:id="138" w:name="ref-Laidre2013"/>
+    <w:bookmarkEnd w:id="131"/>
+    <w:bookmarkStart w:id="133" w:name="ref-Laidre2013"/>
     <w:p>
       <w:pPr>
         <w:pStyle w:val="Bibliography"/>
@@ -6950,7 +4608,7 @@
       <w:r>
         <w:t xml:space="preserve"> </w:t>
       </w:r>
-      <w:hyperlink r:id="rId137">
+      <w:hyperlink r:id="rId132">
         <w:r>
           <w:rPr>
             <w:rStyle w:val="Hyperlink"/>
@@ -6959,8 +4617,8 @@
         </w:r>
       </w:hyperlink>
     </w:p>
-    <w:bookmarkEnd w:id="138"/>
-    <w:bookmarkStart w:id="140" w:name="ref-Loomis2008"/>
+    <w:bookmarkEnd w:id="133"/>
+    <w:bookmarkStart w:id="135" w:name="ref-Loomis2008"/>
     <w:p>
       <w:pPr>
         <w:pStyle w:val="Bibliography"/>
@@ -6997,7 +4655,7 @@
       <w:r>
         <w:t xml:space="preserve"> </w:t>
       </w:r>
-      <w:hyperlink r:id="rId139">
+      <w:hyperlink r:id="rId134">
         <w:r>
           <w:rPr>
             <w:rStyle w:val="Hyperlink"/>
@@ -7006,8 +4664,8 @@
         </w:r>
       </w:hyperlink>
     </w:p>
-    <w:bookmarkEnd w:id="140"/>
-    <w:bookmarkStart w:id="142" w:name="ref-Mayhew2015"/>
+    <w:bookmarkEnd w:id="135"/>
+    <w:bookmarkStart w:id="137" w:name="ref-Mayhew2015"/>
     <w:p>
       <w:pPr>
         <w:pStyle w:val="Bibliography"/>
@@ -7044,7 +4702,7 @@
       <w:r>
         <w:t xml:space="preserve"> </w:t>
       </w:r>
-      <w:hyperlink r:id="rId141">
+      <w:hyperlink r:id="rId136">
         <w:r>
           <w:rPr>
             <w:rStyle w:val="Hyperlink"/>
@@ -7053,8 +4711,8 @@
         </w:r>
       </w:hyperlink>
     </w:p>
-    <w:bookmarkEnd w:id="142"/>
-    <w:bookmarkStart w:id="144" w:name="ref-Pastel2021"/>
+    <w:bookmarkEnd w:id="137"/>
+    <w:bookmarkStart w:id="139" w:name="ref-Pastel2021"/>
     <w:p>
       <w:pPr>
         <w:pStyle w:val="Bibliography"/>
@@ -7091,7 +4749,7 @@
       <w:r>
         <w:t xml:space="preserve"> </w:t>
       </w:r>
-      <w:hyperlink r:id="rId143">
+      <w:hyperlink r:id="rId138">
         <w:r>
           <w:rPr>
             <w:rStyle w:val="Hyperlink"/>
@@ -7100,8 +4758,8 @@
         </w:r>
       </w:hyperlink>
     </w:p>
-    <w:bookmarkEnd w:id="144"/>
-    <w:bookmarkStart w:id="145" w:name="ref-scikit-learn"/>
+    <w:bookmarkEnd w:id="139"/>
+    <w:bookmarkStart w:id="140" w:name="ref-scikit-learn"/>
     <w:p>
       <w:pPr>
         <w:pStyle w:val="Bibliography"/>
@@ -7145,8 +4803,8 @@
         <w:t xml:space="preserve">, 2825–2830.</w:t>
       </w:r>
     </w:p>
-    <w:bookmarkEnd w:id="145"/>
-    <w:bookmarkStart w:id="147" w:name="ref-Rlang"/>
+    <w:bookmarkEnd w:id="140"/>
+    <w:bookmarkStart w:id="142" w:name="ref-Rlang"/>
     <w:p>
       <w:pPr>
         <w:pStyle w:val="Bibliography"/>
@@ -7170,7 +4828,7 @@
       <w:r>
         <w:t xml:space="preserve"> </w:t>
       </w:r>
-      <w:hyperlink r:id="rId146">
+      <w:hyperlink r:id="rId141">
         <w:r>
           <w:rPr>
             <w:rStyle w:val="Hyperlink"/>
@@ -7179,8 +4837,8 @@
         </w:r>
       </w:hyperlink>
     </w:p>
-    <w:bookmarkEnd w:id="147"/>
-    <w:bookmarkStart w:id="149" w:name="ref-Singh2012"/>
+    <w:bookmarkEnd w:id="142"/>
+    <w:bookmarkStart w:id="144" w:name="ref-Singh2012"/>
     <w:p>
       <w:pPr>
         <w:pStyle w:val="Bibliography"/>
@@ -7217,7 +4875,7 @@
       <w:r>
         <w:t xml:space="preserve"> </w:t>
       </w:r>
-      <w:hyperlink r:id="rId148">
+      <w:hyperlink r:id="rId143">
         <w:r>
           <w:rPr>
             <w:rStyle w:val="Hyperlink"/>
@@ -7226,8 +4884,8 @@
         </w:r>
       </w:hyperlink>
     </w:p>
-    <w:bookmarkEnd w:id="149"/>
-    <w:bookmarkStart w:id="151" w:name="ref-Tomasello2007"/>
+    <w:bookmarkEnd w:id="144"/>
+    <w:bookmarkStart w:id="146" w:name="ref-Tomasello2007"/>
     <w:p>
       <w:pPr>
         <w:pStyle w:val="Bibliography"/>
@@ -7264,7 +4922,7 @@
       <w:r>
         <w:t xml:space="preserve"> </w:t>
       </w:r>
-      <w:hyperlink r:id="rId150">
+      <w:hyperlink r:id="rId145">
         <w:r>
           <w:rPr>
             <w:rStyle w:val="Hyperlink"/>
@@ -7273,8 +4931,8 @@
         </w:r>
       </w:hyperlink>
     </w:p>
-    <w:bookmarkEnd w:id="151"/>
-    <w:bookmarkStart w:id="153" w:name="ref-Wolf2023"/>
+    <w:bookmarkEnd w:id="146"/>
+    <w:bookmarkStart w:id="148" w:name="ref-Wolf2023"/>
     <w:p>
       <w:pPr>
         <w:pStyle w:val="Bibliography"/>
@@ -7311,7 +4969,7 @@
       <w:r>
         <w:t xml:space="preserve"> </w:t>
       </w:r>
-      <w:hyperlink r:id="rId152">
+      <w:hyperlink r:id="rId147">
         <w:r>
           <w:rPr>
             <w:rStyle w:val="Hyperlink"/>
@@ -7320,8 +4978,8 @@
         </w:r>
       </w:hyperlink>
     </w:p>
-    <w:bookmarkEnd w:id="153"/>
-    <w:bookmarkStart w:id="155" w:name="ref-Yorzinski2021"/>
+    <w:bookmarkEnd w:id="148"/>
+    <w:bookmarkStart w:id="150" w:name="ref-Yorzinski2021"/>
     <w:p>
       <w:pPr>
         <w:pStyle w:val="Bibliography"/>
@@ -7358,7 +5016,7 @@
       <w:r>
         <w:t xml:space="preserve"> </w:t>
       </w:r>
-      <w:hyperlink r:id="rId154">
+      <w:hyperlink r:id="rId149">
         <w:r>
           <w:rPr>
             <w:rStyle w:val="Hyperlink"/>
@@ -7367,8 +5025,8 @@
         </w:r>
       </w:hyperlink>
     </w:p>
-    <w:bookmarkEnd w:id="155"/>
-    <w:bookmarkStart w:id="157" w:name="ref-Zhou2004"/>
+    <w:bookmarkEnd w:id="150"/>
+    <w:bookmarkStart w:id="152" w:name="ref-Zhou2004"/>
     <w:p>
       <w:pPr>
         <w:pStyle w:val="Bibliography"/>
@@ -7405,7 +5063,7 @@
       <w:r>
         <w:t xml:space="preserve"> </w:t>
       </w:r>
-      <w:hyperlink r:id="rId156">
+      <w:hyperlink r:id="rId151">
         <w:r>
           <w:rPr>
             <w:rStyle w:val="Hyperlink"/>
@@ -7414,9 +5072,9 @@
         </w:r>
       </w:hyperlink>
     </w:p>
-    <w:bookmarkEnd w:id="157"/>
-    <w:bookmarkEnd w:id="158"/>
-    <w:bookmarkEnd w:id="159"/>
+    <w:bookmarkEnd w:id="152"/>
+    <w:bookmarkEnd w:id="153"/>
+    <w:bookmarkEnd w:id="154"/>
     <w:sectPr>
       <w:footnotePr>
         <w:numRestart w:val="eachSect"/>

</xml_diff>

<commit_message>
new subsection on Camouflage hypothesis
</commit_message>
<xml_diff>
--- a/YET_CEHR.docx
+++ b/YET_CEHR.docx
@@ -317,7 +317,44 @@
         <w:pStyle w:val="BodyText"/>
       </w:pPr>
       <w:r>
-        <w:t xml:space="preserve">On these grounds it seems quite likely that the white sclera appeared as a one-point mutation. Nevertheless, to become fixed in the population, it had to confer immediate fitness advantages, which requires a receiver mechanism.</w:t>
+        <w:t xml:space="preserve">One alternative explanation for scleral depigmentation deserves consideration: pleiotropy. The melanin synthesis pathway implicated in scleral pigmentation—tyrosinase and associated proteins such as OCA2, TYRP1, and SLC45A2</w:t>
+      </w:r>
+      <w:r>
+        <w:t xml:space="preserve"> </w:t>
+      </w:r>
+      <w:r>
+        <w:t xml:space="preserve">(Grønskov et al., 2007)</w:t>
+      </w:r>
+      <w:r>
+        <w:t xml:space="preserve">—is the same biosynthetic machinery known to underlie human skin pigmentation. Given that several of these loci are well-established targets of strong, geographically variable selection related to UV exposure and vitamin D synthesis, it is conceivable that scleral depigmentation arose not as an independently selected trait requiring its own receiver mechanism, but as an incidental by-product of selection acting primarily on skin colour. Under this scenario, no immediate fitness benefit specific to gaze signalling—and consequently no pre-existing receiver—would need to be invoked to explain the initial fixation of the trait.</w:t>
+      </w:r>
+    </w:p>
+    <w:p>
+      <w:pPr>
+        <w:pStyle w:val="BodyText"/>
+      </w:pPr>
+      <w:r>
+        <w:t xml:space="preserve">This explanation, however, sits uneasily with the available evidence. If scleral depigmentation were a pleiotropic side-effect of the same alleles driving skin-colour variation, one would expect it to covary with skin pigmentation across populations, mirroring the well-documented geographic gradient in human skin tone. As a minimum requirement, one would expect some variance at all. Instead,</w:t>
+      </w:r>
+      <w:r>
+        <w:t xml:space="preserve"> </w:t>
+      </w:r>
+      <w:r>
+        <w:t xml:space="preserve">Mearing et al. (2022)</w:t>
+      </w:r>
+      <w:r>
+        <w:t xml:space="preserve"> </w:t>
+      </w:r>
+      <w:r>
+        <w:t xml:space="preserve">report that scleral pigmentation shows essentially no variance across modern human populations, in marked contrast to the substantial variation observed among anthropoid apes. This uniformity is difficult to reconcile with a pleiotropic account tied to a geographically heterogeneous selective pressure, and instead is more consistent with a single, strongly selected mutation that reached fixation prior to the geographic diversification of modern human populations. We therefore consider a shared genetic origin with skin pigmentation an unlikely explanation for scleral depigmentation, and retain the assumption that the trait was subject to its own, dedicated selective pressure.</w:t>
+      </w:r>
+    </w:p>
+    <w:p>
+      <w:pPr>
+        <w:pStyle w:val="BodyText"/>
+      </w:pPr>
+      <w:r>
+        <w:t xml:space="preserve">On these grounds it seems quite likely that the white sclera appeared as a one-point mutation. Nevertheless, to become fixed in the population, it had to confer immediate fitness advantages, which requires an effective receiver mechanism.</w:t>
       </w:r>
     </w:p>
     <w:bookmarkEnd w:id="21"/>
@@ -3665,7 +3702,7 @@
     </w:p>
     <w:bookmarkEnd w:id="90"/>
     <w:bookmarkEnd w:id="91"/>
-    <w:bookmarkStart w:id="154" w:name="references"/>
+    <w:bookmarkStart w:id="156" w:name="references"/>
     <w:p>
       <w:pPr>
         <w:pStyle w:val="Heading1"/>
@@ -3674,7 +3711,7 @@
         <w:t xml:space="preserve">References</w:t>
       </w:r>
     </w:p>
-    <w:bookmarkStart w:id="153" w:name="refs"/>
+    <w:bookmarkStart w:id="155" w:name="refs"/>
     <w:bookmarkStart w:id="93" w:name="ref-Anderson2016"/>
     <w:p>
       <w:pPr>
@@ -4712,13 +4749,13 @@
       </w:hyperlink>
     </w:p>
     <w:bookmarkEnd w:id="137"/>
-    <w:bookmarkStart w:id="139" w:name="ref-Pastel2021"/>
+    <w:bookmarkStart w:id="139" w:name="ref-Mearing2022"/>
     <w:p>
       <w:pPr>
         <w:pStyle w:val="Bibliography"/>
       </w:pPr>
       <w:r>
-        <w:t xml:space="preserve">Pastel, S., Chen, C. H., Martin, L., Naujoks, M., Petri, K., &amp; Witte, K. (2021). Comparison of gaze accuracy and precision in real-world and virtual reality.</w:t>
+        <w:t xml:space="preserve">Mearing, A. S., Burkart, J. M., Dunn, J., Street, S. E., &amp; Koops, K. (2022). The evolutionary drivers of primate scleral coloration.</w:t>
       </w:r>
       <w:r>
         <w:t xml:space="preserve"> </w:t>
@@ -4728,7 +4765,7 @@
           <w:i/>
           <w:iCs/>
         </w:rPr>
-        <w:t xml:space="preserve">Virtual Reality</w:t>
+        <w:t xml:space="preserve">Scientific Reports</w:t>
       </w:r>
       <w:r>
         <w:t xml:space="preserve">,</w:t>
@@ -4741,6 +4778,53 @@
           <w:i/>
           <w:iCs/>
         </w:rPr>
+        <w:t xml:space="preserve">12</w:t>
+      </w:r>
+      <w:r>
+        <w:t xml:space="preserve">(1).</w:t>
+      </w:r>
+      <w:r>
+        <w:t xml:space="preserve"> </w:t>
+      </w:r>
+      <w:hyperlink r:id="rId138">
+        <w:r>
+          <w:rPr>
+            <w:rStyle w:val="Hyperlink"/>
+          </w:rPr>
+          <w:t xml:space="preserve">https://doi.org/10.1038/s41598-022-18275-9</w:t>
+        </w:r>
+      </w:hyperlink>
+    </w:p>
+    <w:bookmarkEnd w:id="139"/>
+    <w:bookmarkStart w:id="141" w:name="ref-Pastel2021"/>
+    <w:p>
+      <w:pPr>
+        <w:pStyle w:val="Bibliography"/>
+      </w:pPr>
+      <w:r>
+        <w:t xml:space="preserve">Pastel, S., Chen, C. H., Martin, L., Naujoks, M., Petri, K., &amp; Witte, K. (2021). Comparison of gaze accuracy and precision in real-world and virtual reality.</w:t>
+      </w:r>
+      <w:r>
+        <w:t xml:space="preserve"> </w:t>
+      </w:r>
+      <w:r>
+        <w:rPr>
+          <w:i/>
+          <w:iCs/>
+        </w:rPr>
+        <w:t xml:space="preserve">Virtual Reality</w:t>
+      </w:r>
+      <w:r>
+        <w:t xml:space="preserve">,</w:t>
+      </w:r>
+      <w:r>
+        <w:t xml:space="preserve"> </w:t>
+      </w:r>
+      <w:r>
+        <w:rPr>
+          <w:i/>
+          <w:iCs/>
+        </w:rPr>
         <w:t xml:space="preserve">25</w:t>
       </w:r>
       <w:r>
@@ -4749,7 +4833,7 @@
       <w:r>
         <w:t xml:space="preserve"> </w:t>
       </w:r>
-      <w:hyperlink r:id="rId138">
+      <w:hyperlink r:id="rId140">
         <w:r>
           <w:rPr>
             <w:rStyle w:val="Hyperlink"/>
@@ -4758,8 +4842,8 @@
         </w:r>
       </w:hyperlink>
     </w:p>
-    <w:bookmarkEnd w:id="139"/>
-    <w:bookmarkStart w:id="140" w:name="ref-scikit-learn"/>
+    <w:bookmarkEnd w:id="141"/>
+    <w:bookmarkStart w:id="142" w:name="ref-scikit-learn"/>
     <w:p>
       <w:pPr>
         <w:pStyle w:val="Bibliography"/>
@@ -4803,8 +4887,8 @@
         <w:t xml:space="preserve">, 2825–2830.</w:t>
       </w:r>
     </w:p>
-    <w:bookmarkEnd w:id="140"/>
-    <w:bookmarkStart w:id="142" w:name="ref-Rlang"/>
+    <w:bookmarkEnd w:id="142"/>
+    <w:bookmarkStart w:id="144" w:name="ref-Rlang"/>
     <w:p>
       <w:pPr>
         <w:pStyle w:val="Bibliography"/>
@@ -4828,7 +4912,7 @@
       <w:r>
         <w:t xml:space="preserve"> </w:t>
       </w:r>
-      <w:hyperlink r:id="rId141">
+      <w:hyperlink r:id="rId143">
         <w:r>
           <w:rPr>
             <w:rStyle w:val="Hyperlink"/>
@@ -4837,8 +4921,8 @@
         </w:r>
       </w:hyperlink>
     </w:p>
-    <w:bookmarkEnd w:id="142"/>
-    <w:bookmarkStart w:id="144" w:name="ref-Singh2012"/>
+    <w:bookmarkEnd w:id="144"/>
+    <w:bookmarkStart w:id="146" w:name="ref-Singh2012"/>
     <w:p>
       <w:pPr>
         <w:pStyle w:val="Bibliography"/>
@@ -4875,7 +4959,7 @@
       <w:r>
         <w:t xml:space="preserve"> </w:t>
       </w:r>
-      <w:hyperlink r:id="rId143">
+      <w:hyperlink r:id="rId145">
         <w:r>
           <w:rPr>
             <w:rStyle w:val="Hyperlink"/>
@@ -4884,8 +4968,8 @@
         </w:r>
       </w:hyperlink>
     </w:p>
-    <w:bookmarkEnd w:id="144"/>
-    <w:bookmarkStart w:id="146" w:name="ref-Tomasello2007"/>
+    <w:bookmarkEnd w:id="146"/>
+    <w:bookmarkStart w:id="148" w:name="ref-Tomasello2007"/>
     <w:p>
       <w:pPr>
         <w:pStyle w:val="Bibliography"/>
@@ -4922,7 +5006,7 @@
       <w:r>
         <w:t xml:space="preserve"> </w:t>
       </w:r>
-      <w:hyperlink r:id="rId145">
+      <w:hyperlink r:id="rId147">
         <w:r>
           <w:rPr>
             <w:rStyle w:val="Hyperlink"/>
@@ -4931,8 +5015,8 @@
         </w:r>
       </w:hyperlink>
     </w:p>
-    <w:bookmarkEnd w:id="146"/>
-    <w:bookmarkStart w:id="148" w:name="ref-Wolf2023"/>
+    <w:bookmarkEnd w:id="148"/>
+    <w:bookmarkStart w:id="150" w:name="ref-Wolf2023"/>
     <w:p>
       <w:pPr>
         <w:pStyle w:val="Bibliography"/>
@@ -4969,7 +5053,7 @@
       <w:r>
         <w:t xml:space="preserve"> </w:t>
       </w:r>
-      <w:hyperlink r:id="rId147">
+      <w:hyperlink r:id="rId149">
         <w:r>
           <w:rPr>
             <w:rStyle w:val="Hyperlink"/>
@@ -4978,8 +5062,8 @@
         </w:r>
       </w:hyperlink>
     </w:p>
-    <w:bookmarkEnd w:id="148"/>
-    <w:bookmarkStart w:id="150" w:name="ref-Yorzinski2021"/>
+    <w:bookmarkEnd w:id="150"/>
+    <w:bookmarkStart w:id="152" w:name="ref-Yorzinski2021"/>
     <w:p>
       <w:pPr>
         <w:pStyle w:val="Bibliography"/>
@@ -5016,7 +5100,7 @@
       <w:r>
         <w:t xml:space="preserve"> </w:t>
       </w:r>
-      <w:hyperlink r:id="rId149">
+      <w:hyperlink r:id="rId151">
         <w:r>
           <w:rPr>
             <w:rStyle w:val="Hyperlink"/>
@@ -5025,8 +5109,8 @@
         </w:r>
       </w:hyperlink>
     </w:p>
-    <w:bookmarkEnd w:id="150"/>
-    <w:bookmarkStart w:id="152" w:name="ref-Zhou2004"/>
+    <w:bookmarkEnd w:id="152"/>
+    <w:bookmarkStart w:id="154" w:name="ref-Zhou2004"/>
     <w:p>
       <w:pPr>
         <w:pStyle w:val="Bibliography"/>
@@ -5063,7 +5147,7 @@
       <w:r>
         <w:t xml:space="preserve"> </w:t>
       </w:r>
-      <w:hyperlink r:id="rId151">
+      <w:hyperlink r:id="rId153">
         <w:r>
           <w:rPr>
             <w:rStyle w:val="Hyperlink"/>
@@ -5072,9 +5156,9 @@
         </w:r>
       </w:hyperlink>
     </w:p>
-    <w:bookmarkEnd w:id="152"/>
-    <w:bookmarkEnd w:id="153"/>
     <w:bookmarkEnd w:id="154"/>
+    <w:bookmarkEnd w:id="155"/>
+    <w:bookmarkEnd w:id="156"/>
     <w:sectPr>
       <w:footnotePr>
         <w:numRestart w:val="eachSect"/>

</xml_diff>

<commit_message>
+ Dismantling the boittleneck scenario in Discussion
</commit_message>
<xml_diff>
--- a/YET_CEHR.docx
+++ b/YET_CEHR.docx
@@ -7,7 +7,7 @@
         <w:pStyle w:val="Title"/>
       </w:pPr>
       <w:r>
-        <w:t xml:space="preserve">The Receiving End of the Cooperative Eye: a test by construction</w:t>
+        <w:t xml:space="preserve">Cue Before Signal: A Receiver Exaptation Hypothesis for the Evolution of the White Sclera</w:t>
       </w:r>
     </w:p>
     <w:p>
@@ -15,10 +15,10 @@
         <w:pStyle w:val="Author"/>
       </w:pPr>
       <w:r>
-        <w:t xml:space="preserve">M Schmettow, C. Willemse, S. Borsci</w:t>
-      </w:r>
-    </w:p>
-    <w:bookmarkStart w:id="23" w:name="introduction"/>
+        <w:t xml:space="preserve">M Schmettow</w:t>
+      </w:r>
+    </w:p>
+    <w:bookmarkStart w:id="26" w:name="introduction"/>
     <w:p>
       <w:pPr>
         <w:pStyle w:val="Heading2"/>
@@ -288,328 +288,6 @@
         <w:t xml:space="preserve"> </w:t>
       </w:r>
       <w:r>
-        <w:t xml:space="preserve">(Bakker et al., 2022)</w:t>
-      </w:r>
-      <w:r>
-        <w:t xml:space="preserve">. Several non-lethal mutations are known in humans and apes</w:t>
-      </w:r>
-      <w:r>
-        <w:t xml:space="preserve"> </w:t>
-      </w:r>
-      <w:r>
-        <w:t xml:space="preserve">Dessinioti et al. (2009)</w:t>
-      </w:r>
-      <w:r>
-        <w:t xml:space="preserve">,</w:t>
-      </w:r>
-      <w:r>
-        <w:t xml:space="preserve"> </w:t>
-      </w:r>
-      <w:r>
-        <w:t xml:space="preserve">Mayhew &amp; Gómez (2015)</w:t>
-      </w:r>
-      <w:r>
-        <w:t xml:space="preserve">.@Mearing2022 found that sclera pigmentation varies stronger in anthropoid ape faces than was previously held, whereas there practically is no variation in the human sclera.</w:t>
-      </w:r>
-    </w:p>
-    <w:p>
-      <w:pPr>
-        <w:pStyle w:val="BodyText"/>
-      </w:pPr>
-      <w:r>
-        <w:t xml:space="preserve">One alternative explanation for scleral depigmentation deserves consideration: pleiotropy. The melanin synthesis pathway implicated in scleral pigmentation—tyrosinase and associated proteins such as OCA2, TYRP1, and SLC45A2</w:t>
-      </w:r>
-      <w:r>
-        <w:t xml:space="preserve"> </w:t>
-      </w:r>
-      <w:r>
-        <w:t xml:space="preserve">(Grønskov et al., 2007)</w:t>
-      </w:r>
-      <w:r>
-        <w:t xml:space="preserve">—is the same biosynthetic machinery known to underlie human skin pigmentation. Given that several of these loci are well-established targets of strong, geographically variable selection related to UV exposure and vitamin D synthesis, it is conceivable that scleral depigmentation arose not as an independently selected trait requiring its own receiver mechanism, but as an incidental by-product of selection acting primarily on skin colour. Under this scenario, no immediate fitness benefit specific to gaze signalling—and consequently no pre-existing receiver—would need to be invoked to explain the initial fixation of the trait.</w:t>
-      </w:r>
-    </w:p>
-    <w:p>
-      <w:pPr>
-        <w:pStyle w:val="BodyText"/>
-      </w:pPr>
-      <w:r>
-        <w:t xml:space="preserve">This explanation, however, sits uneasily with the available evidence. If scleral depigmentation were a pleiotropic side-effect of the same alleles driving skin-colour variation, one would expect it to covary with skin pigmentation across populations, mirroring the well-documented geographic gradient in human skin tone. As a minimum requirement, one would expect some variance at all. Instead,</w:t>
-      </w:r>
-      <w:r>
-        <w:t xml:space="preserve"> </w:t>
-      </w:r>
-      <w:r>
-        <w:t xml:space="preserve">Mearing et al. (2022)</w:t>
-      </w:r>
-      <w:r>
-        <w:t xml:space="preserve"> </w:t>
-      </w:r>
-      <w:r>
-        <w:t xml:space="preserve">report that scleral pigmentation shows essentially no variance across modern human populations, in marked contrast to the substantial variation observed among anthropoid apes. This uniformity is difficult to reconcile with a pleiotropic account tied to a geographically heterogeneous selective pressure, and instead is more consistent with a single, strongly selected mutation that reached fixation prior to the geographic diversification of modern human populations. We therefore consider a shared genetic origin with skin pigmentation an unlikely explanation for scleral depigmentation, and retain the assumption that the trait was subject to its own, dedicated selective pressure.</w:t>
-      </w:r>
-    </w:p>
-    <w:p>
-      <w:pPr>
-        <w:pStyle w:val="BodyText"/>
-      </w:pPr>
-      <w:r>
-        <w:t xml:space="preserve">On these grounds it seems quite likely that the white sclera appeared as a one-point mutation. Nevertheless, to become fixed in the population, it had to confer immediate fitness advantages, which requires an effective receiver mechanism.</w:t>
-      </w:r>
-    </w:p>
-    <w:bookmarkEnd w:id="21"/>
-    <w:bookmarkStart w:id="22" w:name="the-eye-direction-detector-edd"/>
-    <w:p>
-      <w:pPr>
-        <w:pStyle w:val="Heading3"/>
-      </w:pPr>
-      <w:r>
-        <w:t xml:space="preserve">The Eye Direction Detector (EDD)</w:t>
-      </w:r>
-    </w:p>
-    <w:p>
-      <w:pPr>
-        <w:pStyle w:val="FirstParagraph"/>
-      </w:pPr>
-      <w:r>
-        <w:t xml:space="preserve">The existence of a specialized receiver represents a necessary corollary to the CEH. For scleral depigmentation to provide fitness benefits, human cognitive architecture must include mechanisms capable of rapidly and accurately extracting gaze direction from visual input.</w:t>
-      </w:r>
-    </w:p>
-    <w:p>
-      <w:pPr>
-        <w:pStyle w:val="BodyText"/>
-      </w:pPr>
-      <w:r>
-        <w:t xml:space="preserve">For</w:t>
-      </w:r>
-      <w:r>
-        <w:t xml:space="preserve"> </w:t>
-      </w:r>
-      <w:r>
-        <w:t xml:space="preserve">Baron-Cohen (1995)</w:t>
-      </w:r>
-      <w:r>
-        <w:t xml:space="preserve"> </w:t>
-      </w:r>
-      <w:r>
-        <w:t xml:space="preserve">eye direction detection (EDD) is a pivotal mechanism in his concept of Theory of Mind, marking it as a primarily social cognitive device. The existence of specialized neural networks for gaze processing is supported by neuroimaging studies showing that certain brain regions are preferentially activated when individuals view eye regions or interpret gaze direction (</w:t>
-      </w:r>
-      <w:r>
-        <w:t xml:space="preserve">Babinet et al. (2021)</w:t>
-      </w:r>
-      <w:r>
-        <w:t xml:space="preserve">).</w:t>
-      </w:r>
-    </w:p>
-    <w:p>
-      <w:pPr>
-        <w:pStyle w:val="BodyText"/>
-      </w:pPr>
-      <w:r>
-        <w:t xml:space="preserve">Supporting evidence comes from developmental studies demonstrating that human infants respond to direct gaze and exhibit rudimentary gaze-following behaviors from birth (</w:t>
-      </w:r>
-      <w:r>
-        <w:t xml:space="preserve">Farroni et al. (2003)</w:t>
-      </w:r>
-      <w:r>
-        <w:t xml:space="preserve">,</w:t>
-      </w:r>
-      <w:r>
-        <w:t xml:space="preserve"> </w:t>
-      </w:r>
-      <w:r>
-        <w:t xml:space="preserve">Farroni et al. (2004)</w:t>
-      </w:r>
-      <w:r>
-        <w:t xml:space="preserve">,</w:t>
-      </w:r>
-      <w:r>
-        <w:t xml:space="preserve"> </w:t>
-      </w:r>
-      <w:r>
-        <w:t xml:space="preserve">Farroni et al. (2007)</w:t>
-      </w:r>
-      <w:r>
-        <w:t xml:space="preserve">). These findings suggest that gaze perception operates through innate cognitive mechanisms that are functional in early development, before extensive learning could account for such abilities.</w:t>
-      </w:r>
-    </w:p>
-    <w:p>
-      <w:pPr>
-        <w:pStyle w:val="BodyText"/>
-      </w:pPr>
-      <w:r>
-        <w:t xml:space="preserve">It is almost impossible that such a refined receiver already existed, when the white sclera appeared. And it is also unlikely that it evolved as a one-point mutation. A possibility is that the white sclera encountered a rudimentary precursor of the EDD. As</w:t>
-      </w:r>
-      <w:r>
-        <w:t xml:space="preserve"> </w:t>
-      </w:r>
-      <w:r>
-        <w:t xml:space="preserve">Laidre &amp; Johnstone (2013)</w:t>
-      </w:r>
-      <w:r>
-        <w:t xml:space="preserve"> </w:t>
-      </w:r>
-      <w:r>
-        <w:t xml:space="preserve">points out, it is a common assumption that</w:t>
-      </w:r>
-      <w:r>
-        <w:t xml:space="preserve"> </w:t>
-      </w:r>
-      <w:r>
-        <w:t xml:space="preserve">“many signals have evolved from what once were cues.”</w:t>
-      </w:r>
-    </w:p>
-    <w:bookmarkEnd w:id="22"/>
-    <w:bookmarkEnd w:id="23"/>
-    <w:bookmarkStart w:id="25" w:name="salience-and-simplicity"/>
-    <w:p>
-      <w:pPr>
-        <w:pStyle w:val="Heading2"/>
-      </w:pPr>
-      <w:r>
-        <w:t xml:space="preserve">Salience and simplicity</w:t>
-      </w:r>
-    </w:p>
-    <w:p>
-      <w:pPr>
-        <w:pStyle w:val="FirstParagraph"/>
-      </w:pPr>
-      <w:r>
-        <w:t xml:space="preserve">The high contrast between the white sclera and the dark pupil creates a visually striking pattern that</w:t>
-      </w:r>
-      <w:r>
-        <w:t xml:space="preserve"> </w:t>
-      </w:r>
-      <w:r>
-        <w:t xml:space="preserve">“naturally”</w:t>
-      </w:r>
-      <w:r>
-        <w:t xml:space="preserve"> </w:t>
-      </w:r>
-      <w:r>
-        <w:t xml:space="preserve">draws attention. However, measuring salience by human judgement bares the risk of circular reasoning, because ease of processing is a consequence of the same evolutionary process.</w:t>
-      </w:r>
-    </w:p>
-    <w:p>
-      <w:pPr>
-        <w:pStyle w:val="BodyText"/>
-      </w:pPr>
-      <w:r>
-        <w:t xml:space="preserve">The salience of a cue can more objectively be understood in terms of its</w:t>
-      </w:r>
-      <w:r>
-        <w:t xml:space="preserve"> </w:t>
-      </w:r>
-      <w:r>
-        <w:rPr>
-          <w:i/>
-          <w:iCs/>
-        </w:rPr>
-        <w:t xml:space="preserve">computational simplicity</w:t>
-      </w:r>
-      <w:r>
-        <w:t xml:space="preserve">. Under this view, the likelihood that a matching cognitive mechanism already existed depends largely on how complex this mechanism had to be.</w:t>
-      </w:r>
-      <w:r>
-        <w:br/>
-      </w:r>
-      <w:r>
-        <w:t xml:space="preserve">Consequently, evolutionary novel receiver mechanisms, such as the EDD, are expected to exhibit computational simplicity while maintaining functional efficiency (</w:t>
-      </w:r>
-      <w:r>
-        <w:t xml:space="preserve">Guilford &amp; Dawkins (1991)</w:t>
-      </w:r>
-      <w:r>
-        <w:t xml:space="preserve">).</w:t>
-      </w:r>
-    </w:p>
-    <w:p>
-      <w:pPr>
-        <w:pStyle w:val="BodyText"/>
-      </w:pPr>
-      <w:r>
-        <w:t xml:space="preserve">The simplicity requirement is underlined by the fact that gaze reading emerges in human infants before the visual system has fully developed (</w:t>
-      </w:r>
-      <w:r>
-        <w:t xml:space="preserve">Babinet et al. (2021)</w:t>
-      </w:r>
-      <w:r>
-        <w:t xml:space="preserve">). This suggests that the EDD relies on low-level visual cues that can be processed quickly and efficiently, rather than complex feature extraction or high-resolution image processing.</w:t>
-      </w:r>
-    </w:p>
-    <w:p>
-      <w:pPr>
-        <w:pStyle w:val="BodyText"/>
-      </w:pPr>
-      <w:r>
-        <w:t xml:space="preserve">In our first study, we test the salience of the white sclera by constructing a technical receiver device, which is biologically plausible and computationally minimalistic. If this</w:t>
-      </w:r>
-      <w:r>
-        <w:t xml:space="preserve"> </w:t>
-      </w:r>
-      <w:r>
-        <w:rPr>
-          <w:i/>
-          <w:iCs/>
-        </w:rPr>
-        <w:t xml:space="preserve">eye tracking</w:t>
-      </w:r>
-      <w:r>
-        <w:t xml:space="preserve"> </w:t>
-      </w:r>
-      <w:r>
-        <w:t xml:space="preserve">device is comparably accurate to human glance reading, an upper limit for computational complexity of the signal can be established.</w:t>
-      </w:r>
-    </w:p>
-    <w:bookmarkStart w:id="24" w:name="minimum-complexity-eye-tracking"/>
-    <w:p>
-      <w:pPr>
-        <w:pStyle w:val="Heading3"/>
-      </w:pPr>
-      <w:r>
-        <w:t xml:space="preserve">Minimum-Complexity Eye Tracking</w:t>
-      </w:r>
-    </w:p>
-    <w:p>
-      <w:pPr>
-        <w:pStyle w:val="FirstParagraph"/>
-      </w:pPr>
-      <w:r>
-        <w:t xml:space="preserve">If the CEH, extended by the receiver mechanism, is correct, the human eye should be computationally simple to read with visual cues available to a human observer. Most commercial eye-tracking devices use signals that are not available to the human visual system, such as infrared reflections or magnetic fields (</w:t>
-      </w:r>
-      <w:r>
-        <w:t xml:space="preserve">Singh &amp; Singh (2012)</w:t>
-      </w:r>
-      <w:r>
-        <w:t xml:space="preserve">).</w:t>
-      </w:r>
-    </w:p>
-    <w:p>
-      <w:pPr>
-        <w:pStyle w:val="BodyText"/>
-      </w:pPr>
-      <w:r>
-        <w:t xml:space="preserve">The more recent video-oculographic devices instead use visible light cameras (</w:t>
-      </w:r>
-      <w:r>
-        <w:t xml:space="preserve">Zhou &amp; Geng (2004)</w:t>
-      </w:r>
-      <w:r>
-        <w:t xml:space="preserve">) and recently gave rise to the development of webcam, smartphone and VR eye tracking (</w:t>
-      </w:r>
-      <w:r>
-        <w:t xml:space="preserve">Ciesla &amp; Koziol (2012)</w:t>
-      </w:r>
-      <w:r>
-        <w:t xml:space="preserve">). Several algorithms have been developed in this line, often making use of advanced machine learning or computer vision techniques (</w:t>
-      </w:r>
-      <w:r>
-        <w:t xml:space="preserve">Krafka et al. (2016)</w:t>
-      </w:r>
-      <w:r>
-        <w:t xml:space="preserve">), which often resemble biological visual processing (</w:t>
-      </w:r>
-      <w:r>
         <w:t xml:space="preserve">(</w:t>
       </w:r>
       <w:r>
@@ -617,6 +295,560 @@
           <w:b/>
           <w:bCs/>
         </w:rPr>
+        <w:t xml:space="preserve">Bakker2022?</w:t>
+      </w:r>
+      <w:r>
+        <w:t xml:space="preserve">)</w:t>
+      </w:r>
+      <w:r>
+        <w:t xml:space="preserve">. Several non-lethal mutations are known in humans and apes</w:t>
+      </w:r>
+      <w:r>
+        <w:t xml:space="preserve"> </w:t>
+      </w:r>
+      <w:r>
+        <w:t xml:space="preserve">Dessinioti et al. (2009)</w:t>
+      </w:r>
+      <w:r>
+        <w:t xml:space="preserve">,</w:t>
+      </w:r>
+      <w:r>
+        <w:t xml:space="preserve"> </w:t>
+      </w:r>
+      <w:r>
+        <w:t xml:space="preserve">Mayhew &amp; Gómez (2015)</w:t>
+      </w:r>
+      <w:r>
+        <w:t xml:space="preserve">.@Mearing2022 found that sclera pigmentation varies stronger in anthropoid ape faces than was previously held, whereas there practically is no variation in the human sclera.</w:t>
+      </w:r>
+    </w:p>
+    <w:p>
+      <w:pPr>
+        <w:pStyle w:val="BodyText"/>
+      </w:pPr>
+      <w:r>
+        <w:t xml:space="preserve">One alternative explanation for scleral depigmentation deserves consideration: pleiotropy. The melanin synthesis pathway implicated in scleral pigmentation—tyrosinase and associated proteins such as OCA2, TYRP1, and SLC45A2</w:t>
+      </w:r>
+      <w:r>
+        <w:t xml:space="preserve"> </w:t>
+      </w:r>
+      <w:r>
+        <w:t xml:space="preserve">(Grønskov et al., 2007)</w:t>
+      </w:r>
+      <w:r>
+        <w:t xml:space="preserve">—is the same biosynthetic machinery known to underlie human skin pigmentation. Given that several of these loci are well-established targets of strong, geographically variable selection related to UV exposure and vitamin D synthesis, it is conceivable that scleral depigmentation arose not as an independently selected trait requiring its own receiver mechanism, but as an incidental by-product of selection acting primarily on skin colour. Under this scenario, no immediate fitness benefit specific to gaze signalling—and consequently no pre-existing receiver—would need to be invoked to explain the initial fixation of the trait.</w:t>
+      </w:r>
+    </w:p>
+    <w:p>
+      <w:pPr>
+        <w:pStyle w:val="BodyText"/>
+      </w:pPr>
+      <w:r>
+        <w:t xml:space="preserve">This explanation, however, sits uneasily with the available evidence. If scleral depigmentation were a pleiotropic side-effect of the same alleles driving skin-colour variation, one would expect it to covary with skin pigmentation across populations, mirroring the well-documented geographic gradient in human skin tone. As a minimum requirement, one would expect some variance at all. Instead,</w:t>
+      </w:r>
+      <w:r>
+        <w:t xml:space="preserve"> </w:t>
+      </w:r>
+      <w:r>
+        <w:t xml:space="preserve">Mearing et al. (2022)</w:t>
+      </w:r>
+      <w:r>
+        <w:t xml:space="preserve"> </w:t>
+      </w:r>
+      <w:r>
+        <w:t xml:space="preserve">report that scleral pigmentation shows essentially no variance across modern human populations, in marked contrast to the substantial variation observed among anthropoid apes. This uniformity is difficult to reconcile with a pleiotropic account tied to a geographically heterogeneous selective pressure, and instead is more consistent with a single, strongly selected mutation that reached fixation prior to the geographic diversification of modern human populations. We therefore consider a shared genetic origin with skin pigmentation an unlikely explanation for scleral depigmentation, and retain the assumption that the trait was subject to its own, dedicated selective pressure.</w:t>
+      </w:r>
+    </w:p>
+    <w:p>
+      <w:pPr>
+        <w:pStyle w:val="BodyText"/>
+      </w:pPr>
+      <w:r>
+        <w:t xml:space="preserve">On these grounds it seems quite likely that the white sclera appeared as a one-point mutation. Nevertheless, to become fixed in the population, it had to confer immediate fitness advantages, which requires an effective receiver mechanism.</w:t>
+      </w:r>
+    </w:p>
+    <w:bookmarkEnd w:id="21"/>
+    <w:bookmarkStart w:id="22" w:name="the-camouflage-hypothesis"/>
+    <w:p>
+      <w:pPr>
+        <w:pStyle w:val="Heading3"/>
+      </w:pPr>
+      <w:r>
+        <w:t xml:space="preserve">The Camouflage Hypothesis</w:t>
+      </w:r>
+    </w:p>
+    <w:p>
+      <w:pPr>
+        <w:pStyle w:val="FirstParagraph"/>
+      </w:pPr>
+      <w:r>
+        <w:t xml:space="preserve">Before turning to the question of a dedicated receiver for gaze</w:t>
+      </w:r>
+      <w:r>
+        <w:t xml:space="preserve"> </w:t>
+      </w:r>
+      <w:r>
+        <w:rPr>
+          <w:i/>
+          <w:iCs/>
+        </w:rPr>
+        <w:t xml:space="preserve">signalling</w:t>
+      </w:r>
+      <w:r>
+        <w:t xml:space="preserve">, it is worth examining a receiver that the argument so far has left implicit: the receiver presupposed by scleral</w:t>
+      </w:r>
+      <w:r>
+        <w:t xml:space="preserve"> </w:t>
+      </w:r>
+      <w:r>
+        <w:rPr>
+          <w:i/>
+          <w:iCs/>
+        </w:rPr>
+        <w:t xml:space="preserve">camouflage</w:t>
+      </w:r>
+      <w:r>
+        <w:t xml:space="preserve"> </w:t>
+      </w:r>
+      <w:r>
+        <w:t xml:space="preserve">itself. The camouflage hypothesis holds that pigmented conjunctiva conceals the high-contrast pattern formed by a dark pupil against a white sclera, thereby denying predators, prey, and conspecific rivals a cue to gaze direction and attentional focus (</w:t>
+      </w:r>
+      <w:r>
+        <w:t xml:space="preserve">Kobayashi &amp; Kohshima (2001)</w:t>
+      </w:r>
+      <w:r>
+        <w:t xml:space="preserve">,</w:t>
+      </w:r>
+      <w:r>
+        <w:t xml:space="preserve"> </w:t>
+      </w:r>
+      <w:r>
+        <w:t xml:space="preserve">Wolf et al. (2022)</w:t>
+      </w:r>
+      <w:r>
+        <w:t xml:space="preserve">). This explanation, near-universal among land vertebrates, is symmetric with the logic developed above for CEH: camouflage against a signal is only under selection if a receiver capable of exploiting that signal already exists. In other words, the camouflage hypothesis is not an alternative to the reciprocity problem — it</w:t>
+      </w:r>
+      <w:r>
+        <w:t xml:space="preserve"> </w:t>
+      </w:r>
+      <w:r>
+        <w:rPr>
+          <w:i/>
+          <w:iCs/>
+        </w:rPr>
+        <w:t xml:space="preserve">is</w:t>
+      </w:r>
+      <w:r>
+        <w:t xml:space="preserve"> </w:t>
+      </w:r>
+      <w:r>
+        <w:t xml:space="preserve">an instance of it, simply located on the observer’s side of a predator-prey or competitive interaction rather than on the side of a cooperating conspecific.</w:t>
+      </w:r>
+    </w:p>
+    <w:p>
+      <w:pPr>
+        <w:pStyle w:val="BodyText"/>
+      </w:pPr>
+      <w:r>
+        <w:t xml:space="preserve">Framed this way, the receiver in question is not a human-specific, gaze-dedicated mechanism at all, but a much more general and phylogenetically ancient one: a bias for detecting high-contrast, eye-like patterns and extracting coarse orientation information from them. This is precisely the kind of pre-existing perceptual bias that receiver psychology identifies as a precondition for signal evolution — new signals routinely evolve by exploiting sensory or cognitive biases that are already present in receivers, for reasons unrelated to the signal itself (</w:t>
+      </w:r>
+      <w:r>
+        <w:t xml:space="preserve">Guilford &amp; Dawkins (1991)</w:t>
+      </w:r>
+      <w:r>
+        <w:t xml:space="preserve">). A substantial body of work on sensory exploitation in sexual selection has documented this pattern directly: novel signals frequently arise by tapping into perceptual biases that evolved under entirely unrelated selection pressures, rather than by co-evolving in step with a matching receiver (</w:t>
+      </w:r>
+      <w:r>
+        <w:t xml:space="preserve">(</w:t>
+      </w:r>
+      <w:r>
+        <w:rPr>
+          <w:b/>
+          <w:bCs/>
+        </w:rPr>
+        <w:t xml:space="preserve">Ryan1990?</w:t>
+      </w:r>
+      <w:r>
+        <w:t xml:space="preserve">)</w:t>
+      </w:r>
+      <w:r>
+        <w:t xml:space="preserve">,</w:t>
+      </w:r>
+      <w:r>
+        <w:t xml:space="preserve"> </w:t>
+      </w:r>
+      <w:r>
+        <w:t xml:space="preserve">Endler &amp; Basolo (1998)</w:t>
+      </w:r>
+      <w:r>
+        <w:t xml:space="preserve">). Because scleral camouflage is selected against essentially this receiver across a wide range of taxa, not only among great apes, its underlying detection mechanism can be assumed to be old, general-purpose, and widely conserved — in sharp contrast to the specialized, human-specific EDD posited by</w:t>
+      </w:r>
+      <w:r>
+        <w:t xml:space="preserve"> </w:t>
+      </w:r>
+      <w:r>
+        <w:t xml:space="preserve">Baron-Cohen (1995)</w:t>
+      </w:r>
+      <w:r>
+        <w:t xml:space="preserve">.</w:t>
+      </w:r>
+    </w:p>
+    <w:p>
+      <w:pPr>
+        <w:pStyle w:val="BodyText"/>
+      </w:pPr>
+      <w:r>
+        <w:t xml:space="preserve">This reframing has a direct bearing on the reciprocity problem introduced above. Rather than requiring the coincident evolution of a</w:t>
+      </w:r>
+      <w:r>
+        <w:t xml:space="preserve"> </w:t>
+      </w:r>
+      <w:r>
+        <w:rPr>
+          <w:i/>
+          <w:iCs/>
+        </w:rPr>
+        <w:t xml:space="preserve">novel</w:t>
+      </w:r>
+      <w:r>
+        <w:t xml:space="preserve"> </w:t>
+      </w:r>
+      <w:r>
+        <w:t xml:space="preserve">receiver alongside scleral depigmentation, CEH can instead be understood as a case of receiver co-option: a generic contrast-detection bias, already present and already tuned to exactly this visual pattern through its role in predator and rival vigilance, became available for social exploitation the moment the sclera was no longer hidden. Under this view, the immediate fitness benefit required for fixation (see above) need not stem from a new capacity to</w:t>
+      </w:r>
+      <w:r>
+        <w:t xml:space="preserve"> </w:t>
+      </w:r>
+      <w:r>
+        <w:rPr>
+          <w:i/>
+          <w:iCs/>
+        </w:rPr>
+        <w:t xml:space="preserve">read</w:t>
+      </w:r>
+      <w:r>
+        <w:t xml:space="preserve"> </w:t>
+      </w:r>
+      <w:r>
+        <w:t xml:space="preserve">gaze direction in any refined sense, but merely from making a pattern that was already reliably detected — for entirely different, agonistic reasons — visible and exploitable in a cooperative context (</w:t>
+      </w:r>
+      <w:r>
+        <w:t xml:space="preserve">(</w:t>
+      </w:r>
+      <w:r>
+        <w:rPr>
+          <w:b/>
+          <w:bCs/>
+        </w:rPr>
+        <w:t xml:space="preserve">Ryan1990?</w:t>
+      </w:r>
+      <w:r>
+        <w:t xml:space="preserve">)</w:t>
+      </w:r>
+      <w:r>
+        <w:t xml:space="preserve">).</w:t>
+      </w:r>
+    </w:p>
+    <w:p>
+      <w:pPr>
+        <w:pStyle w:val="BodyText"/>
+      </w:pPr>
+      <w:r>
+        <w:t xml:space="preserve">What such a generic contrast detector plausibly could</w:t>
+      </w:r>
+      <w:r>
+        <w:t xml:space="preserve"> </w:t>
+      </w:r>
+      <w:r>
+        <w:rPr>
+          <w:i/>
+          <w:iCs/>
+        </w:rPr>
+        <w:t xml:space="preserve">not</w:t>
+      </w:r>
+      <w:r>
+        <w:t xml:space="preserve"> </w:t>
+      </w:r>
+      <w:r>
+        <w:t xml:space="preserve">have provided without further modification is fine-grained directional information — extracting not merely that a salient eye-like pattern is present, but</w:t>
+      </w:r>
+      <w:r>
+        <w:t xml:space="preserve"> </w:t>
+      </w:r>
+      <w:r>
+        <w:rPr>
+          <w:i/>
+          <w:iCs/>
+        </w:rPr>
+        <w:t xml:space="preserve">where</w:t>
+      </w:r>
+      <w:r>
+        <w:t xml:space="preserve"> </w:t>
+      </w:r>
+      <w:r>
+        <w:t xml:space="preserve">within it the dark pupil sits. This distinction between coarse detection and directional resolution motivates the question addressed in the following section: whether a dedicated Eye Direction Detector had to evolve on top of this ancestral vigilance mechanism, and if so, how large a computational step separates the two.</w:t>
+      </w:r>
+    </w:p>
+    <w:bookmarkEnd w:id="22"/>
+    <w:bookmarkStart w:id="23" w:name="the-eye-direction-detector-edd"/>
+    <w:p>
+      <w:pPr>
+        <w:pStyle w:val="Heading3"/>
+      </w:pPr>
+      <w:r>
+        <w:t xml:space="preserve">The Eye Direction Detector (EDD)</w:t>
+      </w:r>
+    </w:p>
+    <w:p>
+      <w:pPr>
+        <w:pStyle w:val="FirstParagraph"/>
+      </w:pPr>
+      <w:r>
+        <w:t xml:space="preserve">The existence of a specialized receiver represents a necessary corollary to the CEH. For scleral depigmentation to provide fitness benefits, human cognitive architecture must include mechanisms capable of rapidly and accurately extracting gaze direction from visual input.</w:t>
+      </w:r>
+    </w:p>
+    <w:p>
+      <w:pPr>
+        <w:pStyle w:val="BodyText"/>
+      </w:pPr>
+      <w:r>
+        <w:t xml:space="preserve">For</w:t>
+      </w:r>
+      <w:r>
+        <w:t xml:space="preserve"> </w:t>
+      </w:r>
+      <w:r>
+        <w:t xml:space="preserve">Baron-Cohen (1995)</w:t>
+      </w:r>
+      <w:r>
+        <w:t xml:space="preserve"> </w:t>
+      </w:r>
+      <w:r>
+        <w:t xml:space="preserve">eye direction detection (EDD) is a pivotal mechanism in his concept of Theory of Mind, marking it as a primarily social cognitive device. The existence of specialized neural networks for gaze processing is supported by neuroimaging studies showing that certain brain regions are preferentially activated when individuals view eye regions or interpret gaze direction (</w:t>
+      </w:r>
+      <w:r>
+        <w:t xml:space="preserve">Babinet et al. (2021)</w:t>
+      </w:r>
+      <w:r>
+        <w:t xml:space="preserve">).</w:t>
+      </w:r>
+    </w:p>
+    <w:p>
+      <w:pPr>
+        <w:pStyle w:val="BodyText"/>
+      </w:pPr>
+      <w:r>
+        <w:t xml:space="preserve">Supporting evidence comes from developmental studies demonstrating that human infants respond to direct gaze and exhibit rudimentary gaze-following behaviors from birth (</w:t>
+      </w:r>
+      <w:r>
+        <w:t xml:space="preserve">Farroni et al. (2003)</w:t>
+      </w:r>
+      <w:r>
+        <w:t xml:space="preserve">,</w:t>
+      </w:r>
+      <w:r>
+        <w:t xml:space="preserve"> </w:t>
+      </w:r>
+      <w:r>
+        <w:t xml:space="preserve">Farroni et al. (2004)</w:t>
+      </w:r>
+      <w:r>
+        <w:t xml:space="preserve">,</w:t>
+      </w:r>
+      <w:r>
+        <w:t xml:space="preserve"> </w:t>
+      </w:r>
+      <w:r>
+        <w:t xml:space="preserve">Farroni et al. (2007)</w:t>
+      </w:r>
+      <w:r>
+        <w:t xml:space="preserve">). These findings suggest that gaze perception operates through innate cognitive mechanisms that are functional in early development, before extensive learning could account for such abilities.</w:t>
+      </w:r>
+    </w:p>
+    <w:p>
+      <w:pPr>
+        <w:pStyle w:val="BodyText"/>
+      </w:pPr>
+      <w:r>
+        <w:t xml:space="preserve">It is almost impossible that such a refined receiver already existed, when the white sclera appeared. And it is also unlikely that it evolved as a one-point mutation. A possibility is that the white sclera encountered a rudimentary precursor of the EDD. As</w:t>
+      </w:r>
+      <w:r>
+        <w:t xml:space="preserve"> </w:t>
+      </w:r>
+      <w:r>
+        <w:t xml:space="preserve">Laidre &amp; Johnstone (2013)</w:t>
+      </w:r>
+      <w:r>
+        <w:t xml:space="preserve"> </w:t>
+      </w:r>
+      <w:r>
+        <w:t xml:space="preserve">points out, it is a common assumption that</w:t>
+      </w:r>
+      <w:r>
+        <w:t xml:space="preserve"> </w:t>
+      </w:r>
+      <w:r>
+        <w:t xml:space="preserve">“many signals have evolved from what once were cues.”</w:t>
+      </w:r>
+    </w:p>
+    <w:bookmarkEnd w:id="23"/>
+    <w:bookmarkStart w:id="24" w:name="salience-and-simplicity"/>
+    <w:p>
+      <w:pPr>
+        <w:pStyle w:val="Heading3"/>
+      </w:pPr>
+      <w:r>
+        <w:t xml:space="preserve">Salience and simplicity</w:t>
+      </w:r>
+    </w:p>
+    <w:p>
+      <w:pPr>
+        <w:pStyle w:val="FirstParagraph"/>
+      </w:pPr>
+      <w:r>
+        <w:t xml:space="preserve">The high contrast between the white sclera and the dark pupil creates a visually striking pattern that</w:t>
+      </w:r>
+      <w:r>
+        <w:t xml:space="preserve"> </w:t>
+      </w:r>
+      <w:r>
+        <w:t xml:space="preserve">“naturally”</w:t>
+      </w:r>
+      <w:r>
+        <w:t xml:space="preserve"> </w:t>
+      </w:r>
+      <w:r>
+        <w:t xml:space="preserve">draws attention. However, measuring salience by human judgement bares the risk of circular reasoning, because ease of processing is a consequence of the same evolutionary process.</w:t>
+      </w:r>
+    </w:p>
+    <w:p>
+      <w:pPr>
+        <w:pStyle w:val="BodyText"/>
+      </w:pPr>
+      <w:r>
+        <w:t xml:space="preserve">The salience of a cue can more objectively be understood in terms of its</w:t>
+      </w:r>
+      <w:r>
+        <w:t xml:space="preserve"> </w:t>
+      </w:r>
+      <w:r>
+        <w:rPr>
+          <w:i/>
+          <w:iCs/>
+        </w:rPr>
+        <w:t xml:space="preserve">computational simplicity</w:t>
+      </w:r>
+      <w:r>
+        <w:t xml:space="preserve">. Under this view, the likelihood that a matching cognitive mechanism already existed depends largely on how complex this mechanism had to be.</w:t>
+      </w:r>
+      <w:r>
+        <w:br/>
+      </w:r>
+      <w:r>
+        <w:t xml:space="preserve">Consequently, evolutionary novel receiver mechanisms, such as the EDD, are expected to exhibit computational simplicity while maintaining functional efficiency (</w:t>
+      </w:r>
+      <w:r>
+        <w:t xml:space="preserve">Guilford &amp; Dawkins (1991)</w:t>
+      </w:r>
+      <w:r>
+        <w:t xml:space="preserve">).</w:t>
+      </w:r>
+    </w:p>
+    <w:p>
+      <w:pPr>
+        <w:pStyle w:val="BodyText"/>
+      </w:pPr>
+      <w:r>
+        <w:t xml:space="preserve">The simplicity requirement is underlined by the fact that gaze reading emerges in human infants before the visual system has fully developed (</w:t>
+      </w:r>
+      <w:r>
+        <w:t xml:space="preserve">Babinet et al. (2021)</w:t>
+      </w:r>
+      <w:r>
+        <w:t xml:space="preserve">). This suggests that the EDD relies on low-level visual cues that can be processed quickly and efficiently, rather than complex feature extraction or high-resolution image processing.</w:t>
+      </w:r>
+    </w:p>
+    <w:p>
+      <w:pPr>
+        <w:pStyle w:val="BodyText"/>
+      </w:pPr>
+      <w:r>
+        <w:t xml:space="preserve">In our first study, we test the salience of the white sclera by constructing a technical receiver device, which is biologically plausible and computationally minimalistic. If this</w:t>
+      </w:r>
+      <w:r>
+        <w:t xml:space="preserve"> </w:t>
+      </w:r>
+      <w:r>
+        <w:rPr>
+          <w:i/>
+          <w:iCs/>
+        </w:rPr>
+        <w:t xml:space="preserve">eye tracking</w:t>
+      </w:r>
+      <w:r>
+        <w:t xml:space="preserve"> </w:t>
+      </w:r>
+      <w:r>
+        <w:t xml:space="preserve">device is comparably accurate to human glance reading, an upper limit for computational complexity of the signal can be established.</w:t>
+      </w:r>
+    </w:p>
+    <w:bookmarkEnd w:id="24"/>
+    <w:bookmarkStart w:id="25" w:name="minimum-complexity-eye-tracking"/>
+    <w:p>
+      <w:pPr>
+        <w:pStyle w:val="Heading3"/>
+      </w:pPr>
+      <w:r>
+        <w:t xml:space="preserve">Minimum-Complexity Eye Tracking</w:t>
+      </w:r>
+    </w:p>
+    <w:p>
+      <w:pPr>
+        <w:pStyle w:val="FirstParagraph"/>
+      </w:pPr>
+      <w:r>
+        <w:t xml:space="preserve">If the CEH, extended by the receiver mechanism, is correct, the human eye should be computationally simple to read with visual cues available to a human observer. Most commercial eye-tracking devices use signals that are not available to the human visual system, such as infrared reflections or magnetic fields (</w:t>
+      </w:r>
+      <w:r>
+        <w:t xml:space="preserve">Singh &amp; Singh (2012)</w:t>
+      </w:r>
+      <w:r>
+        <w:t xml:space="preserve">).</w:t>
+      </w:r>
+    </w:p>
+    <w:p>
+      <w:pPr>
+        <w:pStyle w:val="BodyText"/>
+      </w:pPr>
+      <w:r>
+        <w:t xml:space="preserve">The more recent video-oculographic devices instead use visible light cameras (</w:t>
+      </w:r>
+      <w:r>
+        <w:t xml:space="preserve">Zhou &amp; Geng (2004)</w:t>
+      </w:r>
+      <w:r>
+        <w:t xml:space="preserve">) and recently gave rise to the development of webcam, smartphone and VR eye tracking (</w:t>
+      </w:r>
+      <w:r>
+        <w:t xml:space="preserve">Ciesla &amp; Koziol (2012)</w:t>
+      </w:r>
+      <w:r>
+        <w:t xml:space="preserve">). Several algorithms have been developed in this line, often making use of advanced machine learning or computer vision techniques (</w:t>
+      </w:r>
+      <w:r>
+        <w:t xml:space="preserve">Krafka et al. (2016)</w:t>
+      </w:r>
+      <w:r>
+        <w:t xml:space="preserve">), which often resemble biological visual processing (</w:t>
+      </w:r>
+      <w:r>
+        <w:t xml:space="preserve">(</w:t>
+      </w:r>
+      <w:r>
+        <w:rPr>
+          <w:b/>
+          <w:bCs/>
+        </w:rPr>
         <w:t xml:space="preserve">Kumar2017?</w:t>
       </w:r>
       <w:r>
@@ -667,9 +899,9 @@
         <w:t xml:space="preserve">The visual cortex can approximately be modeled as a deep neural network and one strategy to a minimum complexity system is to find the smallest network that still performs well. In this study we employed the opposite strategy, starting from the most simple device imagineable.</w:t>
       </w:r>
     </w:p>
-    <w:bookmarkEnd w:id="24"/>
     <w:bookmarkEnd w:id="25"/>
-    <w:bookmarkStart w:id="56" w:name="X22205b61d1e77e2fd0cafc196602fb9f87730eb"/>
+    <w:bookmarkEnd w:id="26"/>
+    <w:bookmarkStart w:id="57" w:name="X22205b61d1e77e2fd0cafc196602fb9f87730eb"/>
     <w:p>
       <w:pPr>
         <w:pStyle w:val="Heading1"/>
@@ -969,7 +1201,7 @@
         <w:t xml:space="preserve">The first study was conducted to evaluate the accuracy of the QuadBright algorithm. The algorithm was tested on a 36 participants, who were asked to glance at an orange target on a white background, moving in a random pattern between 24 positions in a six-by-four grid.</w:t>
       </w:r>
     </w:p>
-    <w:bookmarkStart w:id="39" w:name="methods"/>
+    <w:bookmarkStart w:id="40" w:name="methods"/>
     <w:p>
       <w:pPr>
         <w:pStyle w:val="Heading2"/>
@@ -978,7 +1210,7 @@
         <w:t xml:space="preserve">Methods</w:t>
       </w:r>
     </w:p>
-    <w:bookmarkStart w:id="35" w:name="yet-zero-implementation"/>
+    <w:bookmarkStart w:id="36" w:name="yet-zero-implementation"/>
     <w:p>
       <w:pPr>
         <w:pStyle w:val="Heading3"/>
@@ -1101,7 +1333,7 @@
         <w:t xml:space="preserve">The first iteration of the system was very susceptible to changes in computer screen brightness introduced by the presented stimuli. While the best solution is to use a frontal brightness sensor and extend the model accordingly, as a quick fix the quick calibration was augmented with a highly degraded preview of the next stimulus, just enough to keep the brightness level stable between calibration and trials.</w:t>
       </w:r>
     </w:p>
-    <w:bookmarkStart w:id="34" w:name="fig-yet-zero"/>
+    <w:bookmarkStart w:id="35" w:name="fig-yet-zero"/>
     <w:tbl>
       <w:tblPr>
         <w:tblStyle w:val="Table"/>
@@ -1128,7 +1360,7 @@
             <w:tr>
               <w:tc>
                 <w:tcPr/>
-                <w:bookmarkStart w:id="29" w:name="fig-headmount"/>
+                <w:bookmarkStart w:id="30" w:name="fig-headmount"/>
                 <w:p>
                   <w:pPr>
                     <w:pStyle w:val="Compact"/>
@@ -1140,18 +1372,18 @@
                       <wp:inline>
                         <wp:extent cx="2971800" cy="4306591"/>
                         <wp:effectExtent b="0" l="0" r="0" t="0"/>
-                        <wp:docPr descr="" title="" id="27" name="Picture"/>
+                        <wp:docPr descr="" title="" id="28" name="Picture"/>
                         <a:graphic>
                           <a:graphicData uri="http://schemas.openxmlformats.org/drawingml/2006/picture">
                             <pic:pic>
                               <pic:nvPicPr>
-                                <pic:cNvPr descr="Illustrations/YET_Bender_1.png" id="28" name="Picture"/>
+                                <pic:cNvPr descr="Illustrations/YET_Bender_1.png" id="29" name="Picture"/>
                                 <pic:cNvPicPr>
                                   <a:picLocks noChangeArrowheads="1" noChangeAspect="1"/>
                                 </pic:cNvPicPr>
                               </pic:nvPicPr>
                               <pic:blipFill>
-                                <a:blip r:embed="rId26"/>
+                                <a:blip r:embed="rId27"/>
                                 <a:stretch>
                                   <a:fillRect/>
                                 </a:stretch>
@@ -1192,7 +1424,7 @@
                     <w:t xml:space="preserve">(a) Headmount with camera</w:t>
                   </w:r>
                 </w:p>
-                <w:bookmarkEnd w:id="29"/>
+                <w:bookmarkEnd w:id="30"/>
               </w:tc>
             </w:tr>
           </w:tbl>
@@ -1214,24 +1446,24 @@
       <w:r>
         <w:t xml:space="preserve"> </w:t>
       </w:r>
-      <w:bookmarkStart w:id="33" w:name="fig-headrest"/>
+      <w:bookmarkStart w:id="34" w:name="fig-headrest"/>
       <w:r>
         <w:drawing>
           <wp:inline>
             <wp:extent cx="2971800" cy="2966095"/>
             <wp:effectExtent b="0" l="0" r="0" t="0"/>
-            <wp:docPr descr="In use with headrest" title="" id="31" name="Picture"/>
+            <wp:docPr descr="In use with headrest" title="" id="32" name="Picture"/>
             <a:graphic>
               <a:graphicData uri="http://schemas.openxmlformats.org/drawingml/2006/picture">
                 <pic:pic>
                   <pic:nvPicPr>
-                    <pic:cNvPr descr="Illustrations/YET_Bender_2.png" id="32" name="Picture"/>
+                    <pic:cNvPr descr="Illustrations/YET_Bender_2.png" id="33" name="Picture"/>
                     <pic:cNvPicPr>
                       <a:picLocks noChangeArrowheads="1" noChangeAspect="1"/>
                     </pic:cNvPicPr>
                   </pic:nvPicPr>
                   <pic:blipFill>
-                    <a:blip r:embed="rId30"/>
+                    <a:blip r:embed="rId31"/>
                     <a:stretch>
                       <a:fillRect/>
                     </a:stretch>
@@ -1257,7 +1489,7 @@
           </wp:inline>
         </w:drawing>
       </w:r>
-      <w:bookmarkEnd w:id="33"/>
+      <w:bookmarkEnd w:id="34"/>
       <w:r>
         <w:t xml:space="preserve"> </w:t>
       </w:r>
@@ -1274,9 +1506,9 @@
         <w:t xml:space="preserve">.</w:t>
       </w:r>
     </w:p>
-    <w:bookmarkEnd w:id="34"/>
     <w:bookmarkEnd w:id="35"/>
-    <w:bookmarkStart w:id="36" w:name="experimental-design"/>
+    <w:bookmarkEnd w:id="36"/>
+    <w:bookmarkStart w:id="37" w:name="experimental-design"/>
     <w:p>
       <w:pPr>
         <w:pStyle w:val="Heading3"/>
@@ -1310,8 +1542,8 @@
         <w:t xml:space="preserve">.</w:t>
       </w:r>
     </w:p>
-    <w:bookmarkEnd w:id="36"/>
-    <w:bookmarkStart w:id="37" w:name="sample"/>
+    <w:bookmarkEnd w:id="37"/>
+    <w:bookmarkStart w:id="38" w:name="sample"/>
     <w:p>
       <w:pPr>
         <w:pStyle w:val="Heading3"/>
@@ -1328,8 +1560,8 @@
         <w:t xml:space="preserve">Twenty-four participants were recruited using convenience sampling. Participants with any form of sight corrections were excluded from the study.</w:t>
       </w:r>
     </w:p>
-    <w:bookmarkEnd w:id="37"/>
-    <w:bookmarkStart w:id="38" w:name="data-analysis"/>
+    <w:bookmarkEnd w:id="38"/>
+    <w:bookmarkStart w:id="39" w:name="data-analysis"/>
     <w:p>
       <w:pPr>
         <w:pStyle w:val="Heading3"/>
@@ -1382,9 +1614,9 @@
         <w:t xml:space="preserve">.</w:t>
       </w:r>
     </w:p>
-    <w:bookmarkEnd w:id="38"/>
     <w:bookmarkEnd w:id="39"/>
-    <w:bookmarkStart w:id="54" w:name="results"/>
+    <w:bookmarkEnd w:id="40"/>
+    <w:bookmarkStart w:id="55" w:name="results"/>
     <w:p>
       <w:pPr>
         <w:pStyle w:val="Heading2"/>
@@ -1435,7 +1667,7 @@
       <w:tr>
         <w:tc>
           <w:tcPr/>
-          <w:bookmarkStart w:id="43" w:name="fig-sample-degree-error"/>
+          <w:bookmarkStart w:id="44" w:name="fig-sample-degree-error"/>
           <w:p>
             <w:pPr>
               <w:pStyle w:val="Compact"/>
@@ -1446,18 +1678,18 @@
                 <wp:inline>
                   <wp:extent cx="4620126" cy="3696101"/>
                   <wp:effectExtent b="0" l="0" r="0" t="0"/>
-                  <wp:docPr descr="" title="" id="41" name="Picture"/>
+                  <wp:docPr descr="" title="" id="42" name="Picture"/>
                   <a:graphic>
                     <a:graphicData uri="http://schemas.openxmlformats.org/drawingml/2006/picture">
                       <pic:pic>
                         <pic:nvPicPr>
-                          <pic:cNvPr descr="YET_CEHR_files/figure-docx/fig-sample-degree-error-1.png" id="42" name="Picture"/>
+                          <pic:cNvPr descr="YET_CEHR_files/figure-docx/fig-sample-degree-error-1.png" id="43" name="Picture"/>
                           <pic:cNvPicPr>
                             <a:picLocks noChangeArrowheads="1" noChangeAspect="1"/>
                           </pic:cNvPicPr>
                         </pic:nvPicPr>
                         <pic:blipFill>
-                          <a:blip r:embed="rId40"/>
+                          <a:blip r:embed="rId41"/>
                           <a:stretch>
                             <a:fillRect/>
                           </a:stretch>
@@ -1497,7 +1729,7 @@
               <w:t xml:space="preserve">Figure 2: Distribution of degree errors across all trials and participants. Vertical lines indicate the mean (green), median (blue) and 95% quantile (red). Note the logarithmic scale on the x-axis.</w:t>
             </w:r>
           </w:p>
-          <w:bookmarkEnd w:id="43"/>
+          <w:bookmarkEnd w:id="44"/>
         </w:tc>
       </w:tr>
     </w:tbl>
@@ -1514,7 +1746,7 @@
       <w:tr>
         <w:tc>
           <w:tcPr/>
-          <w:bookmarkStart w:id="44" w:name="tbl-fixef-M1"/>
+          <w:bookmarkStart w:id="45" w:name="tbl-fixef-M1"/>
           <w:p>
             <w:pPr>
               <w:jc w:val="center"/>
@@ -1868,7 +2100,7 @@
               </w:tc>
             </w:tr>
           </w:tbl>
-          <w:bookmarkEnd w:id="44"/>
+          <w:bookmarkEnd w:id="45"/>
           <w:p/>
         </w:tc>
       </w:tr>
@@ -1892,7 +2124,7 @@
         <w:t xml:space="preserve">). The square terms for both axis are positive and prominent, which means that the error increases towards extreme positions. The linear terms are both negative, which means that the point of optimal accuracy is not in the center, but slightly up and mount-side, with the largest error in the upper nasal corner.</w:t>
       </w:r>
     </w:p>
-    <w:bookmarkStart w:id="53" w:name="fig-predicted-degree-error"/>
+    <w:bookmarkStart w:id="54" w:name="fig-predicted-degree-error"/>
     <w:tbl>
       <w:tblPr>
         <w:tblStyle w:val="Table"/>
@@ -1920,7 +2152,7 @@
             <w:tr>
               <w:tc>
                 <w:tcPr/>
-                <w:bookmarkStart w:id="48" w:name="fig-predicted-degree-error-1"/>
+                <w:bookmarkStart w:id="49" w:name="fig-predicted-degree-error-1"/>
                 <w:p>
                   <w:pPr>
                     <w:pStyle w:val="Compact"/>
@@ -1932,18 +2164,18 @@
                       <wp:inline>
                         <wp:extent cx="2971800" cy="2377440"/>
                         <wp:effectExtent b="0" l="0" r="0" t="0"/>
-                        <wp:docPr descr="" title="" id="46" name="Picture"/>
+                        <wp:docPr descr="" title="" id="47" name="Picture"/>
                         <a:graphic>
                           <a:graphicData uri="http://schemas.openxmlformats.org/drawingml/2006/picture">
                             <pic:pic>
                               <pic:nvPicPr>
-                                <pic:cNvPr descr="YET_CEHR_files/figure-docx/fig-predicted-degree-error-1.png" id="47" name="Picture"/>
+                                <pic:cNvPr descr="YET_CEHR_files/figure-docx/fig-predicted-degree-error-1.png" id="48" name="Picture"/>
                                 <pic:cNvPicPr>
                                   <a:picLocks noChangeArrowheads="1" noChangeAspect="1"/>
                                 </pic:cNvPicPr>
                               </pic:nvPicPr>
                               <pic:blipFill>
-                                <a:blip r:embed="rId45"/>
+                                <a:blip r:embed="rId46"/>
                                 <a:stretch>
                                   <a:fillRect/>
                                 </a:stretch>
@@ -1984,7 +2216,7 @@
                     <w:t xml:space="preserve">(a) Horizontal error</w:t>
                   </w:r>
                 </w:p>
-                <w:bookmarkEnd w:id="48"/>
+                <w:bookmarkEnd w:id="49"/>
               </w:tc>
             </w:tr>
           </w:tbl>
@@ -2005,7 +2237,7 @@
             <w:tr>
               <w:tc>
                 <w:tcPr/>
-                <w:bookmarkStart w:id="52" w:name="fig-predicted-degree-error-2"/>
+                <w:bookmarkStart w:id="53" w:name="fig-predicted-degree-error-2"/>
                 <w:p>
                   <w:pPr>
                     <w:pStyle w:val="Compact"/>
@@ -2017,18 +2249,18 @@
                       <wp:inline>
                         <wp:extent cx="2971800" cy="2377440"/>
                         <wp:effectExtent b="0" l="0" r="0" t="0"/>
-                        <wp:docPr descr="" title="" id="50" name="Picture"/>
+                        <wp:docPr descr="" title="" id="51" name="Picture"/>
                         <a:graphic>
                           <a:graphicData uri="http://schemas.openxmlformats.org/drawingml/2006/picture">
                             <pic:pic>
                               <pic:nvPicPr>
-                                <pic:cNvPr descr="YET_CEHR_files/figure-docx/fig-predicted-degree-error-2.png" id="51" name="Picture"/>
+                                <pic:cNvPr descr="YET_CEHR_files/figure-docx/fig-predicted-degree-error-2.png" id="52" name="Picture"/>
                                 <pic:cNvPicPr>
                                   <a:picLocks noChangeArrowheads="1" noChangeAspect="1"/>
                                 </pic:cNvPicPr>
                               </pic:nvPicPr>
                               <pic:blipFill>
-                                <a:blip r:embed="rId49"/>
+                                <a:blip r:embed="rId50"/>
                                 <a:stretch>
                                   <a:fillRect/>
                                 </a:stretch>
@@ -2069,7 +2301,7 @@
                     <w:t xml:space="preserve">(b) Vertical error</w:t>
                   </w:r>
                 </w:p>
-                <w:bookmarkEnd w:id="52"/>
+                <w:bookmarkEnd w:id="53"/>
               </w:tc>
             </w:tr>
           </w:tbl>
@@ -2089,7 +2321,7 @@
         <w:t xml:space="preserve">Figure 3: Predicted degree error by target position and participant. Points show center estimate per trial with LOESS lines for interpolation.</w:t>
       </w:r>
     </w:p>
-    <w:bookmarkEnd w:id="53"/>
+    <w:bookmarkEnd w:id="54"/>
     <w:p>
       <w:pPr>
         <w:pStyle w:val="BodyText"/>
@@ -2109,8 +2341,8 @@
         <w:t xml:space="preserve">shows the fitted degree errors per participant. While the curvature is rather similar, there appears to be individual differences in the overall level. In the vast majority of of participants, the error is below 5 degree for most of the range.</w:t>
       </w:r>
     </w:p>
-    <w:bookmarkEnd w:id="54"/>
-    <w:bookmarkStart w:id="55" w:name="conclusion"/>
+    <w:bookmarkEnd w:id="55"/>
+    <w:bookmarkStart w:id="56" w:name="conclusion"/>
     <w:p>
       <w:pPr>
         <w:pStyle w:val="Heading2"/>
@@ -2163,9 +2395,9 @@
         <w:t xml:space="preserve">. Altogether, the Quadbright device qualifies as a candidate model for human eye direction reading.</w:t>
       </w:r>
     </w:p>
-    <w:bookmarkEnd w:id="55"/>
     <w:bookmarkEnd w:id="56"/>
-    <w:bookmarkStart w:id="85" w:name="X739e7a8d01a3a8db6358f3cf49c7af788e1739a"/>
+    <w:bookmarkEnd w:id="57"/>
+    <w:bookmarkStart w:id="86" w:name="X739e7a8d01a3a8db6358f3cf49c7af788e1739a"/>
     <w:p>
       <w:pPr>
         <w:pStyle w:val="Heading1"/>
@@ -2216,7 +2448,7 @@
         <w:t xml:space="preserve">A problematic outcome of the experiment would be if participants cannot read the Quadbright condition at all. In this case, we have no possibility to decide whether a progenitor receiver exists, or whether this just uses a mechanism yet unknown.</w:t>
       </w:r>
     </w:p>
-    <w:bookmarkStart w:id="84" w:name="methods-1"/>
+    <w:bookmarkStart w:id="85" w:name="methods-1"/>
     <w:p>
       <w:pPr>
         <w:pStyle w:val="Heading2"/>
@@ -2225,7 +2457,7 @@
         <w:t xml:space="preserve">Methods</w:t>
       </w:r>
     </w:p>
-    <w:bookmarkStart w:id="66" w:name="experimental-design-1"/>
+    <w:bookmarkStart w:id="67" w:name="experimental-design-1"/>
     <w:p>
       <w:pPr>
         <w:pStyle w:val="Heading3"/>
@@ -2274,7 +2506,7 @@
         <w:t xml:space="preserve">. Exposure times varied in five steps (70, 140, 400, 600 and 1000 milliseconds).</w:t>
       </w:r>
     </w:p>
-    <w:bookmarkStart w:id="65" w:name="fig-qb-stimuli"/>
+    <w:bookmarkStart w:id="66" w:name="fig-qb-stimuli"/>
     <w:tbl>
       <w:tblPr>
         <w:tblStyle w:val="Table"/>
@@ -2301,7 +2533,7 @@
             <w:tr>
               <w:tc>
                 <w:tcPr/>
-                <w:bookmarkStart w:id="60" w:name="fig-qb-control"/>
+                <w:bookmarkStart w:id="61" w:name="fig-qb-control"/>
                 <w:p>
                   <w:pPr>
                     <w:pStyle w:val="Compact"/>
@@ -2313,18 +2545,18 @@
                       <wp:inline>
                         <wp:extent cx="2971800" cy="2820458"/>
                         <wp:effectExtent b="0" l="0" r="0" t="0"/>
-                        <wp:docPr descr="" title="" id="58" name="Picture"/>
+                        <wp:docPr descr="" title="" id="59" name="Picture"/>
                         <a:graphic>
                           <a:graphicData uri="http://schemas.openxmlformats.org/drawingml/2006/picture">
                             <pic:pic>
                               <pic:nvPicPr>
-                                <pic:cNvPr descr="Illustrations/Exp_Control.png" id="59" name="Picture"/>
+                                <pic:cNvPr descr="Illustrations/Exp_Control.png" id="60" name="Picture"/>
                                 <pic:cNvPicPr>
                                   <a:picLocks noChangeArrowheads="1" noChangeAspect="1"/>
                                 </pic:cNvPicPr>
                               </pic:nvPicPr>
                               <pic:blipFill>
-                                <a:blip r:embed="rId57"/>
+                                <a:blip r:embed="rId58"/>
                                 <a:stretch>
                                   <a:fillRect/>
                                 </a:stretch>
@@ -2365,7 +2597,7 @@
                     <w:t xml:space="preserve">(a) Control condition</w:t>
                   </w:r>
                 </w:p>
-                <w:bookmarkEnd w:id="60"/>
+                <w:bookmarkEnd w:id="61"/>
               </w:tc>
             </w:tr>
           </w:tbl>
@@ -2387,24 +2619,24 @@
       <w:r>
         <w:t xml:space="preserve"> </w:t>
       </w:r>
-      <w:bookmarkStart w:id="64" w:name="fig-qb-experimental"/>
+      <w:bookmarkStart w:id="65" w:name="fig-qb-experimental"/>
       <w:r>
         <w:drawing>
           <wp:inline>
             <wp:extent cx="2971800" cy="2859920"/>
             <wp:effectExtent b="0" l="0" r="0" t="0"/>
-            <wp:docPr descr="Quadbright condition" title="" id="62" name="Picture"/>
+            <wp:docPr descr="Quadbright condition" title="" id="63" name="Picture"/>
             <a:graphic>
               <a:graphicData uri="http://schemas.openxmlformats.org/drawingml/2006/picture">
                 <pic:pic>
                   <pic:nvPicPr>
-                    <pic:cNvPr descr="Illustrations/Exp_QB.png" id="63" name="Picture"/>
+                    <pic:cNvPr descr="Illustrations/Exp_QB.png" id="64" name="Picture"/>
                     <pic:cNvPicPr>
                       <a:picLocks noChangeArrowheads="1" noChangeAspect="1"/>
                     </pic:cNvPicPr>
                   </pic:nvPicPr>
                   <pic:blipFill>
-                    <a:blip r:embed="rId61"/>
+                    <a:blip r:embed="rId62"/>
                     <a:stretch>
                       <a:fillRect/>
                     </a:stretch>
@@ -2430,7 +2662,7 @@
           </wp:inline>
         </w:drawing>
       </w:r>
-      <w:bookmarkEnd w:id="64"/>
+      <w:bookmarkEnd w:id="65"/>
       <w:r>
         <w:t xml:space="preserve"> </w:t>
       </w:r>
@@ -2444,9 +2676,9 @@
         <w:t xml:space="preserve">(Hölter &amp; Schmettow, 2025, with permission)</w:t>
       </w:r>
     </w:p>
-    <w:bookmarkEnd w:id="65"/>
     <w:bookmarkEnd w:id="66"/>
-    <w:bookmarkStart w:id="67" w:name="sample-1"/>
+    <w:bookmarkEnd w:id="67"/>
+    <w:bookmarkStart w:id="68" w:name="sample-1"/>
     <w:p>
       <w:pPr>
         <w:pStyle w:val="Heading3"/>
@@ -2463,8 +2695,8 @@
         <w:t xml:space="preserve">A sample of 43 participants was collected via convenience sampling with 20 female, 23 male, 18 to 70 years with an average age of 34.2 years). The study was approved by the Humannities &amp; Social Sciences ethics committee of the University of Twente under the number 250623. All participants provided informed consent prior to participation.</w:t>
       </w:r>
     </w:p>
-    <w:bookmarkEnd w:id="67"/>
-    <w:bookmarkStart w:id="68" w:name="data-analysis-1"/>
+    <w:bookmarkEnd w:id="68"/>
+    <w:bookmarkStart w:id="69" w:name="data-analysis-1"/>
     <w:p>
       <w:pPr>
         <w:pStyle w:val="Heading3"/>
@@ -2510,8 +2742,8 @@
         <w:t xml:space="preserve">.</w:t>
       </w:r>
     </w:p>
-    <w:bookmarkEnd w:id="68"/>
-    <w:bookmarkStart w:id="83" w:name="results-1"/>
+    <w:bookmarkEnd w:id="69"/>
+    <w:bookmarkStart w:id="84" w:name="results-1"/>
     <w:p>
       <w:pPr>
         <w:pStyle w:val="Heading3"/>
@@ -2533,7 +2765,7 @@
       <w:tr>
         <w:tc>
           <w:tcPr/>
-          <w:bookmarkStart w:id="72" w:name="fig-fixef-M4"/>
+          <w:bookmarkStart w:id="73" w:name="fig-fixef-M4"/>
           <w:p>
             <w:pPr>
               <w:pStyle w:val="Compact"/>
@@ -2544,18 +2776,18 @@
                 <wp:inline>
                   <wp:extent cx="4620126" cy="3696101"/>
                   <wp:effectExtent b="0" l="0" r="0" t="0"/>
-                  <wp:docPr descr="" title="" id="70" name="Picture"/>
+                  <wp:docPr descr="" title="" id="71" name="Picture"/>
                   <a:graphic>
                     <a:graphicData uri="http://schemas.openxmlformats.org/drawingml/2006/picture">
                       <pic:pic>
                         <pic:nvPicPr>
-                          <pic:cNvPr descr="YET_CEHR_files/figure-docx/fig-fixef-M4-1.png" id="71" name="Picture"/>
+                          <pic:cNvPr descr="YET_CEHR_files/figure-docx/fig-fixef-M4-1.png" id="72" name="Picture"/>
                           <pic:cNvPicPr>
                             <a:picLocks noChangeArrowheads="1" noChangeAspect="1"/>
                           </pic:cNvPicPr>
                         </pic:nvPicPr>
                         <pic:blipFill>
-                          <a:blip r:embed="rId69"/>
+                          <a:blip r:embed="rId70"/>
                           <a:stretch>
                             <a:fillRect/>
                           </a:stretch>
@@ -2595,7 +2827,7 @@
               <w:t xml:space="preserve">Figure 5: Estimated degree error by condition and exposure time with group-level 95% credibility intervals.</w:t>
             </w:r>
           </w:p>
-          <w:bookmarkEnd w:id="72"/>
+          <w:bookmarkEnd w:id="73"/>
         </w:tc>
       </w:tr>
     </w:tbl>
@@ -2612,7 +2844,7 @@
       <w:tr>
         <w:tc>
           <w:tcPr/>
-          <w:bookmarkStart w:id="76" w:name="fig-grpef-M4"/>
+          <w:bookmarkStart w:id="77" w:name="fig-grpef-M4"/>
           <w:p>
             <w:pPr>
               <w:pStyle w:val="Compact"/>
@@ -2623,18 +2855,18 @@
                 <wp:inline>
                   <wp:extent cx="4620126" cy="3696101"/>
                   <wp:effectExtent b="0" l="0" r="0" t="0"/>
-                  <wp:docPr descr="" title="" id="74" name="Picture"/>
+                  <wp:docPr descr="" title="" id="75" name="Picture"/>
                   <a:graphic>
                     <a:graphicData uri="http://schemas.openxmlformats.org/drawingml/2006/picture">
                       <pic:pic>
                         <pic:nvPicPr>
-                          <pic:cNvPr descr="YET_CEHR_files/figure-docx/fig-grpef-M4-1.png" id="75" name="Picture"/>
+                          <pic:cNvPr descr="YET_CEHR_files/figure-docx/fig-grpef-M4-1.png" id="76" name="Picture"/>
                           <pic:cNvPicPr>
                             <a:picLocks noChangeArrowheads="1" noChangeAspect="1"/>
                           </pic:cNvPicPr>
                         </pic:nvPicPr>
                         <pic:blipFill>
-                          <a:blip r:embed="rId73"/>
+                          <a:blip r:embed="rId74"/>
                           <a:stretch>
                             <a:fillRect/>
                           </a:stretch>
@@ -2674,7 +2906,7 @@
               <w:t xml:space="preserve">Figure 6: Variance component analysis on the full conditional model.</w:t>
             </w:r>
           </w:p>
-          <w:bookmarkEnd w:id="76"/>
+          <w:bookmarkEnd w:id="77"/>
         </w:tc>
       </w:tr>
     </w:tbl>
@@ -2741,7 +2973,7 @@
       <w:tr>
         <w:tc>
           <w:tcPr/>
-          <w:bookmarkStart w:id="77" w:name="tbl-fixef-M5"/>
+          <w:bookmarkStart w:id="78" w:name="tbl-fixef-M5"/>
           <w:p>
             <w:pPr>
               <w:jc w:val="center"/>
@@ -3203,7 +3435,7 @@
               </w:tc>
             </w:tr>
           </w:tbl>
-          <w:bookmarkEnd w:id="77"/>
+          <w:bookmarkEnd w:id="78"/>
           <w:p/>
         </w:tc>
       </w:tr>
@@ -3240,30 +3472,30 @@
       <w:tr>
         <w:tc>
           <w:tcPr/>
-          <w:bookmarkStart w:id="82" w:name="fig-participant-trajectories-1"/>
+          <w:bookmarkStart w:id="83" w:name="fig-participant-trajectories-1"/>
           <w:p>
             <w:pPr>
               <w:pStyle w:val="Compact"/>
               <w:jc w:val="center"/>
             </w:pPr>
-            <w:bookmarkStart w:id="81" w:name="fig-participant-trajectories-1"/>
+            <w:bookmarkStart w:id="82" w:name="fig-participant-trajectories-1"/>
             <w:r>
               <w:drawing>
                 <wp:inline>
                   <wp:extent cx="5334000" cy="6667500"/>
                   <wp:effectExtent b="0" l="0" r="0" t="0"/>
-                  <wp:docPr descr="" title="" id="79" name="Picture"/>
+                  <wp:docPr descr="" title="" id="80" name="Picture"/>
                   <a:graphic>
                     <a:graphicData uri="http://schemas.openxmlformats.org/drawingml/2006/picture">
                       <pic:pic>
                         <pic:nvPicPr>
-                          <pic:cNvPr descr="YET_CEHR_files/figure-docx/fig-participant-trajectories-1-1.png" id="80" name="Picture"/>
+                          <pic:cNvPr descr="YET_CEHR_files/figure-docx/fig-participant-trajectories-1-1.png" id="81" name="Picture"/>
                           <pic:cNvPicPr>
                             <a:picLocks noChangeArrowheads="1" noChangeAspect="1"/>
                           </pic:cNvPicPr>
                         </pic:nvPicPr>
                         <pic:blipFill>
-                          <a:blip r:embed="rId78"/>
+                          <a:blip r:embed="rId79"/>
                           <a:stretch>
                             <a:fillRect/>
                           </a:stretch>
@@ -3289,7 +3521,7 @@
                 </wp:inline>
               </w:drawing>
             </w:r>
-            <w:bookmarkEnd w:id="81"/>
+            <w:bookmarkEnd w:id="82"/>
           </w:p>
           <w:p>
             <w:pPr>
@@ -3304,7 +3536,7 @@
               <w:t xml:space="preserve">Figure 7</w:t>
             </w:r>
           </w:p>
-          <w:bookmarkEnd w:id="82"/>
+          <w:bookmarkEnd w:id="83"/>
         </w:tc>
       </w:tr>
     </w:tbl>
@@ -3341,10 +3573,10 @@
         <w:t xml:space="preserve">The disadvantage of Quadbright is fully consistent only at 70ms. In contrast, the ability to read Quadbright signals varies dramatically between participants and conditions. Even a group of super-performers exists (first six), where accuracy matches or even exceeds the control condition. This group is also characterized by an enormous difference between 70ms and 400ms, sometimes with an intermediate step at 140ms.</w:t>
       </w:r>
     </w:p>
-    <w:bookmarkEnd w:id="83"/>
     <w:bookmarkEnd w:id="84"/>
     <w:bookmarkEnd w:id="85"/>
-    <w:bookmarkStart w:id="91" w:name="discussion"/>
+    <w:bookmarkEnd w:id="86"/>
+    <w:bookmarkStart w:id="92" w:name="discussion"/>
     <w:p>
       <w:pPr>
         <w:pStyle w:val="Heading1"/>
@@ -3385,7 +3617,7 @@
         <w:t xml:space="preserve">For theory-forming an important issue to discuss is whether observations in the Quadbright condition justify to speak of a secondary receiver, which operates on brightness levels and could be the progenitor mechanism according to the Cue-before-signal principle.</w:t>
       </w:r>
     </w:p>
-    <w:bookmarkStart w:id="86" w:name="the-effective-sender"/>
+    <w:bookmarkStart w:id="87" w:name="the-effective-sender"/>
     <w:p>
       <w:pPr>
         <w:pStyle w:val="Heading2"/>
@@ -3549,8 +3781,8 @@
         <w:t xml:space="preserve">they had a white sclera.</w:t>
       </w:r>
     </w:p>
-    <w:bookmarkEnd w:id="86"/>
-    <w:bookmarkStart w:id="87" w:name="evolution-of-the-receiving-end"/>
+    <w:bookmarkEnd w:id="87"/>
+    <w:bookmarkStart w:id="88" w:name="evolution-of-the-receiving-end"/>
     <w:p>
       <w:pPr>
         <w:pStyle w:val="Heading2"/>
@@ -3614,8 +3846,8 @@
         <w:t xml:space="preserve">[ventral vs dorsal processing]</w:t>
       </w:r>
     </w:p>
-    <w:bookmarkEnd w:id="87"/>
-    <w:bookmarkStart w:id="88" w:name="limitations"/>
+    <w:bookmarkEnd w:id="88"/>
+    <w:bookmarkStart w:id="89" w:name="limitations"/>
     <w:p>
       <w:pPr>
         <w:pStyle w:val="Heading2"/>
@@ -3624,8 +3856,68 @@
         <w:t xml:space="preserve">Limitations</w:t>
       </w:r>
     </w:p>
-    <w:bookmarkEnd w:id="88"/>
-    <w:bookmarkStart w:id="89" w:name="future-research"/>
+    <w:p>
+      <w:pPr>
+        <w:pStyle w:val="FirstParagraph"/>
+      </w:pPr>
+      <w:r>
+        <w:t xml:space="preserve">A theoretical limitation concerns the assumption, made throughout this argument, that scleral depigmentation reached fixation through strong directed selection rather than genetic drift. An alternative explanation cannot be ruled out on the present evidence: a severe population bottleneck in early human ancestors could, in principle, have fixed a neutral or even mildly deleterious variant purely by chance, independent of any immediate fitness benefit or pre-existing receiver. Genomic evidence has in fact been reported for a severe bottleneck in the hominin lineage, with an effective population size of roughly 1,280 breeding individuals persisting for over 100,000 years around 930,000–813,000 years ago (</w:t>
+      </w:r>
+      <w:r>
+        <w:t xml:space="preserve">(</w:t>
+      </w:r>
+      <w:r>
+        <w:rPr>
+          <w:b/>
+          <w:bCs/>
+        </w:rPr>
+        <w:t xml:space="preserve">Hu2023?</w:t>
+      </w:r>
+      <w:r>
+        <w:t xml:space="preserve">)</w:t>
+      </w:r>
+      <w:r>
+        <w:t xml:space="preserve">). Under sufficiently small effective population sizes of this kind, drift can overwhelm weak negative selection entirely (the classical near-neutral threshold, s &lt; 1/4N, becomes easy to satisfy as N shrinks). Under this scenario, the uniform absence of scleral pigmentation variance observed in modern humans (</w:t>
+      </w:r>
+      <w:r>
+        <w:t xml:space="preserve">Mearing et al. (2022)</w:t>
+      </w:r>
+      <w:r>
+        <w:t xml:space="preserve">) would not indicate strong selection at all, but simply the signature of a narrow founding population — and the reciprocity argument developed above, which requires a receiver to already be in place at the moment of fixation, would lose its force. We note, however, that the bottleneck reported by</w:t>
+      </w:r>
+      <w:r>
+        <w:t xml:space="preserve"> </w:t>
+      </w:r>
+      <w:r>
+        <w:t xml:space="preserve">(</w:t>
+      </w:r>
+      <w:r>
+        <w:rPr>
+          <w:b/>
+          <w:bCs/>
+        </w:rPr>
+        <w:t xml:space="preserve">Hu2023?</w:t>
+      </w:r>
+      <w:r>
+        <w:t xml:space="preserve">)</w:t>
+      </w:r>
+      <w:r>
+        <w:t xml:space="preserve"> </w:t>
+      </w:r>
+      <w:r>
+        <w:t xml:space="preserve">is itself contested, with subsequent reanalyses questioning whether the signal reflects a genuine demographic event or an artifact of the inference method used [REF]; the evidential basis for the bottleneck alternative is therefore no more secure than that for the directed-selection account it would replace.</w:t>
+      </w:r>
+    </w:p>
+    <w:p>
+      <w:pPr>
+        <w:pStyle w:val="BodyText"/>
+      </w:pPr>
+      <w:r>
+        <w:t xml:space="preserve">We consider this bottleneck account a real possibility that the present argument cannot exclude, and we note that it cannot be adjudicated by behavioural or psychophysical evidence of the kind presented in this paper — only population-genetic analysis, for instance dating the scleral depigmentation event relative to candidate bottleneck episodes and directly estimating effective population size at that time, could distinguish between drift-driven and selection-driven fixation. We would, however, argue that the cue-before-signal account remains the more parsimonious explanation of the two. The bottleneck scenario requires, in addition to a bottleneck of sufficient severity and correct timing, that the depigmentation mutation was neutral or only weakly deleterious, and that this specific combination of circumstances coincided with the mutation’s appearance — a conjunction of independent contingencies whose empirical support is, as noted above, itself disputed. The cue-before-signal account requires only the mutation and a pre-existing receiver already documented on independent grounds (§ The Camouflage Hypothesis). On Occam’s razor, we therefore retain directed selection as the working assumption of this paper, while flagging it as the single largest unresolved assumption in the argument — one with a direct corollary: if fixation did depend on an immediate selective advantage rather than drift, the ancestral signal itself must have been sufficiently unambiguous to be reliably exploited by the receiver from the outset, since a weak or noisy signal would not have generated the fitness benefit the argument requires.</w:t>
+      </w:r>
+    </w:p>
+    <w:bookmarkEnd w:id="89"/>
+    <w:bookmarkStart w:id="90" w:name="future-research"/>
     <w:p>
       <w:pPr>
         <w:pStyle w:val="Heading2"/>
@@ -3682,8 +3974,8 @@
         <w:t xml:space="preserve">Finally, the eye tracker we build to test our ideas about the receiving end has already been used extensively for bachelor-level student projects. With some refinement it could deliver sufficient accuracy for many psychological experiments and applied research studies, with the added benefit of being much easier to replicate for everyone than with using commercial eye tracking devices.</w:t>
       </w:r>
     </w:p>
-    <w:bookmarkEnd w:id="89"/>
-    <w:bookmarkStart w:id="90" w:name="conclusion-1"/>
+    <w:bookmarkEnd w:id="90"/>
+    <w:bookmarkStart w:id="91" w:name="conclusion-1"/>
     <w:p>
       <w:pPr>
         <w:pStyle w:val="Heading2"/>
@@ -3700,8 +3992,8 @@
         <w:t xml:space="preserve">The Cooperative Eye Hypothesis implies that eyes with a visible white sclera is sending exceptionally clear signals about gaze directions. While previous research made this assumption based on face validity, the successful implementation of the simplistic eye tracking algorithm supports this idea. By showing that humans can read glance directions under Quadbright conditions, but with reduced accuracy, lends support for multi-receiver theories, as well as the cue-before-signal theory of evolutionary origins.</w:t>
       </w:r>
     </w:p>
-    <w:bookmarkEnd w:id="90"/>
     <w:bookmarkEnd w:id="91"/>
+    <w:bookmarkEnd w:id="92"/>
     <w:bookmarkStart w:id="156" w:name="references"/>
     <w:p>
       <w:pPr>
@@ -3712,7 +4004,7 @@
       </w:r>
     </w:p>
     <w:bookmarkStart w:id="155" w:name="refs"/>
-    <w:bookmarkStart w:id="93" w:name="ref-Anderson2016"/>
+    <w:bookmarkStart w:id="94" w:name="ref-Anderson2016"/>
     <w:p>
       <w:pPr>
         <w:pStyle w:val="Bibliography"/>
@@ -3749,7 +4041,7 @@
       <w:r>
         <w:t xml:space="preserve"> </w:t>
       </w:r>
-      <w:hyperlink r:id="rId92">
+      <w:hyperlink r:id="rId93">
         <w:r>
           <w:rPr>
             <w:rStyle w:val="Hyperlink"/>
@@ -3758,8 +4050,8 @@
         </w:r>
       </w:hyperlink>
     </w:p>
-    <w:bookmarkEnd w:id="93"/>
-    <w:bookmarkStart w:id="95" w:name="ref-Babinet2021"/>
+    <w:bookmarkEnd w:id="94"/>
+    <w:bookmarkStart w:id="96" w:name="ref-Babinet2021"/>
     <w:p>
       <w:pPr>
         <w:pStyle w:val="Bibliography"/>
@@ -3796,7 +4088,7 @@
       <w:r>
         <w:t xml:space="preserve"> </w:t>
       </w:r>
-      <w:hyperlink r:id="rId94">
+      <w:hyperlink r:id="rId95">
         <w:r>
           <w:rPr>
             <w:rStyle w:val="Hyperlink"/>
@@ -3805,50 +4097,13 @@
         </w:r>
       </w:hyperlink>
     </w:p>
-    <w:bookmarkEnd w:id="95"/>
-    <w:bookmarkStart w:id="97" w:name="ref-Bakker2022"/>
+    <w:bookmarkEnd w:id="96"/>
+    <w:bookmarkStart w:id="98" w:name="ref-BARONCOHEN1995"/>
     <w:p>
       <w:pPr>
         <w:pStyle w:val="Bibliography"/>
       </w:pPr>
       <w:r>
-        <w:t xml:space="preserve">Bakker, R., Wagstaff, E. L., Kruijt, C. C., Emri, E., Karnebeek, C. D. M. van, Hoffmann, M. B., Brooks, B. P., Boon, C. J. F., Montoliu, L., Genderen, M. M. van, &amp; Bergen, A. A. (2022). The retinal pigmentation pathway in human albinism: Not so black and white. In</w:t>
-      </w:r>
-      <w:r>
-        <w:t xml:space="preserve"> </w:t>
-      </w:r>
-      <w:r>
-        <w:rPr>
-          <w:i/>
-          <w:iCs/>
-        </w:rPr>
-        <w:t xml:space="preserve">Progress in Retinal and Eye Research</w:t>
-      </w:r>
-      <w:r>
-        <w:t xml:space="preserve"> </w:t>
-      </w:r>
-      <w:r>
-        <w:t xml:space="preserve">(Vol. 91). Elsevier Ltd.</w:t>
-      </w:r>
-      <w:r>
-        <w:t xml:space="preserve"> </w:t>
-      </w:r>
-      <w:hyperlink r:id="rId96">
-        <w:r>
-          <w:rPr>
-            <w:rStyle w:val="Hyperlink"/>
-          </w:rPr>
-          <w:t xml:space="preserve">https://doi.org/10.1016/j.preteyeres.2022.101091</w:t>
-        </w:r>
-      </w:hyperlink>
-    </w:p>
-    <w:bookmarkEnd w:id="97"/>
-    <w:bookmarkStart w:id="99" w:name="ref-BARONCOHEN1995"/>
-    <w:p>
-      <w:pPr>
-        <w:pStyle w:val="Bibliography"/>
-      </w:pPr>
-      <w:r>
         <w:t xml:space="preserve">Baron-Cohen, S. (1995). The eye detection detector (EDD) and the shared attention mechanism (SAM) : Two cases for evolutionary psychology.</w:t>
       </w:r>
       <w:r>
@@ -3867,7 +4122,7 @@
       <w:r>
         <w:t xml:space="preserve"> </w:t>
       </w:r>
-      <w:hyperlink r:id="rId98">
+      <w:hyperlink r:id="rId97">
         <w:r>
           <w:rPr>
             <w:rStyle w:val="Hyperlink"/>
@@ -3876,8 +4131,8 @@
         </w:r>
       </w:hyperlink>
     </w:p>
-    <w:bookmarkEnd w:id="99"/>
-    <w:bookmarkStart w:id="101" w:name="ref-Bender2024"/>
+    <w:bookmarkEnd w:id="98"/>
+    <w:bookmarkStart w:id="100" w:name="ref-Bender2024"/>
     <w:p>
       <w:pPr>
         <w:pStyle w:val="Bibliography"/>
@@ -3904,7 +4159,7 @@
       <w:r>
         <w:t xml:space="preserve"> </w:t>
       </w:r>
-      <w:hyperlink r:id="rId100">
+      <w:hyperlink r:id="rId99">
         <w:r>
           <w:rPr>
             <w:rStyle w:val="Hyperlink"/>
@@ -3913,20 +4168,76 @@
         </w:r>
       </w:hyperlink>
     </w:p>
+    <w:bookmarkEnd w:id="100"/>
+    <w:bookmarkStart w:id="101" w:name="ref-opencv-library"/>
+    <w:p>
+      <w:pPr>
+        <w:pStyle w:val="Bibliography"/>
+      </w:pPr>
+      <w:r>
+        <w:t xml:space="preserve">Bradski, G. (2000).</w:t>
+      </w:r>
+      <w:r>
+        <w:t xml:space="preserve"> </w:t>
+      </w:r>
+      <w:r>
+        <w:t xml:space="preserve">The OpenCV Library</w:t>
+      </w:r>
+      <w:r>
+        <w:t xml:space="preserve">.</w:t>
+      </w:r>
+      <w:r>
+        <w:t xml:space="preserve"> </w:t>
+      </w:r>
+      <w:r>
+        <w:rPr>
+          <w:i/>
+          <w:iCs/>
+        </w:rPr>
+        <w:t xml:space="preserve">Dr. Dobb’s Journal of Software Tools</w:t>
+      </w:r>
+      <w:r>
+        <w:t xml:space="preserve">.</w:t>
+      </w:r>
+    </w:p>
     <w:bookmarkEnd w:id="101"/>
-    <w:bookmarkStart w:id="102" w:name="ref-opencv-library"/>
+    <w:bookmarkStart w:id="103" w:name="ref-brms"/>
     <w:p>
       <w:pPr>
         <w:pStyle w:val="Bibliography"/>
       </w:pPr>
       <w:r>
-        <w:t xml:space="preserve">Bradski, G. (2000).</w:t>
-      </w:r>
-      <w:r>
-        <w:t xml:space="preserve"> </w:t>
-      </w:r>
-      <w:r>
-        <w:t xml:space="preserve">The OpenCV Library</w:t>
+        <w:t xml:space="preserve">Bürkner, P.-C. (2018). Advanced</w:t>
+      </w:r>
+      <w:r>
+        <w:t xml:space="preserve"> </w:t>
+      </w:r>
+      <w:r>
+        <w:t xml:space="preserve">Bayesian</w:t>
+      </w:r>
+      <w:r>
+        <w:t xml:space="preserve"> </w:t>
+      </w:r>
+      <w:r>
+        <w:t xml:space="preserve">multilevel modeling with the</w:t>
+      </w:r>
+      <w:r>
+        <w:t xml:space="preserve"> </w:t>
+      </w:r>
+      <w:r>
+        <w:t xml:space="preserve">R</w:t>
+      </w:r>
+      <w:r>
+        <w:t xml:space="preserve"> </w:t>
+      </w:r>
+      <w:r>
+        <w:t xml:space="preserve">package</w:t>
+      </w:r>
+      <w:r>
+        <w:t xml:space="preserve"> </w:t>
+      </w:r>
+      <w:r>
+        <w:t xml:space="preserve">brms</w:t>
       </w:r>
       <w:r>
         <w:t xml:space="preserve">.</w:t>
@@ -3939,62 +4250,6 @@
           <w:i/>
           <w:iCs/>
         </w:rPr>
-        <w:t xml:space="preserve">Dr. Dobb’s Journal of Software Tools</w:t>
-      </w:r>
-      <w:r>
-        <w:t xml:space="preserve">.</w:t>
-      </w:r>
-    </w:p>
-    <w:bookmarkEnd w:id="102"/>
-    <w:bookmarkStart w:id="104" w:name="ref-brms"/>
-    <w:p>
-      <w:pPr>
-        <w:pStyle w:val="Bibliography"/>
-      </w:pPr>
-      <w:r>
-        <w:t xml:space="preserve">Bürkner, P.-C. (2018). Advanced</w:t>
-      </w:r>
-      <w:r>
-        <w:t xml:space="preserve"> </w:t>
-      </w:r>
-      <w:r>
-        <w:t xml:space="preserve">Bayesian</w:t>
-      </w:r>
-      <w:r>
-        <w:t xml:space="preserve"> </w:t>
-      </w:r>
-      <w:r>
-        <w:t xml:space="preserve">multilevel modeling with the</w:t>
-      </w:r>
-      <w:r>
-        <w:t xml:space="preserve"> </w:t>
-      </w:r>
-      <w:r>
-        <w:t xml:space="preserve">R</w:t>
-      </w:r>
-      <w:r>
-        <w:t xml:space="preserve"> </w:t>
-      </w:r>
-      <w:r>
-        <w:t xml:space="preserve">package</w:t>
-      </w:r>
-      <w:r>
-        <w:t xml:space="preserve"> </w:t>
-      </w:r>
-      <w:r>
-        <w:t xml:space="preserve">brms</w:t>
-      </w:r>
-      <w:r>
-        <w:t xml:space="preserve">.</w:t>
-      </w:r>
-      <w:r>
-        <w:t xml:space="preserve"> </w:t>
-      </w:r>
-      <w:r>
-        <w:rPr>
-          <w:i/>
-          <w:iCs/>
-        </w:rPr>
         <w:t xml:space="preserve">The R Journal</w:t>
       </w:r>
       <w:r>
@@ -4016,7 +4271,7 @@
       <w:r>
         <w:t xml:space="preserve"> </w:t>
       </w:r>
-      <w:hyperlink r:id="rId103">
+      <w:hyperlink r:id="rId102">
         <w:r>
           <w:rPr>
             <w:rStyle w:val="Hyperlink"/>
@@ -4025,36 +4280,36 @@
         </w:r>
       </w:hyperlink>
     </w:p>
+    <w:bookmarkEnd w:id="103"/>
+    <w:bookmarkStart w:id="104" w:name="ref-Ciesla2012"/>
+    <w:p>
+      <w:pPr>
+        <w:pStyle w:val="Bibliography"/>
+      </w:pPr>
+      <w:r>
+        <w:t xml:space="preserve">Ciesla, M., &amp; Koziol, P. (2012). Eye pupil location using webcam.</w:t>
+      </w:r>
+      <w:r>
+        <w:t xml:space="preserve"> </w:t>
+      </w:r>
+      <w:r>
+        <w:rPr>
+          <w:i/>
+          <w:iCs/>
+        </w:rPr>
+        <w:t xml:space="preserve">Computer Vision and Pattern Recognition</w:t>
+      </w:r>
+      <w:r>
+        <w:t xml:space="preserve">, 1–11.</w:t>
+      </w:r>
+    </w:p>
     <w:bookmarkEnd w:id="104"/>
-    <w:bookmarkStart w:id="105" w:name="ref-Ciesla2012"/>
+    <w:bookmarkStart w:id="106" w:name="ref-Dessinioti2009"/>
     <w:p>
       <w:pPr>
         <w:pStyle w:val="Bibliography"/>
       </w:pPr>
       <w:r>
-        <w:t xml:space="preserve">Ciesla, M., &amp; Koziol, P. (2012). Eye pupil location using webcam.</w:t>
-      </w:r>
-      <w:r>
-        <w:t xml:space="preserve"> </w:t>
-      </w:r>
-      <w:r>
-        <w:rPr>
-          <w:i/>
-          <w:iCs/>
-        </w:rPr>
-        <w:t xml:space="preserve">Computer Vision and Pattern Recognition</w:t>
-      </w:r>
-      <w:r>
-        <w:t xml:space="preserve">, 1–11.</w:t>
-      </w:r>
-    </w:p>
-    <w:bookmarkEnd w:id="105"/>
-    <w:bookmarkStart w:id="107" w:name="ref-Dessinioti2009"/>
-    <w:p>
-      <w:pPr>
-        <w:pStyle w:val="Bibliography"/>
-      </w:pPr>
-      <w:r>
         <w:t xml:space="preserve">Dessinioti, C., Stratigos, A. J., Rigopoulos, D., &amp; Katsambas, A. D. (2009). A review of genetic disorders of hypopigmentation: Lessons learned from the biology of melanocytes.</w:t>
       </w:r>
       <w:r>
@@ -4086,7 +4341,7 @@
       <w:r>
         <w:t xml:space="preserve"> </w:t>
       </w:r>
-      <w:hyperlink r:id="rId106">
+      <w:hyperlink r:id="rId105">
         <w:r>
           <w:rPr>
             <w:rStyle w:val="Hyperlink"/>
@@ -4094,6 +4349,42 @@
           <w:t xml:space="preserve">https://doi.org/10.1111/j.1600-0625.2009.00896.x</w:t>
         </w:r>
       </w:hyperlink>
+    </w:p>
+    <w:bookmarkEnd w:id="106"/>
+    <w:bookmarkStart w:id="107" w:name="ref-EndlerBasolo1998"/>
+    <w:p>
+      <w:pPr>
+        <w:pStyle w:val="Bibliography"/>
+      </w:pPr>
+      <w:r>
+        <w:t xml:space="preserve">Endler, J. A., &amp; Basolo, A. L. (1998). Sensory ecology, receiver biases and sexual selection.</w:t>
+      </w:r>
+      <w:r>
+        <w:t xml:space="preserve"> </w:t>
+      </w:r>
+      <w:r>
+        <w:rPr>
+          <w:i/>
+          <w:iCs/>
+        </w:rPr>
+        <w:t xml:space="preserve">Trends in Ecology &amp; Evolution</w:t>
+      </w:r>
+      <w:r>
+        <w:t xml:space="preserve">,</w:t>
+      </w:r>
+      <w:r>
+        <w:t xml:space="preserve"> </w:t>
+      </w:r>
+      <w:r>
+        <w:rPr>
+          <w:i/>
+          <w:iCs/>
+        </w:rPr>
+        <w:t xml:space="preserve">13</w:t>
+      </w:r>
+      <w:r>
+        <w:t xml:space="preserve">(10), 415–420.</w:t>
+      </w:r>
     </w:p>
     <w:bookmarkEnd w:id="107"/>
     <w:bookmarkStart w:id="109" w:name="ref-Farroni2003"/>

</xml_diff>